<commit_message>
Fixed font for word summary
</commit_message>
<xml_diff>
--- a/FoodHub_Data_Analysis_Summary.docx
+++ b/FoodHub_Data_Analysis_Summary.docx
@@ -4,89 +4,55 @@
   <w:body>
     <w:p>
       <w:pPr>
-        <w:spacing w:before="240" w:after="240" w:line="240" w:lineRule="auto"/>
-        <w:jc w:val="center"/>
-        <w:outlineLvl w:val="0"/>
-        <w:rPr>
-          <w:rFonts w:ascii="Helvetica" w:eastAsia="Times New Roman" w:hAnsi="Helvetica" w:cs="Times New Roman"/>
-          <w:b/>
-          <w:bCs/>
-          <w:color w:val="000000" w:themeColor="text1"/>
-          <w:kern w:val="36"/>
-          <w:sz w:val="53"/>
-          <w:szCs w:val="53"/>
-          <w14:ligatures w14:val="none"/>
+        <w:pStyle w:val="Heading1"/>
+        <w:rPr>
+          <w:rFonts w:ascii="Courier New" w:eastAsia="Times New Roman" w:hAnsi="Courier New" w:cs="Courier New"/>
         </w:rPr>
       </w:pPr>
       <w:proofErr w:type="spellStart"/>
       <w:r>
         <w:rPr>
-          <w:rFonts w:ascii="Helvetica" w:eastAsia="Times New Roman" w:hAnsi="Helvetica" w:cs="Times New Roman"/>
-          <w:b/>
-          <w:bCs/>
-          <w:color w:val="000000" w:themeColor="text1"/>
-          <w:kern w:val="36"/>
-          <w:sz w:val="53"/>
-          <w:szCs w:val="53"/>
-          <w14:ligatures w14:val="none"/>
+          <w:rFonts w:ascii="Courier New" w:eastAsia="Times New Roman" w:hAnsi="Courier New" w:cs="Courier New"/>
         </w:rPr>
         <w:t>FoodHub</w:t>
       </w:r>
       <w:proofErr w:type="spellEnd"/>
       <w:r>
         <w:rPr>
-          <w:rFonts w:ascii="Helvetica" w:eastAsia="Times New Roman" w:hAnsi="Helvetica" w:cs="Times New Roman"/>
-          <w:b/>
-          <w:bCs/>
-          <w:color w:val="000000" w:themeColor="text1"/>
-          <w:kern w:val="36"/>
-          <w:sz w:val="53"/>
-          <w:szCs w:val="53"/>
-          <w14:ligatures w14:val="none"/>
-        </w:rPr>
-        <w:t xml:space="preserve"> Data Analysis</w:t>
+          <w:rFonts w:ascii="Courier New" w:eastAsia="Times New Roman" w:hAnsi="Courier New" w:cs="Courier New"/>
+        </w:rPr>
+        <w:t xml:space="preserve"> </w:t>
+      </w:r>
+      <w:r>
+        <w:rPr>
+          <w:rFonts w:ascii="Courier New" w:eastAsia="Times New Roman" w:hAnsi="Courier New" w:cs="Courier New"/>
+        </w:rPr>
+        <w:t xml:space="preserve">- </w:t>
+      </w:r>
+      <w:r>
+        <w:rPr>
+          <w:rFonts w:ascii="Courier New" w:eastAsia="Times New Roman" w:hAnsi="Courier New" w:cs="Courier New"/>
+        </w:rPr>
+        <w:t>Data Analysis</w:t>
       </w:r>
     </w:p>
     <w:p>
       <w:pPr>
-        <w:spacing w:before="240" w:after="240" w:line="240" w:lineRule="auto"/>
-        <w:jc w:val="center"/>
-        <w:outlineLvl w:val="1"/>
-        <w:rPr>
-          <w:rFonts w:ascii="Helvetica" w:eastAsia="Times New Roman" w:hAnsi="Helvetica" w:cs="Times New Roman"/>
-          <w:b/>
-          <w:bCs/>
-          <w:color w:val="000000" w:themeColor="text1"/>
-          <w:kern w:val="0"/>
-          <w:sz w:val="43"/>
-          <w:szCs w:val="43"/>
-          <w14:ligatures w14:val="none"/>
-        </w:rPr>
-      </w:pPr>
-      <w:r>
-        <w:rPr>
-          <w:rFonts w:ascii="Helvetica" w:eastAsia="Times New Roman" w:hAnsi="Helvetica" w:cs="Times New Roman"/>
-          <w:b/>
-          <w:bCs/>
-          <w:color w:val="000000" w:themeColor="text1"/>
-          <w:kern w:val="0"/>
-          <w:sz w:val="43"/>
-          <w:szCs w:val="43"/>
-          <w14:ligatures w14:val="none"/>
+        <w:pStyle w:val="Heading2"/>
+        <w:rPr>
+          <w:rFonts w:ascii="Courier New" w:eastAsia="Times New Roman" w:hAnsi="Courier New" w:cs="Courier New"/>
+        </w:rPr>
+      </w:pPr>
+      <w:r>
+        <w:rPr>
+          <w:rFonts w:ascii="Courier New" w:eastAsia="Times New Roman" w:hAnsi="Courier New" w:cs="Courier New"/>
         </w:rPr>
         <w:t xml:space="preserve">Project: Python Foundations – </w:t>
       </w:r>
       <w:proofErr w:type="spellStart"/>
       <w:r>
         <w:rPr>
-          <w:rFonts w:ascii="Helvetica" w:eastAsia="Times New Roman" w:hAnsi="Helvetica" w:cs="Times New Roman"/>
-          <w:b/>
-          <w:bCs/>
-          <w:color w:val="000000" w:themeColor="text1"/>
-          <w:kern w:val="0"/>
-          <w:sz w:val="43"/>
-          <w:szCs w:val="43"/>
-          <w14:ligatures w14:val="none"/>
+          <w:rFonts w:ascii="Courier New" w:eastAsia="Times New Roman" w:hAnsi="Courier New" w:cs="Courier New"/>
         </w:rPr>
         <w:t>FoodHub</w:t>
       </w:r>
@@ -94,321 +60,261 @@
     </w:p>
     <w:p>
       <w:pPr>
+        <w:pStyle w:val="Heading3"/>
+        <w:rPr>
+          <w:rFonts w:ascii="Courier New" w:eastAsia="Times New Roman" w:hAnsi="Courier New" w:cs="Courier New"/>
+        </w:rPr>
+      </w:pPr>
+      <w:r>
+        <w:rPr>
+          <w:rFonts w:ascii="Courier New" w:eastAsia="Times New Roman" w:hAnsi="Courier New" w:cs="Courier New"/>
+        </w:rPr>
+        <w:t>Context</w:t>
+      </w:r>
+    </w:p>
+    <w:p>
+      <w:pPr>
         <w:spacing w:before="240" w:after="240" w:line="240" w:lineRule="auto"/>
-        <w:outlineLvl w:val="2"/>
-        <w:rPr>
-          <w:rFonts w:ascii="Helvetica" w:eastAsia="Times New Roman" w:hAnsi="Helvetica" w:cs="Times New Roman"/>
+        <w:rPr>
+          <w:rFonts w:ascii="Courier New" w:eastAsia="Times New Roman" w:hAnsi="Courier New" w:cs="Courier New"/>
+          <w:color w:val="000000" w:themeColor="text1"/>
+          <w:kern w:val="0"/>
+          <w:sz w:val="20"/>
+          <w:szCs w:val="20"/>
+          <w14:ligatures w14:val="none"/>
+        </w:rPr>
+      </w:pPr>
+      <w:r>
+        <w:rPr>
+          <w:rFonts w:ascii="Courier New" w:eastAsia="Times New Roman" w:hAnsi="Courier New" w:cs="Courier New"/>
+          <w:color w:val="000000" w:themeColor="text1"/>
+          <w:kern w:val="0"/>
+          <w:sz w:val="20"/>
+          <w:szCs w:val="20"/>
+          <w14:ligatures w14:val="none"/>
+        </w:rPr>
+        <w:t>The number of restaurants in New York is increasing day by day. Many students and busy professionals rely on these restaurants due to their hectic lifestyles. Online food delivery services are a great option, providing access to food from their favorite places.</w:t>
+      </w:r>
+    </w:p>
+    <w:p>
+      <w:pPr>
+        <w:spacing w:before="240" w:after="240" w:line="240" w:lineRule="auto"/>
+        <w:rPr>
+          <w:rFonts w:ascii="Courier New" w:eastAsia="Times New Roman" w:hAnsi="Courier New" w:cs="Courier New"/>
+          <w:color w:val="000000" w:themeColor="text1"/>
+          <w:kern w:val="0"/>
+          <w:sz w:val="20"/>
+          <w:szCs w:val="20"/>
+          <w14:ligatures w14:val="none"/>
+        </w:rPr>
+      </w:pPr>
+      <w:proofErr w:type="spellStart"/>
+      <w:r>
+        <w:rPr>
+          <w:rFonts w:ascii="Courier New" w:eastAsia="Times New Roman" w:hAnsi="Courier New" w:cs="Courier New"/>
           <w:b/>
           <w:bCs/>
           <w:color w:val="000000" w:themeColor="text1"/>
           <w:kern w:val="0"/>
-          <w:sz w:val="31"/>
-          <w:szCs w:val="31"/>
-          <w14:ligatures w14:val="none"/>
-        </w:rPr>
-      </w:pPr>
-      <w:r>
-        <w:rPr>
-          <w:rFonts w:ascii="Helvetica" w:eastAsia="Times New Roman" w:hAnsi="Helvetica" w:cs="Times New Roman"/>
+          <w:sz w:val="20"/>
+          <w:szCs w:val="20"/>
+          <w14:ligatures w14:val="none"/>
+        </w:rPr>
+        <w:t>FoodHub</w:t>
+      </w:r>
+      <w:proofErr w:type="spellEnd"/>
+      <w:r>
+        <w:rPr>
+          <w:rFonts w:ascii="Courier New" w:eastAsia="Times New Roman" w:hAnsi="Courier New" w:cs="Courier New"/>
+          <w:color w:val="000000" w:themeColor="text1"/>
+          <w:kern w:val="0"/>
+          <w:sz w:val="20"/>
+          <w:szCs w:val="20"/>
+          <w14:ligatures w14:val="none"/>
+        </w:rPr>
+        <w:t>, a food aggregator app, connects users with multiple restaurants through a single platform. It manages customer orders, assigns delivery personnel, and collects ratings—all while earning a margin on each order.</w:t>
+      </w:r>
+    </w:p>
+    <w:p>
+      <w:pPr>
+        <w:spacing w:before="300" w:after="300" w:line="240" w:lineRule="auto"/>
+        <w:rPr>
+          <w:rFonts w:ascii="Courier New" w:eastAsia="Times New Roman" w:hAnsi="Courier New" w:cs="Courier New"/>
+          <w:color w:val="000000" w:themeColor="text1"/>
+          <w:kern w:val="0"/>
+          <w:sz w:val="20"/>
+          <w:szCs w:val="20"/>
+          <w14:ligatures w14:val="none"/>
+        </w:rPr>
+      </w:pPr>
+      <w:r>
+        <w:rPr>
+          <w:rFonts w:ascii="Courier New" w:eastAsia="Times New Roman" w:hAnsi="Courier New" w:cs="Courier New"/>
+          <w:noProof/>
+          <w:color w:val="000000" w:themeColor="text1"/>
+          <w:kern w:val="0"/>
+        </w:rPr>
+        <w:pict w14:anchorId="7EA91596">
+          <v:rect id="_x0000_i1026" alt="" style="width:468pt;height:.05pt;mso-width-percent:0;mso-height-percent:0;mso-width-percent:0;mso-height-percent:0" o:hralign="center" o:hrstd="t" o:hrnoshade="t" o:hr="t" fillcolor="#bcbec4" stroked="f"/>
+        </w:pict>
+      </w:r>
+    </w:p>
+    <w:p>
+      <w:pPr>
+        <w:pStyle w:val="Heading3"/>
+        <w:rPr>
+          <w:rFonts w:ascii="Courier New" w:eastAsia="Times New Roman" w:hAnsi="Courier New" w:cs="Courier New"/>
+        </w:rPr>
+      </w:pPr>
+      <w:r>
+        <w:rPr>
+          <w:rFonts w:ascii="Courier New" w:eastAsia="Times New Roman" w:hAnsi="Courier New" w:cs="Courier New"/>
+        </w:rPr>
+        <w:t>Objective</w:t>
+      </w:r>
+    </w:p>
+    <w:p>
+      <w:pPr>
+        <w:spacing w:before="240" w:after="240" w:line="240" w:lineRule="auto"/>
+        <w:rPr>
+          <w:rFonts w:ascii="Courier New" w:eastAsia="Times New Roman" w:hAnsi="Courier New" w:cs="Courier New"/>
+          <w:color w:val="000000" w:themeColor="text1"/>
+          <w:kern w:val="0"/>
+          <w:sz w:val="20"/>
+          <w:szCs w:val="20"/>
+          <w14:ligatures w14:val="none"/>
+        </w:rPr>
+      </w:pPr>
+      <w:r>
+        <w:rPr>
+          <w:rFonts w:ascii="Courier New" w:eastAsia="Times New Roman" w:hAnsi="Courier New" w:cs="Courier New"/>
+          <w:color w:val="000000" w:themeColor="text1"/>
+          <w:kern w:val="0"/>
+          <w:sz w:val="20"/>
+          <w:szCs w:val="20"/>
+          <w14:ligatures w14:val="none"/>
+        </w:rPr>
+        <w:t xml:space="preserve">You’ve been hired as a Data Scientist at </w:t>
+      </w:r>
+      <w:proofErr w:type="spellStart"/>
+      <w:r>
+        <w:rPr>
+          <w:rFonts w:ascii="Courier New" w:eastAsia="Times New Roman" w:hAnsi="Courier New" w:cs="Courier New"/>
+          <w:color w:val="000000" w:themeColor="text1"/>
+          <w:kern w:val="0"/>
+          <w:sz w:val="20"/>
+          <w:szCs w:val="20"/>
+          <w14:ligatures w14:val="none"/>
+        </w:rPr>
+        <w:t>FoodHub</w:t>
+      </w:r>
+      <w:proofErr w:type="spellEnd"/>
+      <w:r>
+        <w:rPr>
+          <w:rFonts w:ascii="Courier New" w:eastAsia="Times New Roman" w:hAnsi="Courier New" w:cs="Courier New"/>
+          <w:color w:val="000000" w:themeColor="text1"/>
+          <w:kern w:val="0"/>
+          <w:sz w:val="20"/>
+          <w:szCs w:val="20"/>
+          <w14:ligatures w14:val="none"/>
+        </w:rPr>
+        <w:t>. Your task: analyze customer order data to answer key business questions. The goal is to uncover trends that can help improve customer satisfaction and business performance.</w:t>
+      </w:r>
+    </w:p>
+    <w:p>
+      <w:pPr>
+        <w:spacing w:before="300" w:after="300" w:line="240" w:lineRule="auto"/>
+        <w:rPr>
+          <w:rFonts w:ascii="Courier New" w:eastAsia="Times New Roman" w:hAnsi="Courier New" w:cs="Courier New"/>
+          <w:color w:val="000000" w:themeColor="text1"/>
+          <w:kern w:val="0"/>
+          <w:sz w:val="20"/>
+          <w:szCs w:val="20"/>
+          <w14:ligatures w14:val="none"/>
+        </w:rPr>
+      </w:pPr>
+      <w:r>
+        <w:rPr>
+          <w:rFonts w:ascii="Courier New" w:eastAsia="Times New Roman" w:hAnsi="Courier New" w:cs="Courier New"/>
+          <w:noProof/>
+          <w:color w:val="000000" w:themeColor="text1"/>
+          <w:kern w:val="0"/>
+        </w:rPr>
+        <w:pict w14:anchorId="37AE169A">
+          <v:rect id="_x0000_i1025" alt="" style="width:468pt;height:.05pt;mso-width-percent:0;mso-height-percent:0;mso-width-percent:0;mso-height-percent:0" o:hralign="center" o:hrstd="t" o:hrnoshade="t" o:hr="t" fillcolor="#bcbec4" stroked="f"/>
+        </w:pict>
+      </w:r>
+    </w:p>
+    <w:p>
+      <w:pPr>
+        <w:pStyle w:val="Heading3"/>
+        <w:rPr>
+          <w:rFonts w:ascii="Courier New" w:eastAsia="Times New Roman" w:hAnsi="Courier New" w:cs="Courier New"/>
+        </w:rPr>
+      </w:pPr>
+      <w:r>
+        <w:rPr>
+          <w:rFonts w:ascii="Courier New" w:eastAsia="Times New Roman" w:hAnsi="Courier New" w:cs="Courier New"/>
+        </w:rPr>
+        <w:t>Dataset Description</w:t>
+      </w:r>
+    </w:p>
+    <w:p>
+      <w:pPr>
+        <w:spacing w:before="240" w:after="240" w:line="240" w:lineRule="auto"/>
+        <w:rPr>
+          <w:rFonts w:ascii="Courier New" w:eastAsia="Times New Roman" w:hAnsi="Courier New" w:cs="Courier New"/>
+          <w:color w:val="000000" w:themeColor="text1"/>
+          <w:kern w:val="0"/>
+          <w:sz w:val="20"/>
+          <w:szCs w:val="20"/>
+          <w14:ligatures w14:val="none"/>
+        </w:rPr>
+      </w:pPr>
+      <w:r>
+        <w:rPr>
+          <w:rFonts w:ascii="Courier New" w:eastAsia="Times New Roman" w:hAnsi="Courier New" w:cs="Courier New"/>
+          <w:color w:val="000000" w:themeColor="text1"/>
+          <w:kern w:val="0"/>
+          <w:sz w:val="20"/>
+          <w:szCs w:val="20"/>
+          <w14:ligatures w14:val="none"/>
+        </w:rPr>
+        <w:t>The dataset records various attributes of food orders, including customer ratings, preparation and delivery times, and cuisine types.</w:t>
+      </w:r>
+    </w:p>
+    <w:p>
+      <w:pPr>
+        <w:pStyle w:val="Heading3"/>
+        <w:rPr>
+          <w:rFonts w:ascii="Courier New" w:eastAsia="Times New Roman" w:hAnsi="Courier New" w:cs="Courier New"/>
+        </w:rPr>
+      </w:pPr>
+      <w:r>
+        <w:rPr>
+          <w:rFonts w:ascii="Courier New" w:eastAsia="Times New Roman" w:hAnsi="Courier New" w:cs="Courier New"/>
+        </w:rPr>
+        <w:t>Key Findings</w:t>
+      </w:r>
+    </w:p>
+    <w:p>
+      <w:pPr>
+        <w:spacing w:before="240" w:after="240" w:line="240" w:lineRule="auto"/>
+        <w:outlineLvl w:val="3"/>
+        <w:rPr>
+          <w:rFonts w:ascii="Courier New" w:eastAsia="Times New Roman" w:hAnsi="Courier New" w:cs="Courier New"/>
           <w:b/>
           <w:bCs/>
           <w:color w:val="000000" w:themeColor="text1"/>
           <w:kern w:val="0"/>
-          <w:sz w:val="31"/>
-          <w:szCs w:val="31"/>
-          <w14:ligatures w14:val="none"/>
-        </w:rPr>
-        <w:t>Context</w:t>
-      </w:r>
-    </w:p>
-    <w:p>
-      <w:pPr>
-        <w:spacing w:before="240" w:after="240" w:line="240" w:lineRule="auto"/>
-        <w:rPr>
-          <w:rFonts w:ascii="Helvetica" w:eastAsia="Times New Roman" w:hAnsi="Helvetica" w:cs="Times New Roman"/>
-          <w:color w:val="000000" w:themeColor="text1"/>
-          <w:kern w:val="0"/>
-          <w:sz w:val="20"/>
-          <w:szCs w:val="20"/>
-          <w14:ligatures w14:val="none"/>
-        </w:rPr>
-      </w:pPr>
-      <w:r>
-        <w:rPr>
-          <w:rFonts w:ascii="Helvetica" w:eastAsia="Times New Roman" w:hAnsi="Helvetica" w:cs="Times New Roman"/>
-          <w:color w:val="000000" w:themeColor="text1"/>
-          <w:kern w:val="0"/>
-          <w:sz w:val="20"/>
-          <w:szCs w:val="20"/>
-          <w14:ligatures w14:val="none"/>
-        </w:rPr>
-        <w:t>The number of restaurants in New York is increasing day by day. Many students and busy professionals rely on these restaurants due to their hectic lifestyles. Online food delivery services are a great option, providing access to food from their favorite places.</w:t>
-      </w:r>
-    </w:p>
-    <w:p>
-      <w:pPr>
-        <w:spacing w:before="240" w:after="240" w:line="240" w:lineRule="auto"/>
-        <w:rPr>
-          <w:rFonts w:ascii="Helvetica" w:eastAsia="Times New Roman" w:hAnsi="Helvetica" w:cs="Times New Roman"/>
-          <w:color w:val="000000" w:themeColor="text1"/>
-          <w:kern w:val="0"/>
-          <w:sz w:val="20"/>
-          <w:szCs w:val="20"/>
-          <w14:ligatures w14:val="none"/>
-        </w:rPr>
-      </w:pPr>
-      <w:proofErr w:type="spellStart"/>
-      <w:r>
-        <w:rPr>
-          <w:rFonts w:ascii="Helvetica" w:eastAsia="Times New Roman" w:hAnsi="Helvetica" w:cs="Times New Roman"/>
-          <w:b/>
-          <w:bCs/>
-          <w:color w:val="000000" w:themeColor="text1"/>
-          <w:kern w:val="0"/>
-          <w:sz w:val="20"/>
-          <w:szCs w:val="20"/>
-          <w14:ligatures w14:val="none"/>
-        </w:rPr>
-        <w:t>FoodHub</w:t>
-      </w:r>
-      <w:proofErr w:type="spellEnd"/>
-      <w:r>
-        <w:rPr>
-          <w:rFonts w:ascii="Helvetica" w:eastAsia="Times New Roman" w:hAnsi="Helvetica" w:cs="Times New Roman"/>
-          <w:color w:val="000000" w:themeColor="text1"/>
-          <w:kern w:val="0"/>
-          <w:sz w:val="20"/>
-          <w:szCs w:val="20"/>
-          <w14:ligatures w14:val="none"/>
-        </w:rPr>
-        <w:t>, a food aggregator app, connects users with multiple restaurants through a single platform. It manages customer orders, assigns delivery personnel, and collects ratings—all while earning a margin on each order.</w:t>
-      </w:r>
-    </w:p>
-    <w:p>
-      <w:pPr>
-        <w:spacing w:before="300" w:after="300" w:line="240" w:lineRule="auto"/>
-        <w:rPr>
-          <w:rFonts w:ascii="Helvetica" w:eastAsia="Times New Roman" w:hAnsi="Helvetica" w:cs="Times New Roman"/>
-          <w:color w:val="000000" w:themeColor="text1"/>
-          <w:kern w:val="0"/>
-          <w:sz w:val="20"/>
-          <w:szCs w:val="20"/>
-          <w14:ligatures w14:val="none"/>
-        </w:rPr>
-      </w:pPr>
-      <w:r>
-        <w:rPr>
-          <w:rFonts w:ascii="Times New Roman" w:eastAsia="Times New Roman" w:hAnsi="Times New Roman" w:cs="Times New Roman"/>
-          <w:noProof/>
-          <w:color w:val="000000" w:themeColor="text1"/>
-          <w:kern w:val="0"/>
-        </w:rPr>
-        <w:pict w14:anchorId="7EA91596">
-          <v:rect id="_x0000_i1028" alt="" style="width:468pt;height:.05pt;mso-width-percent:0;mso-height-percent:0;mso-width-percent:0;mso-height-percent:0" o:hralign="center" o:hrstd="t" o:hrnoshade="t" o:hr="t" fillcolor="#bcbec4" stroked="f"/>
-        </w:pict>
-      </w:r>
-    </w:p>
-    <w:p>
-      <w:pPr>
-        <w:spacing w:before="240" w:after="240" w:line="240" w:lineRule="auto"/>
-        <w:outlineLvl w:val="2"/>
-        <w:rPr>
-          <w:rFonts w:ascii="Helvetica" w:eastAsia="Times New Roman" w:hAnsi="Helvetica" w:cs="Times New Roman"/>
-          <w:b/>
-          <w:bCs/>
-          <w:color w:val="000000" w:themeColor="text1"/>
-          <w:kern w:val="0"/>
-          <w:sz w:val="31"/>
-          <w:szCs w:val="31"/>
-          <w14:ligatures w14:val="none"/>
-        </w:rPr>
-      </w:pPr>
-      <w:r>
-        <w:rPr>
-          <w:rFonts w:ascii="Helvetica" w:eastAsia="Times New Roman" w:hAnsi="Helvetica" w:cs="Times New Roman"/>
-          <w:b/>
-          <w:bCs/>
-          <w:color w:val="000000" w:themeColor="text1"/>
-          <w:kern w:val="0"/>
-          <w:sz w:val="31"/>
-          <w:szCs w:val="31"/>
-          <w14:ligatures w14:val="none"/>
-        </w:rPr>
-        <w:t>Objective</w:t>
-      </w:r>
-    </w:p>
-    <w:p>
-      <w:pPr>
-        <w:spacing w:before="240" w:after="240" w:line="240" w:lineRule="auto"/>
-        <w:rPr>
-          <w:rFonts w:ascii="Helvetica" w:eastAsia="Times New Roman" w:hAnsi="Helvetica" w:cs="Times New Roman"/>
-          <w:color w:val="000000" w:themeColor="text1"/>
-          <w:kern w:val="0"/>
-          <w:sz w:val="20"/>
-          <w:szCs w:val="20"/>
-          <w14:ligatures w14:val="none"/>
-        </w:rPr>
-      </w:pPr>
-      <w:r>
-        <w:rPr>
-          <w:rFonts w:ascii="Helvetica" w:eastAsia="Times New Roman" w:hAnsi="Helvetica" w:cs="Times New Roman"/>
-          <w:color w:val="000000" w:themeColor="text1"/>
-          <w:kern w:val="0"/>
-          <w:sz w:val="20"/>
-          <w:szCs w:val="20"/>
-          <w14:ligatures w14:val="none"/>
-        </w:rPr>
-        <w:t xml:space="preserve">You’ve been hired as a Data Scientist at </w:t>
-      </w:r>
-      <w:proofErr w:type="spellStart"/>
-      <w:r>
-        <w:rPr>
-          <w:rFonts w:ascii="Helvetica" w:eastAsia="Times New Roman" w:hAnsi="Helvetica" w:cs="Times New Roman"/>
-          <w:color w:val="000000" w:themeColor="text1"/>
-          <w:kern w:val="0"/>
-          <w:sz w:val="20"/>
-          <w:szCs w:val="20"/>
-          <w14:ligatures w14:val="none"/>
-        </w:rPr>
-        <w:t>FoodHub</w:t>
-      </w:r>
-      <w:proofErr w:type="spellEnd"/>
-      <w:r>
-        <w:rPr>
-          <w:rFonts w:ascii="Helvetica" w:eastAsia="Times New Roman" w:hAnsi="Helvetica" w:cs="Times New Roman"/>
-          <w:color w:val="000000" w:themeColor="text1"/>
-          <w:kern w:val="0"/>
-          <w:sz w:val="20"/>
-          <w:szCs w:val="20"/>
-          <w14:ligatures w14:val="none"/>
-        </w:rPr>
-        <w:t>. Your task: analyze customer order data to answer key business questions. The goal is to uncover trends that can help improve customer satisfaction and business performance.</w:t>
-      </w:r>
-    </w:p>
-    <w:p>
-      <w:pPr>
-        <w:spacing w:before="300" w:after="300" w:line="240" w:lineRule="auto"/>
-        <w:rPr>
-          <w:rFonts w:ascii="Helvetica" w:eastAsia="Times New Roman" w:hAnsi="Helvetica" w:cs="Times New Roman"/>
-          <w:color w:val="000000" w:themeColor="text1"/>
-          <w:kern w:val="0"/>
-          <w:sz w:val="20"/>
-          <w:szCs w:val="20"/>
-          <w14:ligatures w14:val="none"/>
-        </w:rPr>
-      </w:pPr>
-      <w:r>
-        <w:rPr>
-          <w:rFonts w:ascii="Times New Roman" w:eastAsia="Times New Roman" w:hAnsi="Times New Roman" w:cs="Times New Roman"/>
-          <w:noProof/>
-          <w:color w:val="000000" w:themeColor="text1"/>
-          <w:kern w:val="0"/>
-        </w:rPr>
-        <w:pict w14:anchorId="37AE169A">
-          <v:rect id="_x0000_i1027" alt="" style="width:468pt;height:.05pt;mso-width-percent:0;mso-height-percent:0;mso-width-percent:0;mso-height-percent:0" o:hralign="center" o:hrstd="t" o:hrnoshade="t" o:hr="t" fillcolor="#bcbec4" stroked="f"/>
-        </w:pict>
-      </w:r>
-    </w:p>
-    <w:p>
-      <w:pPr>
-        <w:spacing w:before="240" w:after="240" w:line="240" w:lineRule="auto"/>
-        <w:outlineLvl w:val="2"/>
-        <w:rPr>
-          <w:rFonts w:ascii="Helvetica" w:eastAsia="Times New Roman" w:hAnsi="Helvetica" w:cs="Times New Roman"/>
-          <w:b/>
-          <w:bCs/>
-          <w:color w:val="000000" w:themeColor="text1"/>
-          <w:kern w:val="0"/>
-          <w:sz w:val="31"/>
-          <w:szCs w:val="31"/>
-          <w14:ligatures w14:val="none"/>
-        </w:rPr>
-      </w:pPr>
-      <w:r>
-        <w:rPr>
-          <w:rFonts w:ascii="Helvetica" w:eastAsia="Times New Roman" w:hAnsi="Helvetica" w:cs="Times New Roman"/>
-          <w:b/>
-          <w:bCs/>
-          <w:color w:val="000000" w:themeColor="text1"/>
-          <w:kern w:val="0"/>
-          <w:sz w:val="31"/>
-          <w:szCs w:val="31"/>
-          <w14:ligatures w14:val="none"/>
-        </w:rPr>
-        <w:t>Dataset Description</w:t>
-      </w:r>
-    </w:p>
-    <w:p>
-      <w:pPr>
-        <w:spacing w:before="240" w:after="240" w:line="240" w:lineRule="auto"/>
-        <w:rPr>
-          <w:rFonts w:ascii="Helvetica" w:eastAsia="Times New Roman" w:hAnsi="Helvetica" w:cs="Times New Roman"/>
-          <w:color w:val="000000" w:themeColor="text1"/>
-          <w:kern w:val="0"/>
-          <w:sz w:val="20"/>
-          <w:szCs w:val="20"/>
-          <w14:ligatures w14:val="none"/>
-        </w:rPr>
-      </w:pPr>
-      <w:r>
-        <w:rPr>
-          <w:rFonts w:ascii="Helvetica" w:eastAsia="Times New Roman" w:hAnsi="Helvetica" w:cs="Times New Roman"/>
-          <w:color w:val="000000" w:themeColor="text1"/>
-          <w:kern w:val="0"/>
-          <w:sz w:val="20"/>
-          <w:szCs w:val="20"/>
-          <w14:ligatures w14:val="none"/>
-        </w:rPr>
-        <w:t>The dataset records various attributes of food orders, including customer ratings, preparation and delivery times, and cuisine types.</w:t>
-      </w:r>
-    </w:p>
-    <w:p>
-      <w:pPr>
-        <w:spacing w:before="240" w:after="240" w:line="240" w:lineRule="auto"/>
-        <w:outlineLvl w:val="2"/>
-        <w:rPr>
-          <w:rFonts w:ascii="Helvetica" w:eastAsia="Times New Roman" w:hAnsi="Helvetica" w:cs="Times New Roman"/>
-          <w:b/>
-          <w:bCs/>
-          <w:color w:val="000000" w:themeColor="text1"/>
-          <w:kern w:val="0"/>
-          <w:sz w:val="31"/>
-          <w:szCs w:val="31"/>
-          <w14:ligatures w14:val="none"/>
-        </w:rPr>
-      </w:pPr>
-      <w:r>
-        <w:rPr>
-          <w:rFonts w:ascii="Helvetica" w:eastAsia="Times New Roman" w:hAnsi="Helvetica" w:cs="Times New Roman"/>
-          <w:b/>
-          <w:bCs/>
-          <w:color w:val="000000" w:themeColor="text1"/>
-          <w:kern w:val="0"/>
-          <w:sz w:val="31"/>
-          <w:szCs w:val="31"/>
-          <w14:ligatures w14:val="none"/>
-        </w:rPr>
-        <w:t>Key Findings</w:t>
-      </w:r>
-    </w:p>
-    <w:p>
-      <w:pPr>
-        <w:spacing w:before="240" w:after="240" w:line="240" w:lineRule="auto"/>
-        <w:outlineLvl w:val="3"/>
-        <w:rPr>
-          <w:rFonts w:ascii="Helvetica" w:eastAsia="Times New Roman" w:hAnsi="Helvetica" w:cs="Times New Roman"/>
-          <w:b/>
-          <w:bCs/>
-          <w:color w:val="000000" w:themeColor="text1"/>
-          <w:kern w:val="0"/>
-          <w:sz w:val="20"/>
-          <w:szCs w:val="20"/>
-          <w14:ligatures w14:val="none"/>
-        </w:rPr>
-      </w:pPr>
-      <w:r>
-        <w:rPr>
-          <w:rFonts w:ascii="Helvetica" w:eastAsia="Times New Roman" w:hAnsi="Helvetica" w:cs="Times New Roman"/>
+          <w:sz w:val="20"/>
+          <w:szCs w:val="20"/>
+          <w14:ligatures w14:val="none"/>
+        </w:rPr>
+      </w:pPr>
+      <w:r>
+        <w:rPr>
+          <w:rFonts w:ascii="Courier New" w:eastAsia="Times New Roman" w:hAnsi="Courier New" w:cs="Courier New"/>
           <w:b/>
           <w:bCs/>
           <w:color w:val="000000" w:themeColor="text1"/>
@@ -428,17 +334,17 @@
         </w:numPr>
         <w:spacing w:before="100" w:beforeAutospacing="1" w:after="100" w:afterAutospacing="1" w:line="240" w:lineRule="auto"/>
         <w:rPr>
-          <w:rFonts w:ascii="Helvetica" w:eastAsia="Times New Roman" w:hAnsi="Helvetica" w:cs="Times New Roman"/>
-          <w:color w:val="000000" w:themeColor="text1"/>
-          <w:kern w:val="0"/>
-          <w:sz w:val="20"/>
-          <w:szCs w:val="20"/>
-          <w14:ligatures w14:val="none"/>
-        </w:rPr>
-      </w:pPr>
-      <w:r>
-        <w:rPr>
-          <w:rFonts w:ascii="Helvetica" w:eastAsia="Times New Roman" w:hAnsi="Helvetica" w:cs="Times New Roman"/>
+          <w:rFonts w:ascii="Courier New" w:eastAsia="Times New Roman" w:hAnsi="Courier New" w:cs="Courier New"/>
+          <w:color w:val="000000" w:themeColor="text1"/>
+          <w:kern w:val="0"/>
+          <w:sz w:val="20"/>
+          <w:szCs w:val="20"/>
+          <w14:ligatures w14:val="none"/>
+        </w:rPr>
+      </w:pPr>
+      <w:r>
+        <w:rPr>
+          <w:rFonts w:ascii="Courier New" w:eastAsia="Times New Roman" w:hAnsi="Courier New" w:cs="Courier New"/>
           <w:color w:val="000000" w:themeColor="text1"/>
           <w:kern w:val="0"/>
           <w:sz w:val="20"/>
@@ -456,17 +362,17 @@
         </w:numPr>
         <w:spacing w:before="100" w:beforeAutospacing="1" w:after="100" w:afterAutospacing="1" w:line="240" w:lineRule="auto"/>
         <w:rPr>
-          <w:rFonts w:ascii="Helvetica" w:eastAsia="Times New Roman" w:hAnsi="Helvetica" w:cs="Times New Roman"/>
-          <w:color w:val="000000" w:themeColor="text1"/>
-          <w:kern w:val="0"/>
-          <w:sz w:val="20"/>
-          <w:szCs w:val="20"/>
-          <w14:ligatures w14:val="none"/>
-        </w:rPr>
-      </w:pPr>
-      <w:r>
-        <w:rPr>
-          <w:rFonts w:ascii="Helvetica" w:eastAsia="Times New Roman" w:hAnsi="Helvetica" w:cs="Times New Roman"/>
+          <w:rFonts w:ascii="Courier New" w:eastAsia="Times New Roman" w:hAnsi="Courier New" w:cs="Courier New"/>
+          <w:color w:val="000000" w:themeColor="text1"/>
+          <w:kern w:val="0"/>
+          <w:sz w:val="20"/>
+          <w:szCs w:val="20"/>
+          <w14:ligatures w14:val="none"/>
+        </w:rPr>
+      </w:pPr>
+      <w:r>
+        <w:rPr>
+          <w:rFonts w:ascii="Courier New" w:eastAsia="Times New Roman" w:hAnsi="Courier New" w:cs="Courier New"/>
           <w:color w:val="000000" w:themeColor="text1"/>
           <w:kern w:val="0"/>
           <w:sz w:val="20"/>
@@ -477,7 +383,7 @@
       </w:r>
       <w:r>
         <w:rPr>
-          <w:rFonts w:ascii="Helvetica" w:eastAsia="Times New Roman" w:hAnsi="Helvetica" w:cs="Times New Roman"/>
+          <w:rFonts w:ascii="Courier New" w:eastAsia="Times New Roman" w:hAnsi="Courier New" w:cs="Courier New"/>
           <w:b/>
           <w:bCs/>
           <w:color w:val="000000" w:themeColor="text1"/>
@@ -490,7 +396,7 @@
       </w:r>
       <w:r>
         <w:rPr>
-          <w:rFonts w:ascii="Helvetica" w:eastAsia="Times New Roman" w:hAnsi="Helvetica" w:cs="Times New Roman"/>
+          <w:rFonts w:ascii="Courier New" w:eastAsia="Times New Roman" w:hAnsi="Courier New" w:cs="Courier New"/>
           <w:color w:val="000000" w:themeColor="text1"/>
           <w:kern w:val="0"/>
           <w:sz w:val="20"/>
@@ -501,7 +407,7 @@
       </w:r>
       <w:r>
         <w:rPr>
-          <w:rFonts w:ascii="Helvetica" w:eastAsia="Times New Roman" w:hAnsi="Helvetica" w:cs="Times New Roman"/>
+          <w:rFonts w:ascii="Courier New" w:eastAsia="Times New Roman" w:hAnsi="Courier New" w:cs="Courier New"/>
           <w:b/>
           <w:bCs/>
           <w:color w:val="000000" w:themeColor="text1"/>
@@ -514,7 +420,7 @@
       </w:r>
       <w:r>
         <w:rPr>
-          <w:rFonts w:ascii="Helvetica" w:eastAsia="Times New Roman" w:hAnsi="Helvetica" w:cs="Times New Roman"/>
+          <w:rFonts w:ascii="Courier New" w:eastAsia="Times New Roman" w:hAnsi="Courier New" w:cs="Courier New"/>
           <w:color w:val="000000" w:themeColor="text1"/>
           <w:kern w:val="0"/>
           <w:sz w:val="20"/>
@@ -525,7 +431,7 @@
       </w:r>
       <w:r>
         <w:rPr>
-          <w:rFonts w:ascii="Helvetica" w:eastAsia="Times New Roman" w:hAnsi="Helvetica" w:cs="Times New Roman"/>
+          <w:rFonts w:ascii="Courier New" w:eastAsia="Times New Roman" w:hAnsi="Courier New" w:cs="Courier New"/>
           <w:b/>
           <w:bCs/>
           <w:color w:val="000000" w:themeColor="text1"/>
@@ -538,7 +444,7 @@
       </w:r>
       <w:r>
         <w:rPr>
-          <w:rFonts w:ascii="Helvetica" w:eastAsia="Times New Roman" w:hAnsi="Helvetica" w:cs="Times New Roman"/>
+          <w:rFonts w:ascii="Courier New" w:eastAsia="Times New Roman" w:hAnsi="Courier New" w:cs="Courier New"/>
           <w:color w:val="000000" w:themeColor="text1"/>
           <w:kern w:val="0"/>
           <w:sz w:val="20"/>
@@ -549,7 +455,7 @@
       </w:r>
       <w:r>
         <w:rPr>
-          <w:rFonts w:ascii="Helvetica" w:eastAsia="Times New Roman" w:hAnsi="Helvetica" w:cs="Times New Roman"/>
+          <w:rFonts w:ascii="Courier New" w:eastAsia="Times New Roman" w:hAnsi="Courier New" w:cs="Courier New"/>
           <w:b/>
           <w:bCs/>
           <w:color w:val="000000" w:themeColor="text1"/>
@@ -562,7 +468,7 @@
       </w:r>
       <w:r>
         <w:rPr>
-          <w:rFonts w:ascii="Helvetica" w:eastAsia="Times New Roman" w:hAnsi="Helvetica" w:cs="Times New Roman"/>
+          <w:rFonts w:ascii="Courier New" w:eastAsia="Times New Roman" w:hAnsi="Courier New" w:cs="Courier New"/>
           <w:color w:val="000000" w:themeColor="text1"/>
           <w:kern w:val="0"/>
           <w:sz w:val="20"/>
@@ -573,7 +479,7 @@
       </w:r>
       <w:r>
         <w:rPr>
-          <w:rFonts w:ascii="Helvetica" w:eastAsia="Times New Roman" w:hAnsi="Helvetica" w:cs="Times New Roman"/>
+          <w:rFonts w:ascii="Courier New" w:eastAsia="Times New Roman" w:hAnsi="Courier New" w:cs="Courier New"/>
           <w:b/>
           <w:bCs/>
           <w:color w:val="000000" w:themeColor="text1"/>
@@ -590,7 +496,7 @@
         <w:spacing w:before="240" w:after="240" w:line="240" w:lineRule="auto"/>
         <w:outlineLvl w:val="3"/>
         <w:rPr>
-          <w:rFonts w:ascii="Helvetica" w:eastAsia="Times New Roman" w:hAnsi="Helvetica" w:cs="Times New Roman"/>
+          <w:rFonts w:ascii="Courier New" w:eastAsia="Times New Roman" w:hAnsi="Courier New" w:cs="Courier New"/>
           <w:b/>
           <w:bCs/>
           <w:color w:val="000000" w:themeColor="text1"/>
@@ -602,7 +508,7 @@
       </w:pPr>
       <w:r>
         <w:rPr>
-          <w:rFonts w:ascii="Helvetica" w:eastAsia="Times New Roman" w:hAnsi="Helvetica" w:cs="Times New Roman"/>
+          <w:rFonts w:ascii="Courier New" w:eastAsia="Times New Roman" w:hAnsi="Courier New" w:cs="Courier New"/>
           <w:b/>
           <w:bCs/>
           <w:color w:val="000000" w:themeColor="text1"/>
@@ -622,17 +528,17 @@
         </w:numPr>
         <w:spacing w:before="100" w:beforeAutospacing="1" w:after="100" w:afterAutospacing="1" w:line="240" w:lineRule="auto"/>
         <w:rPr>
-          <w:rFonts w:ascii="Helvetica" w:eastAsia="Times New Roman" w:hAnsi="Helvetica" w:cs="Times New Roman"/>
-          <w:color w:val="000000" w:themeColor="text1"/>
-          <w:kern w:val="0"/>
-          <w:sz w:val="20"/>
-          <w:szCs w:val="20"/>
-          <w14:ligatures w14:val="none"/>
-        </w:rPr>
-      </w:pPr>
-      <w:r>
-        <w:rPr>
-          <w:rFonts w:ascii="Helvetica" w:eastAsia="Times New Roman" w:hAnsi="Helvetica" w:cs="Times New Roman"/>
+          <w:rFonts w:ascii="Courier New" w:eastAsia="Times New Roman" w:hAnsi="Courier New" w:cs="Courier New"/>
+          <w:color w:val="000000" w:themeColor="text1"/>
+          <w:kern w:val="0"/>
+          <w:sz w:val="20"/>
+          <w:szCs w:val="20"/>
+          <w14:ligatures w14:val="none"/>
+        </w:rPr>
+      </w:pPr>
+      <w:r>
+        <w:rPr>
+          <w:rFonts w:ascii="Courier New" w:eastAsia="Times New Roman" w:hAnsi="Courier New" w:cs="Courier New"/>
           <w:color w:val="000000" w:themeColor="text1"/>
           <w:kern w:val="0"/>
           <w:sz w:val="20"/>
@@ -643,7 +549,7 @@
       </w:r>
       <w:r>
         <w:rPr>
-          <w:rFonts w:ascii="Helvetica" w:eastAsia="Times New Roman" w:hAnsi="Helvetica" w:cs="Times New Roman"/>
+          <w:rFonts w:ascii="Courier New" w:eastAsia="Times New Roman" w:hAnsi="Courier New" w:cs="Courier New"/>
           <w:b/>
           <w:bCs/>
           <w:color w:val="000000" w:themeColor="text1"/>
@@ -663,17 +569,17 @@
         </w:numPr>
         <w:spacing w:before="100" w:beforeAutospacing="1" w:after="100" w:afterAutospacing="1" w:line="240" w:lineRule="auto"/>
         <w:rPr>
-          <w:rFonts w:ascii="Helvetica" w:eastAsia="Times New Roman" w:hAnsi="Helvetica" w:cs="Times New Roman"/>
-          <w:color w:val="000000" w:themeColor="text1"/>
-          <w:kern w:val="0"/>
-          <w:sz w:val="20"/>
-          <w:szCs w:val="20"/>
-          <w14:ligatures w14:val="none"/>
-        </w:rPr>
-      </w:pPr>
-      <w:r>
-        <w:rPr>
-          <w:rFonts w:ascii="Helvetica" w:eastAsia="Times New Roman" w:hAnsi="Helvetica" w:cs="Times New Roman"/>
+          <w:rFonts w:ascii="Courier New" w:eastAsia="Times New Roman" w:hAnsi="Courier New" w:cs="Courier New"/>
+          <w:color w:val="000000" w:themeColor="text1"/>
+          <w:kern w:val="0"/>
+          <w:sz w:val="20"/>
+          <w:szCs w:val="20"/>
+          <w14:ligatures w14:val="none"/>
+        </w:rPr>
+      </w:pPr>
+      <w:r>
+        <w:rPr>
+          <w:rFonts w:ascii="Courier New" w:eastAsia="Times New Roman" w:hAnsi="Courier New" w:cs="Courier New"/>
           <w:b/>
           <w:bCs/>
           <w:color w:val="000000" w:themeColor="text1"/>
@@ -686,7 +592,7 @@
       </w:r>
       <w:r>
         <w:rPr>
-          <w:rFonts w:ascii="Helvetica" w:eastAsia="Times New Roman" w:hAnsi="Helvetica" w:cs="Times New Roman"/>
+          <w:rFonts w:ascii="Courier New" w:eastAsia="Times New Roman" w:hAnsi="Courier New" w:cs="Courier New"/>
           <w:color w:val="000000" w:themeColor="text1"/>
           <w:kern w:val="0"/>
           <w:sz w:val="20"/>
@@ -701,7 +607,7 @@
         <w:spacing w:before="240" w:after="240" w:line="240" w:lineRule="auto"/>
         <w:outlineLvl w:val="3"/>
         <w:rPr>
-          <w:rFonts w:ascii="Helvetica" w:eastAsia="Times New Roman" w:hAnsi="Helvetica" w:cs="Times New Roman"/>
+          <w:rFonts w:ascii="Courier New" w:eastAsia="Times New Roman" w:hAnsi="Courier New" w:cs="Courier New"/>
           <w:b/>
           <w:bCs/>
           <w:color w:val="000000" w:themeColor="text1"/>
@@ -713,7 +619,7 @@
       </w:pPr>
       <w:r>
         <w:rPr>
-          <w:rFonts w:ascii="Helvetica" w:eastAsia="Times New Roman" w:hAnsi="Helvetica" w:cs="Times New Roman"/>
+          <w:rFonts w:ascii="Courier New" w:eastAsia="Times New Roman" w:hAnsi="Courier New" w:cs="Courier New"/>
           <w:b/>
           <w:bCs/>
           <w:color w:val="000000" w:themeColor="text1"/>
@@ -733,17 +639,17 @@
         </w:numPr>
         <w:spacing w:before="100" w:beforeAutospacing="1" w:after="100" w:afterAutospacing="1" w:line="240" w:lineRule="auto"/>
         <w:rPr>
-          <w:rFonts w:ascii="Helvetica" w:eastAsia="Times New Roman" w:hAnsi="Helvetica" w:cs="Times New Roman"/>
-          <w:color w:val="000000" w:themeColor="text1"/>
-          <w:kern w:val="0"/>
-          <w:sz w:val="20"/>
-          <w:szCs w:val="20"/>
-          <w14:ligatures w14:val="none"/>
-        </w:rPr>
-      </w:pPr>
-      <w:r>
-        <w:rPr>
-          <w:rFonts w:ascii="Helvetica" w:eastAsia="Times New Roman" w:hAnsi="Helvetica" w:cs="Times New Roman"/>
+          <w:rFonts w:ascii="Courier New" w:eastAsia="Times New Roman" w:hAnsi="Courier New" w:cs="Courier New"/>
+          <w:color w:val="000000" w:themeColor="text1"/>
+          <w:kern w:val="0"/>
+          <w:sz w:val="20"/>
+          <w:szCs w:val="20"/>
+          <w14:ligatures w14:val="none"/>
+        </w:rPr>
+      </w:pPr>
+      <w:r>
+        <w:rPr>
+          <w:rFonts w:ascii="Courier New" w:eastAsia="Times New Roman" w:hAnsi="Courier New" w:cs="Courier New"/>
           <w:color w:val="000000" w:themeColor="text1"/>
           <w:kern w:val="0"/>
           <w:sz w:val="20"/>
@@ -754,7 +660,7 @@
       </w:r>
       <w:r>
         <w:rPr>
-          <w:rFonts w:ascii="Helvetica" w:eastAsia="Times New Roman" w:hAnsi="Helvetica" w:cs="Times New Roman"/>
+          <w:rFonts w:ascii="Courier New" w:eastAsia="Times New Roman" w:hAnsi="Courier New" w:cs="Courier New"/>
           <w:b/>
           <w:bCs/>
           <w:color w:val="000000" w:themeColor="text1"/>
@@ -768,29 +674,14 @@
     </w:p>
     <w:p>
       <w:pPr>
-        <w:spacing w:before="240" w:after="240" w:line="240" w:lineRule="auto"/>
-        <w:outlineLvl w:val="2"/>
-        <w:rPr>
-          <w:rFonts w:ascii="Helvetica" w:eastAsia="Times New Roman" w:hAnsi="Helvetica" w:cs="Times New Roman"/>
-          <w:b/>
-          <w:bCs/>
-          <w:color w:val="000000" w:themeColor="text1"/>
-          <w:kern w:val="0"/>
-          <w:sz w:val="31"/>
-          <w:szCs w:val="31"/>
-          <w14:ligatures w14:val="none"/>
-        </w:rPr>
-      </w:pPr>
-      <w:r>
-        <w:rPr>
-          <w:rFonts w:ascii="Helvetica" w:eastAsia="Times New Roman" w:hAnsi="Helvetica" w:cs="Times New Roman"/>
-          <w:b/>
-          <w:bCs/>
-          <w:color w:val="000000" w:themeColor="text1"/>
-          <w:kern w:val="0"/>
-          <w:sz w:val="31"/>
-          <w:szCs w:val="31"/>
-          <w14:ligatures w14:val="none"/>
+        <w:pStyle w:val="Heading3"/>
+        <w:rPr>
+          <w:rFonts w:ascii="Courier New" w:eastAsia="Times New Roman" w:hAnsi="Courier New" w:cs="Courier New"/>
+        </w:rPr>
+      </w:pPr>
+      <w:r>
+        <w:rPr>
+          <w:rFonts w:ascii="Courier New" w:eastAsia="Times New Roman" w:hAnsi="Courier New" w:cs="Courier New"/>
         </w:rPr>
         <w:lastRenderedPageBreak/>
         <w:t>Recommendations</w:t>
@@ -804,17 +695,17 @@
         </w:numPr>
         <w:spacing w:before="100" w:beforeAutospacing="1" w:after="100" w:afterAutospacing="1" w:line="240" w:lineRule="auto"/>
         <w:rPr>
-          <w:rFonts w:ascii="Helvetica" w:eastAsia="Times New Roman" w:hAnsi="Helvetica" w:cs="Times New Roman"/>
-          <w:color w:val="000000" w:themeColor="text1"/>
-          <w:kern w:val="0"/>
-          <w:sz w:val="20"/>
-          <w:szCs w:val="20"/>
-          <w14:ligatures w14:val="none"/>
-        </w:rPr>
-      </w:pPr>
-      <w:r>
-        <w:rPr>
-          <w:rFonts w:ascii="Helvetica" w:eastAsia="Times New Roman" w:hAnsi="Helvetica" w:cs="Times New Roman"/>
+          <w:rFonts w:ascii="Courier New" w:eastAsia="Times New Roman" w:hAnsi="Courier New" w:cs="Courier New"/>
+          <w:color w:val="000000" w:themeColor="text1"/>
+          <w:kern w:val="0"/>
+          <w:sz w:val="20"/>
+          <w:szCs w:val="20"/>
+          <w14:ligatures w14:val="none"/>
+        </w:rPr>
+      </w:pPr>
+      <w:r>
+        <w:rPr>
+          <w:rFonts w:ascii="Courier New" w:eastAsia="Times New Roman" w:hAnsi="Courier New" w:cs="Courier New"/>
           <w:b/>
           <w:bCs/>
           <w:color w:val="000000" w:themeColor="text1"/>
@@ -827,7 +718,7 @@
       </w:r>
       <w:r>
         <w:rPr>
-          <w:rFonts w:ascii="Helvetica" w:eastAsia="Times New Roman" w:hAnsi="Helvetica" w:cs="Times New Roman"/>
+          <w:rFonts w:ascii="Courier New" w:eastAsia="Times New Roman" w:hAnsi="Courier New" w:cs="Courier New"/>
           <w:color w:val="000000" w:themeColor="text1"/>
           <w:kern w:val="0"/>
           <w:sz w:val="20"/>
@@ -845,17 +736,17 @@
         </w:numPr>
         <w:spacing w:before="100" w:beforeAutospacing="1" w:after="100" w:afterAutospacing="1" w:line="240" w:lineRule="auto"/>
         <w:rPr>
-          <w:rFonts w:ascii="Helvetica" w:eastAsia="Times New Roman" w:hAnsi="Helvetica" w:cs="Times New Roman"/>
-          <w:color w:val="000000" w:themeColor="text1"/>
-          <w:kern w:val="0"/>
-          <w:sz w:val="20"/>
-          <w:szCs w:val="20"/>
-          <w14:ligatures w14:val="none"/>
-        </w:rPr>
-      </w:pPr>
-      <w:r>
-        <w:rPr>
-          <w:rFonts w:ascii="Helvetica" w:eastAsia="Times New Roman" w:hAnsi="Helvetica" w:cs="Times New Roman"/>
+          <w:rFonts w:ascii="Courier New" w:eastAsia="Times New Roman" w:hAnsi="Courier New" w:cs="Courier New"/>
+          <w:color w:val="000000" w:themeColor="text1"/>
+          <w:kern w:val="0"/>
+          <w:sz w:val="20"/>
+          <w:szCs w:val="20"/>
+          <w14:ligatures w14:val="none"/>
+        </w:rPr>
+      </w:pPr>
+      <w:r>
+        <w:rPr>
+          <w:rFonts w:ascii="Courier New" w:eastAsia="Times New Roman" w:hAnsi="Courier New" w:cs="Courier New"/>
           <w:b/>
           <w:bCs/>
           <w:color w:val="000000" w:themeColor="text1"/>
@@ -868,7 +759,7 @@
       </w:r>
       <w:r>
         <w:rPr>
-          <w:rFonts w:ascii="Helvetica" w:eastAsia="Times New Roman" w:hAnsi="Helvetica" w:cs="Times New Roman"/>
+          <w:rFonts w:ascii="Courier New" w:eastAsia="Times New Roman" w:hAnsi="Courier New" w:cs="Courier New"/>
           <w:color w:val="000000" w:themeColor="text1"/>
           <w:kern w:val="0"/>
           <w:sz w:val="20"/>
@@ -886,17 +777,17 @@
         </w:numPr>
         <w:spacing w:before="100" w:beforeAutospacing="1" w:after="100" w:afterAutospacing="1" w:line="240" w:lineRule="auto"/>
         <w:rPr>
-          <w:rFonts w:ascii="Helvetica" w:eastAsia="Times New Roman" w:hAnsi="Helvetica" w:cs="Times New Roman"/>
-          <w:color w:val="000000" w:themeColor="text1"/>
-          <w:kern w:val="0"/>
-          <w:sz w:val="20"/>
-          <w:szCs w:val="20"/>
-          <w14:ligatures w14:val="none"/>
-        </w:rPr>
-      </w:pPr>
-      <w:r>
-        <w:rPr>
-          <w:rFonts w:ascii="Helvetica" w:eastAsia="Times New Roman" w:hAnsi="Helvetica" w:cs="Times New Roman"/>
+          <w:rFonts w:ascii="Courier New" w:eastAsia="Times New Roman" w:hAnsi="Courier New" w:cs="Courier New"/>
+          <w:color w:val="000000" w:themeColor="text1"/>
+          <w:kern w:val="0"/>
+          <w:sz w:val="20"/>
+          <w:szCs w:val="20"/>
+          <w14:ligatures w14:val="none"/>
+        </w:rPr>
+      </w:pPr>
+      <w:r>
+        <w:rPr>
+          <w:rFonts w:ascii="Courier New" w:eastAsia="Times New Roman" w:hAnsi="Courier New" w:cs="Courier New"/>
           <w:b/>
           <w:bCs/>
           <w:color w:val="000000" w:themeColor="text1"/>
@@ -909,7 +800,7 @@
       </w:r>
       <w:r>
         <w:rPr>
-          <w:rFonts w:ascii="Helvetica" w:eastAsia="Times New Roman" w:hAnsi="Helvetica" w:cs="Times New Roman"/>
+          <w:rFonts w:ascii="Courier New" w:eastAsia="Times New Roman" w:hAnsi="Courier New" w:cs="Courier New"/>
           <w:color w:val="000000" w:themeColor="text1"/>
           <w:kern w:val="0"/>
           <w:sz w:val="20"/>
@@ -927,17 +818,17 @@
         </w:numPr>
         <w:spacing w:before="100" w:beforeAutospacing="1" w:after="100" w:afterAutospacing="1" w:line="240" w:lineRule="auto"/>
         <w:rPr>
-          <w:rFonts w:ascii="Helvetica" w:eastAsia="Times New Roman" w:hAnsi="Helvetica" w:cs="Times New Roman"/>
-          <w:color w:val="000000" w:themeColor="text1"/>
-          <w:kern w:val="0"/>
-          <w:sz w:val="20"/>
-          <w:szCs w:val="20"/>
-          <w14:ligatures w14:val="none"/>
-        </w:rPr>
-      </w:pPr>
-      <w:r>
-        <w:rPr>
-          <w:rFonts w:ascii="Helvetica" w:eastAsia="Times New Roman" w:hAnsi="Helvetica" w:cs="Times New Roman"/>
+          <w:rFonts w:ascii="Courier New" w:eastAsia="Times New Roman" w:hAnsi="Courier New" w:cs="Courier New"/>
+          <w:color w:val="000000" w:themeColor="text1"/>
+          <w:kern w:val="0"/>
+          <w:sz w:val="20"/>
+          <w:szCs w:val="20"/>
+          <w14:ligatures w14:val="none"/>
+        </w:rPr>
+      </w:pPr>
+      <w:r>
+        <w:rPr>
+          <w:rFonts w:ascii="Courier New" w:eastAsia="Times New Roman" w:hAnsi="Courier New" w:cs="Courier New"/>
           <w:color w:val="000000" w:themeColor="text1"/>
           <w:kern w:val="0"/>
           <w:sz w:val="20"/>
@@ -948,7 +839,7 @@
       </w:r>
       <w:r>
         <w:rPr>
-          <w:rFonts w:ascii="Helvetica" w:eastAsia="Times New Roman" w:hAnsi="Helvetica" w:cs="Times New Roman"/>
+          <w:rFonts w:ascii="Courier New" w:eastAsia="Times New Roman" w:hAnsi="Courier New" w:cs="Courier New"/>
           <w:i/>
           <w:iCs/>
           <w:color w:val="000000" w:themeColor="text1"/>
@@ -968,17 +859,17 @@
         </w:numPr>
         <w:spacing w:before="100" w:beforeAutospacing="1" w:after="100" w:afterAutospacing="1" w:line="240" w:lineRule="auto"/>
         <w:rPr>
-          <w:rFonts w:ascii="Helvetica" w:eastAsia="Times New Roman" w:hAnsi="Helvetica" w:cs="Times New Roman"/>
-          <w:color w:val="000000" w:themeColor="text1"/>
-          <w:kern w:val="0"/>
-          <w:sz w:val="20"/>
-          <w:szCs w:val="20"/>
-          <w14:ligatures w14:val="none"/>
-        </w:rPr>
-      </w:pPr>
-      <w:r>
-        <w:rPr>
-          <w:rFonts w:ascii="Helvetica" w:eastAsia="Times New Roman" w:hAnsi="Helvetica" w:cs="Times New Roman"/>
+          <w:rFonts w:ascii="Courier New" w:eastAsia="Times New Roman" w:hAnsi="Courier New" w:cs="Courier New"/>
+          <w:color w:val="000000" w:themeColor="text1"/>
+          <w:kern w:val="0"/>
+          <w:sz w:val="20"/>
+          <w:szCs w:val="20"/>
+          <w14:ligatures w14:val="none"/>
+        </w:rPr>
+      </w:pPr>
+      <w:r>
+        <w:rPr>
+          <w:rFonts w:ascii="Courier New" w:eastAsia="Times New Roman" w:hAnsi="Courier New" w:cs="Courier New"/>
           <w:color w:val="000000" w:themeColor="text1"/>
           <w:kern w:val="0"/>
           <w:sz w:val="20"/>
@@ -989,7 +880,7 @@
       </w:r>
       <w:r>
         <w:rPr>
-          <w:rFonts w:ascii="Helvetica" w:eastAsia="Times New Roman" w:hAnsi="Helvetica" w:cs="Times New Roman"/>
+          <w:rFonts w:ascii="Courier New" w:eastAsia="Times New Roman" w:hAnsi="Courier New" w:cs="Courier New"/>
           <w:i/>
           <w:iCs/>
           <w:color w:val="000000" w:themeColor="text1"/>
@@ -1009,7 +900,7 @@
         </w:numPr>
         <w:spacing w:before="100" w:beforeAutospacing="1" w:after="100" w:afterAutospacing="1" w:line="240" w:lineRule="auto"/>
         <w:rPr>
-          <w:rFonts w:ascii="Helvetica" w:eastAsia="Times New Roman" w:hAnsi="Helvetica" w:cs="Times New Roman"/>
+          <w:rFonts w:ascii="Courier New" w:eastAsia="Times New Roman" w:hAnsi="Courier New" w:cs="Courier New"/>
           <w:color w:val="000000" w:themeColor="text1"/>
           <w:kern w:val="0"/>
           <w:sz w:val="20"/>
@@ -1020,7 +911,7 @@
       <w:proofErr w:type="spellStart"/>
       <w:r>
         <w:rPr>
-          <w:rFonts w:ascii="Helvetica" w:eastAsia="Times New Roman" w:hAnsi="Helvetica" w:cs="Times New Roman"/>
+          <w:rFonts w:ascii="Courier New" w:eastAsia="Times New Roman" w:hAnsi="Courier New" w:cs="Courier New"/>
           <w:color w:val="000000" w:themeColor="text1"/>
           <w:kern w:val="0"/>
           <w:sz w:val="20"/>
@@ -1032,7 +923,7 @@
       <w:proofErr w:type="spellEnd"/>
       <w:r>
         <w:rPr>
-          <w:rFonts w:ascii="Helvetica" w:eastAsia="Times New Roman" w:hAnsi="Helvetica" w:cs="Times New Roman"/>
+          <w:rFonts w:ascii="Courier New" w:eastAsia="Times New Roman" w:hAnsi="Courier New" w:cs="Courier New"/>
           <w:color w:val="000000" w:themeColor="text1"/>
           <w:kern w:val="0"/>
           <w:sz w:val="20"/>
@@ -1043,7 +934,7 @@
       </w:r>
       <w:r>
         <w:rPr>
-          <w:rFonts w:ascii="Helvetica" w:eastAsia="Times New Roman" w:hAnsi="Helvetica" w:cs="Times New Roman"/>
+          <w:rFonts w:ascii="Courier New" w:eastAsia="Times New Roman" w:hAnsi="Courier New" w:cs="Courier New"/>
           <w:i/>
           <w:iCs/>
           <w:color w:val="000000" w:themeColor="text1"/>
@@ -1063,17 +954,17 @@
         </w:numPr>
         <w:spacing w:before="100" w:beforeAutospacing="1" w:after="100" w:afterAutospacing="1" w:line="240" w:lineRule="auto"/>
         <w:rPr>
-          <w:rFonts w:ascii="Helvetica" w:eastAsia="Times New Roman" w:hAnsi="Helvetica" w:cs="Times New Roman"/>
-          <w:color w:val="000000" w:themeColor="text1"/>
-          <w:kern w:val="0"/>
-          <w:sz w:val="20"/>
-          <w:szCs w:val="20"/>
-          <w14:ligatures w14:val="none"/>
-        </w:rPr>
-      </w:pPr>
-      <w:r>
-        <w:rPr>
-          <w:rFonts w:ascii="Helvetica" w:eastAsia="Times New Roman" w:hAnsi="Helvetica" w:cs="Times New Roman"/>
+          <w:rFonts w:ascii="Courier New" w:eastAsia="Times New Roman" w:hAnsi="Courier New" w:cs="Courier New"/>
+          <w:color w:val="000000" w:themeColor="text1"/>
+          <w:kern w:val="0"/>
+          <w:sz w:val="20"/>
+          <w:szCs w:val="20"/>
+          <w14:ligatures w14:val="none"/>
+        </w:rPr>
+      </w:pPr>
+      <w:r>
+        <w:rPr>
+          <w:rFonts w:ascii="Courier New" w:eastAsia="Times New Roman" w:hAnsi="Courier New" w:cs="Courier New"/>
           <w:color w:val="000000" w:themeColor="text1"/>
           <w:kern w:val="0"/>
           <w:sz w:val="20"/>
@@ -1084,7 +975,7 @@
       </w:r>
       <w:r>
         <w:rPr>
-          <w:rFonts w:ascii="Helvetica" w:eastAsia="Times New Roman" w:hAnsi="Helvetica" w:cs="Times New Roman"/>
+          <w:rFonts w:ascii="Courier New" w:eastAsia="Times New Roman" w:hAnsi="Courier New" w:cs="Courier New"/>
           <w:i/>
           <w:iCs/>
           <w:color w:val="000000" w:themeColor="text1"/>
@@ -1104,17 +995,17 @@
         </w:numPr>
         <w:spacing w:before="100" w:beforeAutospacing="1" w:after="100" w:afterAutospacing="1" w:line="240" w:lineRule="auto"/>
         <w:rPr>
-          <w:rFonts w:ascii="Helvetica" w:eastAsia="Times New Roman" w:hAnsi="Helvetica" w:cs="Times New Roman"/>
-          <w:color w:val="000000" w:themeColor="text1"/>
-          <w:kern w:val="0"/>
-          <w:sz w:val="20"/>
-          <w:szCs w:val="20"/>
-          <w14:ligatures w14:val="none"/>
-        </w:rPr>
-      </w:pPr>
-      <w:r>
-        <w:rPr>
-          <w:rFonts w:ascii="Helvetica" w:eastAsia="Times New Roman" w:hAnsi="Helvetica" w:cs="Times New Roman"/>
+          <w:rFonts w:ascii="Courier New" w:eastAsia="Times New Roman" w:hAnsi="Courier New" w:cs="Courier New"/>
+          <w:color w:val="000000" w:themeColor="text1"/>
+          <w:kern w:val="0"/>
+          <w:sz w:val="20"/>
+          <w:szCs w:val="20"/>
+          <w14:ligatures w14:val="none"/>
+        </w:rPr>
+      </w:pPr>
+      <w:r>
+        <w:rPr>
+          <w:rFonts w:ascii="Courier New" w:eastAsia="Times New Roman" w:hAnsi="Courier New" w:cs="Courier New"/>
           <w:color w:val="000000" w:themeColor="text1"/>
           <w:kern w:val="0"/>
           <w:sz w:val="20"/>
@@ -1125,7 +1016,7 @@
       </w:r>
       <w:r>
         <w:rPr>
-          <w:rFonts w:ascii="Helvetica" w:eastAsia="Times New Roman" w:hAnsi="Helvetica" w:cs="Times New Roman"/>
+          <w:rFonts w:ascii="Courier New" w:eastAsia="Times New Roman" w:hAnsi="Courier New" w:cs="Courier New"/>
           <w:i/>
           <w:iCs/>
           <w:color w:val="000000" w:themeColor="text1"/>
@@ -1139,115 +1030,42 @@
     </w:p>
     <w:p>
       <w:pPr>
-        <w:spacing w:before="300" w:after="300" w:line="240" w:lineRule="auto"/>
-        <w:rPr>
-          <w:rFonts w:ascii="Helvetica" w:eastAsia="Times New Roman" w:hAnsi="Helvetica" w:cs="Times New Roman"/>
-          <w:color w:val="000000" w:themeColor="text1"/>
-          <w:kern w:val="0"/>
-          <w:sz w:val="20"/>
-          <w:szCs w:val="20"/>
-          <w14:ligatures w14:val="none"/>
-        </w:rPr>
-      </w:pPr>
-      <w:r>
-        <w:rPr>
-          <w:rFonts w:ascii="Times New Roman" w:eastAsia="Times New Roman" w:hAnsi="Times New Roman" w:cs="Times New Roman"/>
-          <w:noProof/>
-          <w:color w:val="000000" w:themeColor="text1"/>
-          <w:kern w:val="0"/>
-        </w:rPr>
-        <w:pict w14:anchorId="2BEDF22E">
-          <v:rect id="_x0000_i1026" alt="" style="width:468pt;height:.05pt;mso-width-percent:0;mso-height-percent:0;mso-width-percent:0;mso-height-percent:0" o:hralign="center" o:hrstd="t" o:hrnoshade="t" o:hr="t" fillcolor="#bcbec4" stroked="f"/>
-        </w:pict>
+        <w:pStyle w:val="Heading3"/>
+        <w:rPr>
+          <w:rFonts w:ascii="Courier New" w:eastAsia="Times New Roman" w:hAnsi="Courier New" w:cs="Courier New"/>
+        </w:rPr>
+      </w:pPr>
+      <w:r>
+        <w:rPr>
+          <w:rFonts w:ascii="Apple Color Emoji" w:eastAsia="Times New Roman" w:hAnsi="Apple Color Emoji" w:cs="Apple Color Emoji"/>
+        </w:rPr>
+        <w:t>🏆</w:t>
+      </w:r>
+      <w:r>
+        <w:rPr>
+          <w:rFonts w:ascii="Courier New" w:eastAsia="Times New Roman" w:hAnsi="Courier New" w:cs="Courier New"/>
+        </w:rPr>
+        <w:t xml:space="preserve"> Top Restaurants</w:t>
       </w:r>
     </w:p>
     <w:p>
       <w:pPr>
         <w:spacing w:before="240" w:after="240" w:line="240" w:lineRule="auto"/>
-        <w:outlineLvl w:val="2"/>
-        <w:rPr>
-          <w:rFonts w:ascii="Helvetica" w:eastAsia="Times New Roman" w:hAnsi="Helvetica" w:cs="Times New Roman"/>
+        <w:outlineLvl w:val="3"/>
+        <w:rPr>
+          <w:rFonts w:ascii="Courier New" w:eastAsia="Times New Roman" w:hAnsi="Courier New" w:cs="Courier New"/>
           <w:b/>
           <w:bCs/>
           <w:color w:val="000000" w:themeColor="text1"/>
           <w:kern w:val="0"/>
-          <w:sz w:val="31"/>
-          <w:szCs w:val="31"/>
-          <w14:ligatures w14:val="none"/>
-        </w:rPr>
-      </w:pPr>
-      <w:r>
-        <w:rPr>
-          <w:rFonts w:ascii="Apple Color Emoji" w:eastAsia="Times New Roman" w:hAnsi="Apple Color Emoji" w:cs="Apple Color Emoji"/>
-          <w:b/>
-          <w:bCs/>
-          <w:color w:val="000000" w:themeColor="text1"/>
-          <w:kern w:val="0"/>
-          <w:sz w:val="31"/>
-          <w:szCs w:val="31"/>
-          <w14:ligatures w14:val="none"/>
-        </w:rPr>
-        <w:t>🏆</w:t>
-      </w:r>
-      <w:r>
-        <w:rPr>
-          <w:rFonts w:ascii="Helvetica" w:eastAsia="Times New Roman" w:hAnsi="Helvetica" w:cs="Times New Roman"/>
-          <w:b/>
-          <w:bCs/>
-          <w:color w:val="000000" w:themeColor="text1"/>
-          <w:kern w:val="0"/>
-          <w:sz w:val="31"/>
-          <w:szCs w:val="31"/>
-          <w14:ligatures w14:val="none"/>
-        </w:rPr>
-        <w:t xml:space="preserve"> Top Restaurants</w:t>
-      </w:r>
-    </w:p>
-    <w:p>
-      <w:pPr>
-        <w:spacing w:before="240" w:after="240" w:line="240" w:lineRule="auto"/>
-        <w:outlineLvl w:val="2"/>
-        <w:rPr>
-          <w:rFonts w:ascii="Helvetica" w:eastAsia="Times New Roman" w:hAnsi="Helvetica" w:cs="Times New Roman"/>
-          <w:b/>
-          <w:bCs/>
-          <w:color w:val="000000" w:themeColor="text1"/>
-          <w:kern w:val="0"/>
-          <w:sz w:val="31"/>
-          <w:szCs w:val="31"/>
-          <w14:ligatures w14:val="none"/>
-        </w:rPr>
-      </w:pPr>
-      <w:r>
-        <w:rPr>
-          <w:rFonts w:ascii="Times New Roman" w:eastAsia="Times New Roman" w:hAnsi="Times New Roman" w:cs="Times New Roman"/>
-          <w:noProof/>
-          <w:color w:val="000000" w:themeColor="text1"/>
-          <w:kern w:val="0"/>
-        </w:rPr>
-        <w:pict w14:anchorId="481CE045">
-          <v:rect id="_x0000_i1025" alt="" style="width:468pt;height:.05pt;mso-width-percent:0;mso-height-percent:0;mso-width-percent:0;mso-height-percent:0" o:hralign="center" o:hrstd="t" o:hrnoshade="t" o:hr="t" fillcolor="#bcbec4" stroked="f"/>
-        </w:pict>
-      </w:r>
-    </w:p>
-    <w:p>
-      <w:pPr>
-        <w:spacing w:before="240" w:after="240" w:line="240" w:lineRule="auto"/>
-        <w:outlineLvl w:val="3"/>
-        <w:rPr>
-          <w:rFonts w:ascii="Helvetica" w:eastAsia="Times New Roman" w:hAnsi="Helvetica" w:cs="Times New Roman"/>
-          <w:b/>
-          <w:bCs/>
-          <w:color w:val="000000" w:themeColor="text1"/>
-          <w:kern w:val="0"/>
-          <w:sz w:val="20"/>
-          <w:szCs w:val="20"/>
-          <w14:ligatures w14:val="none"/>
-        </w:rPr>
-      </w:pPr>
-      <w:r>
-        <w:rPr>
-          <w:rFonts w:ascii="Helvetica" w:eastAsia="Times New Roman" w:hAnsi="Helvetica" w:cs="Times New Roman"/>
+          <w:sz w:val="20"/>
+          <w:szCs w:val="20"/>
+          <w14:ligatures w14:val="none"/>
+        </w:rPr>
+      </w:pPr>
+      <w:r>
+        <w:rPr>
+          <w:rFonts w:ascii="Courier New" w:eastAsia="Times New Roman" w:hAnsi="Courier New" w:cs="Courier New"/>
           <w:b/>
           <w:bCs/>
           <w:color w:val="000000" w:themeColor="text1"/>
@@ -1389,7 +1207,7 @@
         <w:spacing w:before="240" w:after="240" w:line="240" w:lineRule="auto"/>
         <w:outlineLvl w:val="3"/>
         <w:rPr>
-          <w:rFonts w:ascii="Helvetica" w:eastAsia="Times New Roman" w:hAnsi="Helvetica" w:cs="Times New Roman"/>
+          <w:rFonts w:ascii="Courier New" w:eastAsia="Times New Roman" w:hAnsi="Courier New" w:cs="Courier New"/>
           <w:b/>
           <w:bCs/>
           <w:color w:val="000000" w:themeColor="text1"/>
@@ -1401,7 +1219,7 @@
       </w:pPr>
       <w:r>
         <w:rPr>
-          <w:rFonts w:ascii="Helvetica" w:eastAsia="Times New Roman" w:hAnsi="Helvetica" w:cs="Times New Roman"/>
+          <w:rFonts w:ascii="Courier New" w:eastAsia="Times New Roman" w:hAnsi="Courier New" w:cs="Courier New"/>
           <w:b/>
           <w:bCs/>
           <w:color w:val="000000" w:themeColor="text1"/>
@@ -1503,7 +1321,7 @@
         <w:spacing w:before="240" w:after="240" w:line="240" w:lineRule="auto"/>
         <w:outlineLvl w:val="3"/>
         <w:rPr>
-          <w:rFonts w:ascii="Helvetica" w:eastAsia="Times New Roman" w:hAnsi="Helvetica" w:cs="Times New Roman"/>
+          <w:rFonts w:ascii="Courier New" w:eastAsia="Times New Roman" w:hAnsi="Courier New" w:cs="Courier New"/>
           <w:b/>
           <w:bCs/>
           <w:color w:val="000000" w:themeColor="text1"/>
@@ -1515,7 +1333,7 @@
       </w:pPr>
       <w:r>
         <w:rPr>
-          <w:rFonts w:ascii="Helvetica" w:eastAsia="Times New Roman" w:hAnsi="Helvetica" w:cs="Times New Roman"/>
+          <w:rFonts w:ascii="Courier New" w:eastAsia="Times New Roman" w:hAnsi="Courier New" w:cs="Courier New"/>
           <w:b/>
           <w:bCs/>
           <w:color w:val="000000" w:themeColor="text1"/>
@@ -1524,11 +1342,15 @@
           <w:szCs w:val="20"/>
           <w14:ligatures w14:val="none"/>
         </w:rPr>
-        <w:t>T</w:t>
-      </w:r>
-      <w:r>
-        <w:rPr>
-          <w:rFonts w:ascii="Helvetica" w:eastAsia="Times New Roman" w:hAnsi="Helvetica" w:cs="Times New Roman"/>
+        <w:t>Tools Used:</w:t>
+      </w:r>
+    </w:p>
+    <w:p>
+      <w:pPr>
+        <w:spacing w:before="240" w:after="240" w:line="240" w:lineRule="auto"/>
+        <w:outlineLvl w:val="3"/>
+        <w:rPr>
+          <w:rFonts w:ascii="Courier New" w:eastAsia="Times New Roman" w:hAnsi="Courier New" w:cs="Courier New"/>
           <w:b/>
           <w:bCs/>
           <w:color w:val="000000" w:themeColor="text1"/>
@@ -1537,11 +1359,92 @@
           <w:szCs w:val="20"/>
           <w14:ligatures w14:val="none"/>
         </w:rPr>
-        <w:t>ools Used</w:t>
-      </w:r>
-      <w:r>
-        <w:rPr>
-          <w:rFonts w:ascii="Helvetica" w:eastAsia="Times New Roman" w:hAnsi="Helvetica" w:cs="Times New Roman"/>
+      </w:pPr>
+      <w:r>
+        <w:rPr>
+          <w:rFonts w:ascii="Courier New" w:eastAsia="Times New Roman" w:hAnsi="Courier New" w:cs="Courier New"/>
+          <w:color w:val="000000" w:themeColor="text1"/>
+          <w:kern w:val="0"/>
+          <w:sz w:val="20"/>
+          <w:szCs w:val="20"/>
+          <w14:ligatures w14:val="none"/>
+        </w:rPr>
+        <w:t>- Python</w:t>
+      </w:r>
+      <w:r>
+        <w:rPr>
+          <w:rFonts w:ascii="Courier New" w:eastAsia="Times New Roman" w:hAnsi="Courier New" w:cs="Courier New"/>
+          <w:color w:val="000000" w:themeColor="text1"/>
+          <w:kern w:val="0"/>
+          <w:sz w:val="20"/>
+          <w:szCs w:val="20"/>
+          <w14:ligatures w14:val="none"/>
+        </w:rPr>
+        <w:br/>
+        <w:t>- Pandas, NumPy</w:t>
+      </w:r>
+      <w:r>
+        <w:rPr>
+          <w:rFonts w:ascii="Courier New" w:eastAsia="Times New Roman" w:hAnsi="Courier New" w:cs="Courier New"/>
+          <w:color w:val="000000" w:themeColor="text1"/>
+          <w:kern w:val="0"/>
+          <w:sz w:val="20"/>
+          <w:szCs w:val="20"/>
+          <w14:ligatures w14:val="none"/>
+        </w:rPr>
+        <w:br/>
+        <w:t>- Seaborn, Matplotlib</w:t>
+      </w:r>
+      <w:r>
+        <w:rPr>
+          <w:rFonts w:ascii="Courier New" w:eastAsia="Times New Roman" w:hAnsi="Courier New" w:cs="Courier New"/>
+          <w:color w:val="000000" w:themeColor="text1"/>
+          <w:kern w:val="0"/>
+          <w:sz w:val="20"/>
+          <w:szCs w:val="20"/>
+          <w14:ligatures w14:val="none"/>
+        </w:rPr>
+        <w:br/>
+        <w:t xml:space="preserve">- </w:t>
+      </w:r>
+      <w:proofErr w:type="spellStart"/>
+      <w:r>
+        <w:rPr>
+          <w:rFonts w:ascii="Courier New" w:eastAsia="Times New Roman" w:hAnsi="Courier New" w:cs="Courier New"/>
+          <w:color w:val="000000" w:themeColor="text1"/>
+          <w:kern w:val="0"/>
+          <w:sz w:val="20"/>
+          <w:szCs w:val="20"/>
+          <w14:ligatures w14:val="none"/>
+        </w:rPr>
+        <w:t>Jupyter</w:t>
+      </w:r>
+      <w:proofErr w:type="spellEnd"/>
+      <w:r>
+        <w:rPr>
+          <w:rFonts w:ascii="Courier New" w:eastAsia="Times New Roman" w:hAnsi="Courier New" w:cs="Courier New"/>
+          <w:color w:val="000000" w:themeColor="text1"/>
+          <w:kern w:val="0"/>
+          <w:sz w:val="20"/>
+          <w:szCs w:val="20"/>
+          <w14:ligatures w14:val="none"/>
+        </w:rPr>
+        <w:t xml:space="preserve"> Notebook</w:t>
+      </w:r>
+      <w:r>
+        <w:rPr>
+          <w:rFonts w:ascii="Courier New" w:eastAsia="Times New Roman" w:hAnsi="Courier New" w:cs="Courier New"/>
+          <w:color w:val="000000" w:themeColor="text1"/>
+          <w:kern w:val="0"/>
+          <w:sz w:val="20"/>
+          <w:szCs w:val="20"/>
+          <w14:ligatures w14:val="none"/>
+        </w:rPr>
+        <w:br/>
+      </w:r>
+      <w:r>
+        <w:rPr>
+          <w:rFonts w:ascii="Courier New" w:eastAsia="Times New Roman" w:hAnsi="Courier New" w:cs="Courier New"/>
           <w:b/>
           <w:bCs/>
           <w:color w:val="000000" w:themeColor="text1"/>
@@ -1550,118 +1453,108 @@
           <w:szCs w:val="20"/>
           <w14:ligatures w14:val="none"/>
         </w:rPr>
+        <w:br/>
+      </w:r>
+      <w:r>
+        <w:rPr>
+          <w:rFonts w:ascii="Courier New" w:eastAsia="Times New Roman" w:hAnsi="Courier New" w:cs="Courier New"/>
+          <w:b/>
+          <w:bCs/>
+          <w:color w:val="000000" w:themeColor="text1"/>
+          <w:kern w:val="0"/>
+          <w:sz w:val="20"/>
+          <w:szCs w:val="20"/>
+          <w14:ligatures w14:val="none"/>
+        </w:rPr>
+        <w:t>Project</w:t>
+      </w:r>
+      <w:r>
+        <w:rPr>
+          <w:rFonts w:ascii="Courier New" w:eastAsia="Times New Roman" w:hAnsi="Courier New" w:cs="Courier New"/>
+          <w:b/>
+          <w:bCs/>
+          <w:color w:val="000000" w:themeColor="text1"/>
+          <w:kern w:val="0"/>
+          <w:sz w:val="20"/>
+          <w:szCs w:val="20"/>
+          <w14:ligatures w14:val="none"/>
+        </w:rPr>
         <w:t>:</w:t>
       </w:r>
     </w:p>
     <w:p>
       <w:pPr>
-        <w:spacing w:before="240" w:after="240" w:line="240" w:lineRule="auto"/>
+        <w:spacing w:after="0" w:line="240" w:lineRule="auto"/>
         <w:outlineLvl w:val="3"/>
         <w:rPr>
-          <w:rFonts w:ascii="Helvetica" w:eastAsia="Times New Roman" w:hAnsi="Helvetica" w:cs="Times New Roman"/>
-          <w:b/>
-          <w:bCs/>
-          <w:color w:val="000000" w:themeColor="text1"/>
-          <w:kern w:val="0"/>
-          <w:sz w:val="20"/>
-          <w:szCs w:val="20"/>
-          <w14:ligatures w14:val="none"/>
-        </w:rPr>
-      </w:pPr>
-      <w:r>
-        <w:rPr>
-          <w:rFonts w:ascii="Helvetica" w:eastAsia="Times New Roman" w:hAnsi="Helvetica" w:cs="Times New Roman"/>
-          <w:color w:val="000000" w:themeColor="text1"/>
-          <w:kern w:val="0"/>
-          <w:sz w:val="20"/>
-          <w:szCs w:val="20"/>
-          <w14:ligatures w14:val="none"/>
-        </w:rPr>
-        <w:t>- Python</w:t>
-      </w:r>
-      <w:r>
-        <w:rPr>
-          <w:rFonts w:ascii="Helvetica" w:eastAsia="Times New Roman" w:hAnsi="Helvetica" w:cs="Times New Roman"/>
-          <w:color w:val="000000" w:themeColor="text1"/>
-          <w:kern w:val="0"/>
-          <w:sz w:val="20"/>
-          <w:szCs w:val="20"/>
-          <w14:ligatures w14:val="none"/>
-        </w:rPr>
-        <w:br/>
-        <w:t>- Pandas, NumPy</w:t>
-      </w:r>
-      <w:r>
-        <w:rPr>
-          <w:rFonts w:ascii="Helvetica" w:eastAsia="Times New Roman" w:hAnsi="Helvetica" w:cs="Times New Roman"/>
-          <w:color w:val="000000" w:themeColor="text1"/>
-          <w:kern w:val="0"/>
-          <w:sz w:val="20"/>
-          <w:szCs w:val="20"/>
-          <w14:ligatures w14:val="none"/>
-        </w:rPr>
-        <w:br/>
-        <w:t>- Seaborn, Matplotlib</w:t>
-      </w:r>
-      <w:r>
-        <w:rPr>
-          <w:rFonts w:ascii="Helvetica" w:eastAsia="Times New Roman" w:hAnsi="Helvetica" w:cs="Times New Roman"/>
-          <w:color w:val="000000" w:themeColor="text1"/>
-          <w:kern w:val="0"/>
-          <w:sz w:val="20"/>
-          <w:szCs w:val="20"/>
-          <w14:ligatures w14:val="none"/>
-        </w:rPr>
-        <w:br/>
-        <w:t xml:space="preserve">- </w:t>
-      </w:r>
-      <w:proofErr w:type="spellStart"/>
-      <w:r>
-        <w:rPr>
-          <w:rFonts w:ascii="Helvetica" w:eastAsia="Times New Roman" w:hAnsi="Helvetica" w:cs="Times New Roman"/>
-          <w:color w:val="000000" w:themeColor="text1"/>
-          <w:kern w:val="0"/>
-          <w:sz w:val="20"/>
-          <w:szCs w:val="20"/>
-          <w14:ligatures w14:val="none"/>
-        </w:rPr>
-        <w:t>Jupyter</w:t>
-      </w:r>
-      <w:proofErr w:type="spellEnd"/>
-      <w:r>
-        <w:rPr>
-          <w:rFonts w:ascii="Helvetica" w:eastAsia="Times New Roman" w:hAnsi="Helvetica" w:cs="Times New Roman"/>
-          <w:color w:val="000000" w:themeColor="text1"/>
-          <w:kern w:val="0"/>
-          <w:sz w:val="20"/>
-          <w:szCs w:val="20"/>
-          <w14:ligatures w14:val="none"/>
-        </w:rPr>
-        <w:t xml:space="preserve"> Notebook</w:t>
-      </w:r>
-      <w:r>
-        <w:rPr>
-          <w:rFonts w:ascii="Helvetica" w:eastAsia="Times New Roman" w:hAnsi="Helvetica" w:cs="Times New Roman"/>
-          <w:color w:val="000000" w:themeColor="text1"/>
-          <w:kern w:val="0"/>
-          <w:sz w:val="20"/>
-          <w:szCs w:val="20"/>
-          <w14:ligatures w14:val="none"/>
-        </w:rPr>
-        <w:br/>
-      </w:r>
-      <w:r>
-        <w:rPr>
-          <w:rFonts w:ascii="Helvetica" w:eastAsia="Times New Roman" w:hAnsi="Helvetica" w:cs="Times New Roman"/>
-          <w:b/>
-          <w:bCs/>
-          <w:color w:val="000000" w:themeColor="text1"/>
-          <w:kern w:val="0"/>
-          <w:sz w:val="20"/>
-          <w:szCs w:val="20"/>
-          <w14:ligatures w14:val="none"/>
-        </w:rPr>
-        <w:br/>
+          <w:rFonts w:ascii="Courier New" w:eastAsia="Times New Roman" w:hAnsi="Courier New" w:cs="Courier New"/>
+          <w:color w:val="000000" w:themeColor="text1"/>
+          <w:kern w:val="0"/>
+          <w:sz w:val="20"/>
+          <w:szCs w:val="20"/>
+          <w14:ligatures w14:val="none"/>
+        </w:rPr>
+      </w:pPr>
+      <w:r>
+        <w:rPr>
+          <w:rFonts w:ascii="Courier New" w:eastAsia="Times New Roman" w:hAnsi="Courier New" w:cs="Courier New"/>
+          <w:color w:val="000000" w:themeColor="text1"/>
+          <w:kern w:val="0"/>
+          <w:sz w:val="20"/>
+          <w:szCs w:val="20"/>
+          <w14:ligatures w14:val="none"/>
+        </w:rPr>
+        <w:t>- Class: UT ML/AI Certificate</w:t>
+      </w:r>
+    </w:p>
+    <w:p>
+      <w:pPr>
+        <w:spacing w:after="0" w:line="240" w:lineRule="auto"/>
+        <w:outlineLvl w:val="3"/>
+        <w:rPr>
+          <w:rFonts w:ascii="Courier New" w:eastAsia="Times New Roman" w:hAnsi="Courier New" w:cs="Courier New"/>
+          <w:color w:val="000000" w:themeColor="text1"/>
+          <w:kern w:val="0"/>
+          <w:sz w:val="20"/>
+          <w:szCs w:val="20"/>
+          <w14:ligatures w14:val="none"/>
+        </w:rPr>
+      </w:pPr>
+      <w:r>
+        <w:rPr>
+          <w:rFonts w:ascii="Courier New" w:eastAsia="Times New Roman" w:hAnsi="Courier New" w:cs="Courier New"/>
+          <w:color w:val="000000" w:themeColor="text1"/>
+          <w:kern w:val="0"/>
+          <w:sz w:val="20"/>
+          <w:szCs w:val="20"/>
+          <w14:ligatures w14:val="none"/>
+        </w:rPr>
+        <w:t>- Name: Daniel Levenstein</w:t>
+      </w:r>
+    </w:p>
+    <w:p>
+      <w:pPr>
+        <w:spacing w:after="0" w:line="240" w:lineRule="auto"/>
+        <w:outlineLvl w:val="3"/>
+        <w:rPr>
+          <w:rFonts w:ascii="Courier New" w:eastAsia="Times New Roman" w:hAnsi="Courier New" w:cs="Courier New"/>
+          <w:color w:val="000000" w:themeColor="text1"/>
+          <w:kern w:val="0"/>
+          <w:sz w:val="20"/>
+          <w:szCs w:val="20"/>
+          <w14:ligatures w14:val="none"/>
+        </w:rPr>
+      </w:pPr>
+      <w:r>
+        <w:rPr>
+          <w:rFonts w:ascii="Courier New" w:eastAsia="Times New Roman" w:hAnsi="Courier New" w:cs="Courier New"/>
+          <w:color w:val="000000" w:themeColor="text1"/>
+          <w:kern w:val="0"/>
+          <w:sz w:val="20"/>
+          <w:szCs w:val="20"/>
+          <w14:ligatures w14:val="none"/>
+        </w:rPr>
+        <w:t>- Submission Date: 8/2/2025</w:t>
       </w:r>
     </w:p>
     <w:sectPr>

</xml_diff>

<commit_message>
Updated readme and added a chart for average order cost by num_orders & customers
</commit_message>
<xml_diff>
--- a/FoodHub_Data_Analysis_Summary.docx
+++ b/FoodHub_Data_Analysis_Summary.docx
@@ -6,1555 +6,322 @@
       <w:pPr>
         <w:pStyle w:val="Heading1"/>
         <w:rPr>
-          <w:rFonts w:ascii="Courier New" w:eastAsia="Times New Roman" w:hAnsi="Courier New" w:cs="Courier New"/>
+          <w:rFonts w:ascii="Calibri" w:hAnsi="Calibri" w:cs="Calibri"/>
         </w:rPr>
       </w:pPr>
       <w:proofErr w:type="spellStart"/>
       <w:r>
         <w:rPr>
-          <w:rFonts w:ascii="Courier New" w:eastAsia="Times New Roman" w:hAnsi="Courier New" w:cs="Courier New"/>
+          <w:rFonts w:ascii="Calibri" w:eastAsia="Times New Roman" w:hAnsi="Calibri" w:cs="Calibri"/>
         </w:rPr>
         <w:t>FoodHub</w:t>
       </w:r>
       <w:proofErr w:type="spellEnd"/>
       <w:r>
         <w:rPr>
-          <w:rFonts w:ascii="Courier New" w:eastAsia="Times New Roman" w:hAnsi="Courier New" w:cs="Courier New"/>
+          <w:rFonts w:ascii="Calibri" w:eastAsia="Times New Roman" w:hAnsi="Calibri" w:cs="Calibri"/>
         </w:rPr>
         <w:t xml:space="preserve"> </w:t>
       </w:r>
       <w:r>
         <w:rPr>
-          <w:rFonts w:ascii="Courier New" w:eastAsia="Times New Roman" w:hAnsi="Courier New" w:cs="Courier New"/>
+          <w:rFonts w:ascii="Calibri" w:eastAsia="Times New Roman" w:hAnsi="Calibri" w:cs="Calibri"/>
         </w:rPr>
         <w:t xml:space="preserve">- </w:t>
       </w:r>
       <w:r>
         <w:rPr>
-          <w:rFonts w:ascii="Courier New" w:eastAsia="Times New Roman" w:hAnsi="Courier New" w:cs="Courier New"/>
-        </w:rPr>
-        <w:t>Data Analysis</w:t>
+          <w:rFonts w:ascii="Calibri" w:eastAsia="Times New Roman" w:hAnsi="Calibri" w:cs="Calibri"/>
+        </w:rPr>
+        <w:t xml:space="preserve">Data </w:t>
+      </w:r>
+      <w:r>
+        <w:rPr>
+          <w:rFonts w:ascii="Calibri" w:hAnsi="Calibri" w:cs="Calibri"/>
+        </w:rPr>
+        <w:t>Analysis</w:t>
       </w:r>
     </w:p>
     <w:p>
       <w:pPr>
         <w:pStyle w:val="Heading2"/>
         <w:rPr>
-          <w:rFonts w:ascii="Courier New" w:eastAsia="Times New Roman" w:hAnsi="Courier New" w:cs="Courier New"/>
+          <w:rFonts w:ascii="Calibri" w:hAnsi="Calibri" w:cs="Calibri"/>
         </w:rPr>
       </w:pPr>
       <w:r>
         <w:rPr>
-          <w:rFonts w:ascii="Courier New" w:eastAsia="Times New Roman" w:hAnsi="Courier New" w:cs="Courier New"/>
-        </w:rPr>
-        <w:t xml:space="preserve">Project: Python Foundations – </w:t>
+          <w:rFonts w:ascii="Calibri" w:eastAsia="Times New Roman" w:hAnsi="Calibri" w:cs="Calibri"/>
+        </w:rPr>
+        <w:t>Main Finding</w:t>
+      </w:r>
+    </w:p>
+    <w:p>
+      <w:pPr>
+        <w:rPr>
+          <w:rFonts w:ascii="Calibri" w:hAnsi="Calibri" w:cs="Calibri"/>
+        </w:rPr>
+      </w:pPr>
+      <w:r>
+        <w:rPr>
+          <w:rFonts w:ascii="Calibri" w:hAnsi="Calibri" w:cs="Calibri"/>
+        </w:rPr>
+        <w:t>In the original project a 20% discount was proposed for the top 3 customers. I later calculated the business effect of expanding that discount out to more customers using the original data.</w:t>
+      </w:r>
+    </w:p>
+    <w:p>
+      <w:pPr>
+        <w:pStyle w:val="Heading3"/>
+        <w:rPr>
+          <w:rFonts w:ascii="Calibri" w:eastAsia="Times New Roman" w:hAnsi="Calibri" w:cs="Calibri"/>
+        </w:rPr>
+      </w:pPr>
+      <w:r>
+        <w:rPr>
+          <w:rFonts w:ascii="Calibri" w:hAnsi="Calibri" w:cs="Calibri"/>
+        </w:rPr>
+        <w:t>Discount</w:t>
+      </w:r>
+      <w:r>
+        <w:rPr>
+          <w:rFonts w:ascii="Calibri" w:eastAsia="Times New Roman" w:hAnsi="Calibri" w:cs="Calibri"/>
+        </w:rPr>
+        <w:t xml:space="preserve"> Cost vs. Total Reach</w:t>
+      </w:r>
+    </w:p>
+    <w:p>
+      <w:pPr>
+        <w:rPr>
+          <w:rFonts w:ascii="Calibri" w:hAnsi="Calibri" w:cs="Calibri"/>
+        </w:rPr>
+      </w:pPr>
+      <w:r>
+        <w:rPr>
+          <w:rFonts w:ascii="Calibri" w:hAnsi="Calibri" w:cs="Calibri"/>
+        </w:rPr>
+        <w:t xml:space="preserve">In this dataset I create an aggregated dataset by </w:t>
       </w:r>
       <w:proofErr w:type="spellStart"/>
       <w:r>
         <w:rPr>
-          <w:rFonts w:ascii="Courier New" w:eastAsia="Times New Roman" w:hAnsi="Courier New" w:cs="Courier New"/>
-        </w:rPr>
-        <w:t>FoodHub</w:t>
+          <w:rFonts w:ascii="Calibri" w:hAnsi="Calibri" w:cs="Calibri"/>
+        </w:rPr>
+        <w:t>customer_id</w:t>
       </w:r>
       <w:proofErr w:type="spellEnd"/>
-    </w:p>
-    <w:p>
-      <w:pPr>
-        <w:pStyle w:val="Heading3"/>
-        <w:rPr>
-          <w:rFonts w:ascii="Courier New" w:eastAsia="Times New Roman" w:hAnsi="Courier New" w:cs="Courier New"/>
-        </w:rPr>
-      </w:pPr>
       <w:r>
         <w:rPr>
-          <w:rFonts w:ascii="Courier New" w:eastAsia="Times New Roman" w:hAnsi="Courier New" w:cs="Courier New"/>
-        </w:rPr>
-        <w:t>Context</w:t>
+          <w:rFonts w:ascii="Calibri" w:hAnsi="Calibri" w:cs="Calibri"/>
+        </w:rPr>
+        <w:t xml:space="preserve">, and </w:t>
+      </w:r>
+      <w:proofErr w:type="spellStart"/>
+      <w:r>
+        <w:rPr>
+          <w:rFonts w:ascii="Calibri" w:hAnsi="Calibri" w:cs="Calibri"/>
+        </w:rPr>
+        <w:t>order_id</w:t>
+      </w:r>
+      <w:proofErr w:type="spellEnd"/>
+      <w:r>
+        <w:rPr>
+          <w:rFonts w:ascii="Calibri" w:hAnsi="Calibri" w:cs="Calibri"/>
+        </w:rPr>
+        <w:t>, and calculate the value of the proposed discount for each order cutoff number in or dataset.</w:t>
       </w:r>
     </w:p>
     <w:p>
       <w:pPr>
-        <w:spacing w:before="240" w:after="240" w:line="240" w:lineRule="auto"/>
-        <w:rPr>
-          <w:rFonts w:ascii="Courier New" w:eastAsia="Times New Roman" w:hAnsi="Courier New" w:cs="Courier New"/>
-          <w:color w:val="000000" w:themeColor="text1"/>
-          <w:kern w:val="0"/>
-          <w:sz w:val="20"/>
-          <w:szCs w:val="20"/>
-          <w14:ligatures w14:val="none"/>
+        <w:rPr>
+          <w:rFonts w:ascii="Calibri" w:hAnsi="Calibri" w:cs="Calibri"/>
         </w:rPr>
       </w:pPr>
       <w:r>
         <w:rPr>
-          <w:rFonts w:ascii="Courier New" w:eastAsia="Times New Roman" w:hAnsi="Courier New" w:cs="Courier New"/>
-          <w:color w:val="000000" w:themeColor="text1"/>
-          <w:kern w:val="0"/>
-          <w:sz w:val="20"/>
-          <w:szCs w:val="20"/>
-          <w14:ligatures w14:val="none"/>
-        </w:rPr>
-        <w:t>The number of restaurants in New York is increasing day by day. Many students and busy professionals rely on these restaurants due to their hectic lifestyles. Online food delivery services are a great option, providing access to food from their favorite places.</w:t>
+          <w:rFonts w:ascii="Calibri" w:hAnsi="Calibri" w:cs="Calibri"/>
+          <w:noProof/>
+        </w:rPr>
+        <w:drawing>
+          <wp:inline distT="0" distB="0" distL="0" distR="0" wp14:anchorId="1B7CD188" wp14:editId="5135DCDD">
+            <wp:extent cx="5943600" cy="1981200"/>
+            <wp:effectExtent l="0" t="0" r="0" b="0"/>
+            <wp:docPr id="1651983829" name="Picture 1" descr="A screenshot of a graph&#10;&#10;AI-generated content may be incorrect."/>
+            <wp:cNvGraphicFramePr>
+              <a:graphicFrameLocks xmlns:a="http://schemas.openxmlformats.org/drawingml/2006/main" noChangeAspect="1"/>
+            </wp:cNvGraphicFramePr>
+            <a:graphic xmlns:a="http://schemas.openxmlformats.org/drawingml/2006/main">
+              <a:graphicData uri="http://schemas.openxmlformats.org/drawingml/2006/picture">
+                <pic:pic xmlns:pic="http://schemas.openxmlformats.org/drawingml/2006/picture">
+                  <pic:nvPicPr>
+                    <pic:cNvPr id="1651983829" name="Picture 1" descr="A screenshot of a graph&#10;&#10;AI-generated content may be incorrect."/>
+                    <pic:cNvPicPr/>
+                  </pic:nvPicPr>
+                  <pic:blipFill>
+                    <a:blip r:embed="rId5" cstate="print">
+                      <a:extLst>
+                        <a:ext uri="{28A0092B-C50C-407E-A947-70E740481C1C}">
+                          <a14:useLocalDpi xmlns:a14="http://schemas.microsoft.com/office/drawing/2010/main" val="0"/>
+                        </a:ext>
+                      </a:extLst>
+                    </a:blip>
+                    <a:stretch>
+                      <a:fillRect/>
+                    </a:stretch>
+                  </pic:blipFill>
+                  <pic:spPr>
+                    <a:xfrm>
+                      <a:off x="0" y="0"/>
+                      <a:ext cx="5943600" cy="1981200"/>
+                    </a:xfrm>
+                    <a:prstGeom prst="rect">
+                      <a:avLst/>
+                    </a:prstGeom>
+                  </pic:spPr>
+                </pic:pic>
+              </a:graphicData>
+            </a:graphic>
+          </wp:inline>
+        </w:drawing>
       </w:r>
     </w:p>
     <w:p>
       <w:pPr>
-        <w:spacing w:before="240" w:after="240" w:line="240" w:lineRule="auto"/>
-        <w:rPr>
-          <w:rFonts w:ascii="Courier New" w:eastAsia="Times New Roman" w:hAnsi="Courier New" w:cs="Courier New"/>
-          <w:color w:val="000000" w:themeColor="text1"/>
-          <w:kern w:val="0"/>
-          <w:sz w:val="20"/>
-          <w:szCs w:val="20"/>
-          <w14:ligatures w14:val="none"/>
-        </w:rPr>
-      </w:pPr>
+        <w:rPr>
+          <w:rFonts w:ascii="Calibri" w:hAnsi="Calibri" w:cs="Calibri"/>
+        </w:rPr>
+      </w:pPr>
+      <w:r>
+        <w:rPr>
+          <w:rFonts w:ascii="Calibri" w:hAnsi="Calibri" w:cs="Calibri"/>
+        </w:rPr>
+        <w:t>Figure shows discount cost vs total reach along with discount value per customer</w:t>
+      </w:r>
+      <w:r>
+        <w:rPr>
+          <w:rFonts w:ascii="Calibri" w:hAnsi="Calibri" w:cs="Calibri"/>
+        </w:rPr>
+        <w:t>.</w:t>
+      </w:r>
+    </w:p>
+    <w:p>
+      <w:pPr>
+        <w:pStyle w:val="Heading3"/>
+        <w:rPr>
+          <w:rFonts w:ascii="Calibri" w:hAnsi="Calibri" w:cs="Calibri"/>
+        </w:rPr>
+      </w:pPr>
+      <w:r>
+        <w:rPr>
+          <w:rFonts w:ascii="Calibri" w:hAnsi="Calibri" w:cs="Calibri"/>
+        </w:rPr>
+        <w:t>Methodology</w:t>
+      </w:r>
+    </w:p>
+    <w:p>
+      <w:pPr>
+        <w:rPr>
+          <w:rFonts w:ascii="Calibri" w:hAnsi="Calibri" w:cs="Calibri"/>
+        </w:rPr>
+      </w:pPr>
+      <w:r>
+        <w:rPr>
+          <w:rFonts w:ascii="Calibri" w:hAnsi="Calibri" w:cs="Calibri"/>
+        </w:rPr>
+        <w:t xml:space="preserve">In this project I analyzed the delivery data from a fake food delivery app called </w:t>
+      </w:r>
       <w:proofErr w:type="spellStart"/>
       <w:r>
         <w:rPr>
-          <w:rFonts w:ascii="Courier New" w:eastAsia="Times New Roman" w:hAnsi="Courier New" w:cs="Courier New"/>
-          <w:b/>
-          <w:bCs/>
-          <w:color w:val="000000" w:themeColor="text1"/>
-          <w:kern w:val="0"/>
-          <w:sz w:val="20"/>
-          <w:szCs w:val="20"/>
-          <w14:ligatures w14:val="none"/>
+          <w:rFonts w:ascii="Calibri" w:hAnsi="Calibri" w:cs="Calibri"/>
         </w:rPr>
         <w:t>FoodHub</w:t>
       </w:r>
       <w:proofErr w:type="spellEnd"/>
       <w:r>
         <w:rPr>
-          <w:rFonts w:ascii="Courier New" w:eastAsia="Times New Roman" w:hAnsi="Courier New" w:cs="Courier New"/>
-          <w:color w:val="000000" w:themeColor="text1"/>
-          <w:kern w:val="0"/>
-          <w:sz w:val="20"/>
-          <w:szCs w:val="20"/>
-          <w14:ligatures w14:val="none"/>
-        </w:rPr>
-        <w:t>, a food aggregator app, connects users with multiple restaurants through a single platform. It manages customer orders, assigns delivery personnel, and collects ratings—all while earning a margin on each order.</w:t>
+          <w:rFonts w:ascii="Calibri" w:hAnsi="Calibri" w:cs="Calibri"/>
+        </w:rPr>
+        <w:t xml:space="preserve"> and calculated cuisine performance by a restaurant type and rating.</w:t>
       </w:r>
     </w:p>
     <w:p>
       <w:pPr>
-        <w:spacing w:before="300" w:after="300" w:line="240" w:lineRule="auto"/>
-        <w:rPr>
-          <w:rFonts w:ascii="Courier New" w:eastAsia="Times New Roman" w:hAnsi="Courier New" w:cs="Courier New"/>
-          <w:color w:val="000000" w:themeColor="text1"/>
-          <w:kern w:val="0"/>
-          <w:sz w:val="20"/>
-          <w:szCs w:val="20"/>
-          <w14:ligatures w14:val="none"/>
+        <w:rPr>
+          <w:rFonts w:ascii="Calibri" w:hAnsi="Calibri" w:cs="Calibri"/>
         </w:rPr>
       </w:pPr>
       <w:r>
         <w:rPr>
-          <w:rFonts w:ascii="Courier New" w:eastAsia="Times New Roman" w:hAnsi="Courier New" w:cs="Courier New"/>
-          <w:noProof/>
-          <w:color w:val="000000" w:themeColor="text1"/>
-          <w:kern w:val="0"/>
-        </w:rPr>
-        <w:pict w14:anchorId="7EA91596">
-          <v:rect id="_x0000_i1026" alt="" style="width:468pt;height:.05pt;mso-width-percent:0;mso-height-percent:0;mso-width-percent:0;mso-height-percent:0" o:hralign="center" o:hrstd="t" o:hrnoshade="t" o:hr="t" fillcolor="#bcbec4" stroked="f"/>
-        </w:pict>
+          <w:rFonts w:ascii="Calibri" w:hAnsi="Calibri" w:cs="Calibri"/>
+        </w:rPr>
+        <w:t>This project was originally part of a UT school project, but the Discount Coast vs. Total Reach section was added more recently.</w:t>
       </w:r>
     </w:p>
     <w:p>
       <w:pPr>
         <w:pStyle w:val="Heading3"/>
         <w:rPr>
-          <w:rFonts w:ascii="Courier New" w:eastAsia="Times New Roman" w:hAnsi="Courier New" w:cs="Courier New"/>
+          <w:rFonts w:ascii="Calibri" w:hAnsi="Calibri" w:cs="Calibri"/>
         </w:rPr>
       </w:pPr>
       <w:r>
         <w:rPr>
-          <w:rFonts w:ascii="Courier New" w:eastAsia="Times New Roman" w:hAnsi="Courier New" w:cs="Courier New"/>
-        </w:rPr>
-        <w:t>Objective</w:t>
+          <w:rFonts w:ascii="Calibri" w:hAnsi="Calibri" w:cs="Calibri"/>
+        </w:rPr>
+        <w:t>Data Cleaning</w:t>
       </w:r>
     </w:p>
     <w:p>
       <w:pPr>
-        <w:spacing w:before="240" w:after="240" w:line="240" w:lineRule="auto"/>
-        <w:rPr>
-          <w:rFonts w:ascii="Courier New" w:eastAsia="Times New Roman" w:hAnsi="Courier New" w:cs="Courier New"/>
-          <w:color w:val="000000" w:themeColor="text1"/>
-          <w:kern w:val="0"/>
-          <w:sz w:val="20"/>
-          <w:szCs w:val="20"/>
-          <w14:ligatures w14:val="none"/>
+        <w:rPr>
+          <w:rFonts w:ascii="Calibri" w:hAnsi="Calibri" w:cs="Calibri"/>
         </w:rPr>
       </w:pPr>
       <w:r>
         <w:rPr>
-          <w:rFonts w:ascii="Courier New" w:eastAsia="Times New Roman" w:hAnsi="Courier New" w:cs="Courier New"/>
-          <w:color w:val="000000" w:themeColor="text1"/>
-          <w:kern w:val="0"/>
-          <w:sz w:val="20"/>
-          <w:szCs w:val="20"/>
-          <w14:ligatures w14:val="none"/>
-        </w:rPr>
-        <w:t xml:space="preserve">You’ve been hired as a Data Scientist at </w:t>
-      </w:r>
-      <w:proofErr w:type="spellStart"/>
-      <w:r>
-        <w:rPr>
-          <w:rFonts w:ascii="Courier New" w:eastAsia="Times New Roman" w:hAnsi="Courier New" w:cs="Courier New"/>
-          <w:color w:val="000000" w:themeColor="text1"/>
-          <w:kern w:val="0"/>
-          <w:sz w:val="20"/>
-          <w:szCs w:val="20"/>
-          <w14:ligatures w14:val="none"/>
-        </w:rPr>
-        <w:t>FoodHub</w:t>
-      </w:r>
-      <w:proofErr w:type="spellEnd"/>
-      <w:r>
-        <w:rPr>
-          <w:rFonts w:ascii="Courier New" w:eastAsia="Times New Roman" w:hAnsi="Courier New" w:cs="Courier New"/>
-          <w:color w:val="000000" w:themeColor="text1"/>
-          <w:kern w:val="0"/>
-          <w:sz w:val="20"/>
-          <w:szCs w:val="20"/>
-          <w14:ligatures w14:val="none"/>
-        </w:rPr>
-        <w:t>. Your task: analyze customer order data to answer key business questions. The goal is to uncover trends that can help improve customer satisfaction and business performance.</w:t>
+          <w:rFonts w:ascii="Calibri" w:hAnsi="Calibri" w:cs="Calibri"/>
+        </w:rPr>
+        <w:t>The input data for this project had over 700 entries without ratings. For this dataset I have populated those table rows with the mean rating for the whole dataset, which is 4.</w:t>
       </w:r>
     </w:p>
     <w:p>
       <w:pPr>
-        <w:spacing w:before="300" w:after="300" w:line="240" w:lineRule="auto"/>
-        <w:rPr>
-          <w:rFonts w:ascii="Courier New" w:eastAsia="Times New Roman" w:hAnsi="Courier New" w:cs="Courier New"/>
-          <w:color w:val="000000" w:themeColor="text1"/>
-          <w:kern w:val="0"/>
-          <w:sz w:val="20"/>
-          <w:szCs w:val="20"/>
-          <w14:ligatures w14:val="none"/>
+        <w:rPr>
+          <w:rFonts w:ascii="Calibri" w:hAnsi="Calibri" w:cs="Calibri"/>
         </w:rPr>
       </w:pPr>
       <w:r>
         <w:rPr>
-          <w:rFonts w:ascii="Courier New" w:eastAsia="Times New Roman" w:hAnsi="Courier New" w:cs="Courier New"/>
-          <w:noProof/>
-          <w:color w:val="000000" w:themeColor="text1"/>
-          <w:kern w:val="0"/>
-        </w:rPr>
-        <w:pict w14:anchorId="37AE169A">
-          <v:rect id="_x0000_i1025" alt="" style="width:468pt;height:.05pt;mso-width-percent:0;mso-height-percent:0;mso-width-percent:0;mso-height-percent:0" o:hralign="center" o:hrstd="t" o:hrnoshade="t" o:hr="t" fillcolor="#bcbec4" stroked="f"/>
-        </w:pict>
+          <w:rFonts w:ascii="Calibri" w:hAnsi="Calibri" w:cs="Calibri"/>
+        </w:rPr>
+        <w:t>I also maintained a separate data set with only the entries in the original dataset with rating so that I can check my findings with that dataset if needed.</w:t>
       </w:r>
     </w:p>
     <w:p>
       <w:pPr>
         <w:pStyle w:val="Heading3"/>
         <w:rPr>
-          <w:rFonts w:ascii="Courier New" w:eastAsia="Times New Roman" w:hAnsi="Courier New" w:cs="Courier New"/>
+          <w:rFonts w:ascii="Calibri" w:hAnsi="Calibri" w:cs="Calibri"/>
         </w:rPr>
       </w:pPr>
       <w:r>
         <w:rPr>
-          <w:rFonts w:ascii="Courier New" w:eastAsia="Times New Roman" w:hAnsi="Courier New" w:cs="Courier New"/>
-        </w:rPr>
-        <w:t>Dataset Description</w:t>
-      </w:r>
-    </w:p>
-    <w:p>
-      <w:pPr>
-        <w:spacing w:before="240" w:after="240" w:line="240" w:lineRule="auto"/>
-        <w:rPr>
-          <w:rFonts w:ascii="Courier New" w:eastAsia="Times New Roman" w:hAnsi="Courier New" w:cs="Courier New"/>
-          <w:color w:val="000000" w:themeColor="text1"/>
-          <w:kern w:val="0"/>
-          <w:sz w:val="20"/>
-          <w:szCs w:val="20"/>
-          <w14:ligatures w14:val="none"/>
-        </w:rPr>
-      </w:pPr>
-      <w:r>
-        <w:rPr>
-          <w:rFonts w:ascii="Courier New" w:eastAsia="Times New Roman" w:hAnsi="Courier New" w:cs="Courier New"/>
-          <w:color w:val="000000" w:themeColor="text1"/>
-          <w:kern w:val="0"/>
-          <w:sz w:val="20"/>
-          <w:szCs w:val="20"/>
-          <w14:ligatures w14:val="none"/>
-        </w:rPr>
-        <w:t>The dataset records various attributes of food orders, including customer ratings, preparation and delivery times, and cuisine types.</w:t>
-      </w:r>
-    </w:p>
-    <w:p>
-      <w:pPr>
-        <w:pStyle w:val="Heading3"/>
-        <w:rPr>
-          <w:rFonts w:ascii="Courier New" w:eastAsia="Times New Roman" w:hAnsi="Courier New" w:cs="Courier New"/>
-        </w:rPr>
-      </w:pPr>
-      <w:r>
-        <w:rPr>
-          <w:rFonts w:ascii="Courier New" w:eastAsia="Times New Roman" w:hAnsi="Courier New" w:cs="Courier New"/>
-        </w:rPr>
-        <w:t>Key Findings</w:t>
-      </w:r>
-    </w:p>
-    <w:p>
-      <w:pPr>
-        <w:spacing w:before="240" w:after="240" w:line="240" w:lineRule="auto"/>
-        <w:outlineLvl w:val="3"/>
-        <w:rPr>
-          <w:rFonts w:ascii="Courier New" w:eastAsia="Times New Roman" w:hAnsi="Courier New" w:cs="Courier New"/>
-          <w:b/>
-          <w:bCs/>
-          <w:color w:val="000000" w:themeColor="text1"/>
-          <w:kern w:val="0"/>
-          <w:sz w:val="20"/>
-          <w:szCs w:val="20"/>
-          <w14:ligatures w14:val="none"/>
-        </w:rPr>
-      </w:pPr>
-      <w:r>
-        <w:rPr>
-          <w:rFonts w:ascii="Courier New" w:eastAsia="Times New Roman" w:hAnsi="Courier New" w:cs="Courier New"/>
-          <w:b/>
-          <w:bCs/>
-          <w:color w:val="000000" w:themeColor="text1"/>
-          <w:kern w:val="0"/>
-          <w:sz w:val="20"/>
-          <w:szCs w:val="20"/>
-          <w14:ligatures w14:val="none"/>
-        </w:rPr>
-        <w:t>Cuisine Performance</w:t>
-      </w:r>
-    </w:p>
-    <w:p>
-      <w:pPr>
-        <w:numPr>
-          <w:ilvl w:val="0"/>
-          <w:numId w:val="2"/>
-        </w:numPr>
-        <w:spacing w:before="100" w:beforeAutospacing="1" w:after="100" w:afterAutospacing="1" w:line="240" w:lineRule="auto"/>
-        <w:rPr>
-          <w:rFonts w:ascii="Courier New" w:eastAsia="Times New Roman" w:hAnsi="Courier New" w:cs="Courier New"/>
-          <w:color w:val="000000" w:themeColor="text1"/>
-          <w:kern w:val="0"/>
-          <w:sz w:val="20"/>
-          <w:szCs w:val="20"/>
-          <w14:ligatures w14:val="none"/>
-        </w:rPr>
-      </w:pPr>
-      <w:r>
-        <w:rPr>
-          <w:rFonts w:ascii="Courier New" w:eastAsia="Times New Roman" w:hAnsi="Courier New" w:cs="Courier New"/>
-          <w:color w:val="000000" w:themeColor="text1"/>
-          <w:kern w:val="0"/>
-          <w:sz w:val="20"/>
-          <w:szCs w:val="20"/>
-          <w14:ligatures w14:val="none"/>
-        </w:rPr>
-        <w:t>Strong correlation between cuisine type and customer ratings</w:t>
-      </w:r>
-    </w:p>
-    <w:p>
-      <w:pPr>
-        <w:numPr>
-          <w:ilvl w:val="0"/>
-          <w:numId w:val="2"/>
-        </w:numPr>
-        <w:spacing w:before="100" w:beforeAutospacing="1" w:after="100" w:afterAutospacing="1" w:line="240" w:lineRule="auto"/>
-        <w:rPr>
-          <w:rFonts w:ascii="Courier New" w:eastAsia="Times New Roman" w:hAnsi="Courier New" w:cs="Courier New"/>
-          <w:color w:val="000000" w:themeColor="text1"/>
-          <w:kern w:val="0"/>
-          <w:sz w:val="20"/>
-          <w:szCs w:val="20"/>
-          <w14:ligatures w14:val="none"/>
-        </w:rPr>
-      </w:pPr>
-      <w:r>
-        <w:rPr>
-          <w:rFonts w:ascii="Courier New" w:eastAsia="Times New Roman" w:hAnsi="Courier New" w:cs="Courier New"/>
-          <w:color w:val="000000" w:themeColor="text1"/>
-          <w:kern w:val="0"/>
-          <w:sz w:val="20"/>
-          <w:szCs w:val="20"/>
-          <w14:ligatures w14:val="none"/>
-        </w:rPr>
-        <w:t>Top-rated cuisines: </w:t>
-      </w:r>
-      <w:r>
-        <w:rPr>
-          <w:rFonts w:ascii="Courier New" w:eastAsia="Times New Roman" w:hAnsi="Courier New" w:cs="Courier New"/>
-          <w:b/>
-          <w:bCs/>
-          <w:color w:val="000000" w:themeColor="text1"/>
-          <w:kern w:val="0"/>
-          <w:sz w:val="20"/>
-          <w:szCs w:val="20"/>
-          <w14:ligatures w14:val="none"/>
-        </w:rPr>
-        <w:t>Indian</w:t>
-      </w:r>
-      <w:r>
-        <w:rPr>
-          <w:rFonts w:ascii="Courier New" w:eastAsia="Times New Roman" w:hAnsi="Courier New" w:cs="Courier New"/>
-          <w:color w:val="000000" w:themeColor="text1"/>
-          <w:kern w:val="0"/>
-          <w:sz w:val="20"/>
-          <w:szCs w:val="20"/>
-          <w14:ligatures w14:val="none"/>
-        </w:rPr>
-        <w:t>, </w:t>
-      </w:r>
-      <w:r>
-        <w:rPr>
-          <w:rFonts w:ascii="Courier New" w:eastAsia="Times New Roman" w:hAnsi="Courier New" w:cs="Courier New"/>
-          <w:b/>
-          <w:bCs/>
-          <w:color w:val="000000" w:themeColor="text1"/>
-          <w:kern w:val="0"/>
-          <w:sz w:val="20"/>
-          <w:szCs w:val="20"/>
-          <w14:ligatures w14:val="none"/>
-        </w:rPr>
-        <w:t>Mexican</w:t>
-      </w:r>
-      <w:r>
-        <w:rPr>
-          <w:rFonts w:ascii="Courier New" w:eastAsia="Times New Roman" w:hAnsi="Courier New" w:cs="Courier New"/>
-          <w:color w:val="000000" w:themeColor="text1"/>
-          <w:kern w:val="0"/>
-          <w:sz w:val="20"/>
-          <w:szCs w:val="20"/>
-          <w14:ligatures w14:val="none"/>
-        </w:rPr>
-        <w:t>, </w:t>
-      </w:r>
-      <w:r>
-        <w:rPr>
-          <w:rFonts w:ascii="Courier New" w:eastAsia="Times New Roman" w:hAnsi="Courier New" w:cs="Courier New"/>
-          <w:b/>
-          <w:bCs/>
-          <w:color w:val="000000" w:themeColor="text1"/>
-          <w:kern w:val="0"/>
-          <w:sz w:val="20"/>
-          <w:szCs w:val="20"/>
-          <w14:ligatures w14:val="none"/>
-        </w:rPr>
-        <w:t>Japanese</w:t>
-      </w:r>
-      <w:r>
-        <w:rPr>
-          <w:rFonts w:ascii="Courier New" w:eastAsia="Times New Roman" w:hAnsi="Courier New" w:cs="Courier New"/>
-          <w:color w:val="000000" w:themeColor="text1"/>
-          <w:kern w:val="0"/>
-          <w:sz w:val="20"/>
-          <w:szCs w:val="20"/>
-          <w14:ligatures w14:val="none"/>
-        </w:rPr>
-        <w:t>, </w:t>
-      </w:r>
-      <w:r>
-        <w:rPr>
-          <w:rFonts w:ascii="Courier New" w:eastAsia="Times New Roman" w:hAnsi="Courier New" w:cs="Courier New"/>
-          <w:b/>
-          <w:bCs/>
-          <w:color w:val="000000" w:themeColor="text1"/>
-          <w:kern w:val="0"/>
-          <w:sz w:val="20"/>
-          <w:szCs w:val="20"/>
-          <w14:ligatures w14:val="none"/>
-        </w:rPr>
-        <w:t>Italian</w:t>
-      </w:r>
-      <w:r>
-        <w:rPr>
-          <w:rFonts w:ascii="Courier New" w:eastAsia="Times New Roman" w:hAnsi="Courier New" w:cs="Courier New"/>
-          <w:color w:val="000000" w:themeColor="text1"/>
-          <w:kern w:val="0"/>
-          <w:sz w:val="20"/>
-          <w:szCs w:val="20"/>
-          <w14:ligatures w14:val="none"/>
-        </w:rPr>
-        <w:t>, </w:t>
-      </w:r>
-      <w:r>
-        <w:rPr>
-          <w:rFonts w:ascii="Courier New" w:eastAsia="Times New Roman" w:hAnsi="Courier New" w:cs="Courier New"/>
-          <w:b/>
-          <w:bCs/>
-          <w:color w:val="000000" w:themeColor="text1"/>
-          <w:kern w:val="0"/>
-          <w:sz w:val="20"/>
-          <w:szCs w:val="20"/>
-          <w14:ligatures w14:val="none"/>
-        </w:rPr>
-        <w:t>Chinese</w:t>
-      </w:r>
-    </w:p>
-    <w:p>
-      <w:pPr>
-        <w:spacing w:before="240" w:after="240" w:line="240" w:lineRule="auto"/>
-        <w:outlineLvl w:val="3"/>
-        <w:rPr>
-          <w:rFonts w:ascii="Courier New" w:eastAsia="Times New Roman" w:hAnsi="Courier New" w:cs="Courier New"/>
-          <w:b/>
-          <w:bCs/>
-          <w:color w:val="000000" w:themeColor="text1"/>
-          <w:kern w:val="0"/>
-          <w:sz w:val="20"/>
-          <w:szCs w:val="20"/>
-          <w14:ligatures w14:val="none"/>
-        </w:rPr>
-      </w:pPr>
-      <w:r>
-        <w:rPr>
-          <w:rFonts w:ascii="Courier New" w:eastAsia="Times New Roman" w:hAnsi="Courier New" w:cs="Courier New"/>
-          <w:b/>
-          <w:bCs/>
-          <w:color w:val="000000" w:themeColor="text1"/>
-          <w:kern w:val="0"/>
-          <w:sz w:val="20"/>
-          <w:szCs w:val="20"/>
-          <w14:ligatures w14:val="none"/>
-        </w:rPr>
-        <w:t>Delivery Insights</w:t>
-      </w:r>
-    </w:p>
-    <w:p>
-      <w:pPr>
-        <w:numPr>
-          <w:ilvl w:val="0"/>
-          <w:numId w:val="3"/>
-        </w:numPr>
-        <w:spacing w:before="100" w:beforeAutospacing="1" w:after="100" w:afterAutospacing="1" w:line="240" w:lineRule="auto"/>
-        <w:rPr>
-          <w:rFonts w:ascii="Courier New" w:eastAsia="Times New Roman" w:hAnsi="Courier New" w:cs="Courier New"/>
-          <w:color w:val="000000" w:themeColor="text1"/>
-          <w:kern w:val="0"/>
-          <w:sz w:val="20"/>
-          <w:szCs w:val="20"/>
-          <w14:ligatures w14:val="none"/>
-        </w:rPr>
-      </w:pPr>
-      <w:r>
-        <w:rPr>
-          <w:rFonts w:ascii="Courier New" w:eastAsia="Times New Roman" w:hAnsi="Courier New" w:cs="Courier New"/>
-          <w:color w:val="000000" w:themeColor="text1"/>
-          <w:kern w:val="0"/>
-          <w:sz w:val="20"/>
-          <w:szCs w:val="20"/>
-          <w14:ligatures w14:val="none"/>
-        </w:rPr>
-        <w:t>Orders with delivery times over 60 minutes still maintained a high average rating of </w:t>
-      </w:r>
-      <w:r>
-        <w:rPr>
-          <w:rFonts w:ascii="Courier New" w:eastAsia="Times New Roman" w:hAnsi="Courier New" w:cs="Courier New"/>
-          <w:b/>
-          <w:bCs/>
-          <w:color w:val="000000" w:themeColor="text1"/>
-          <w:kern w:val="0"/>
-          <w:sz w:val="20"/>
-          <w:szCs w:val="20"/>
-          <w14:ligatures w14:val="none"/>
-        </w:rPr>
-        <w:t>4.21</w:t>
-      </w:r>
-    </w:p>
-    <w:p>
-      <w:pPr>
-        <w:numPr>
-          <w:ilvl w:val="0"/>
-          <w:numId w:val="3"/>
-        </w:numPr>
-        <w:spacing w:before="100" w:beforeAutospacing="1" w:after="100" w:afterAutospacing="1" w:line="240" w:lineRule="auto"/>
-        <w:rPr>
-          <w:rFonts w:ascii="Courier New" w:eastAsia="Times New Roman" w:hAnsi="Courier New" w:cs="Courier New"/>
-          <w:color w:val="000000" w:themeColor="text1"/>
-          <w:kern w:val="0"/>
-          <w:sz w:val="20"/>
-          <w:szCs w:val="20"/>
-          <w14:ligatures w14:val="none"/>
-        </w:rPr>
-      </w:pPr>
-      <w:r>
-        <w:rPr>
-          <w:rFonts w:ascii="Courier New" w:eastAsia="Times New Roman" w:hAnsi="Courier New" w:cs="Courier New"/>
-          <w:b/>
-          <w:bCs/>
-          <w:color w:val="000000" w:themeColor="text1"/>
-          <w:kern w:val="0"/>
-          <w:sz w:val="20"/>
-          <w:szCs w:val="20"/>
-          <w14:ligatures w14:val="none"/>
-        </w:rPr>
-        <w:t>Weekends</w:t>
-      </w:r>
-      <w:r>
-        <w:rPr>
-          <w:rFonts w:ascii="Courier New" w:eastAsia="Times New Roman" w:hAnsi="Courier New" w:cs="Courier New"/>
-          <w:color w:val="000000" w:themeColor="text1"/>
-          <w:kern w:val="0"/>
-          <w:sz w:val="20"/>
-          <w:szCs w:val="20"/>
-          <w14:ligatures w14:val="none"/>
-        </w:rPr>
-        <w:t> saw faster delivery times compared to weeknights</w:t>
-      </w:r>
-    </w:p>
-    <w:p>
-      <w:pPr>
-        <w:spacing w:before="240" w:after="240" w:line="240" w:lineRule="auto"/>
-        <w:outlineLvl w:val="3"/>
-        <w:rPr>
-          <w:rFonts w:ascii="Courier New" w:eastAsia="Times New Roman" w:hAnsi="Courier New" w:cs="Courier New"/>
-          <w:b/>
-          <w:bCs/>
-          <w:color w:val="000000" w:themeColor="text1"/>
-          <w:kern w:val="0"/>
-          <w:sz w:val="20"/>
-          <w:szCs w:val="20"/>
-          <w14:ligatures w14:val="none"/>
-        </w:rPr>
-      </w:pPr>
-      <w:r>
-        <w:rPr>
-          <w:rFonts w:ascii="Courier New" w:eastAsia="Times New Roman" w:hAnsi="Courier New" w:cs="Courier New"/>
-          <w:b/>
-          <w:bCs/>
-          <w:color w:val="000000" w:themeColor="text1"/>
-          <w:kern w:val="0"/>
-          <w:sz w:val="20"/>
-          <w:szCs w:val="20"/>
-          <w14:ligatures w14:val="none"/>
-        </w:rPr>
-        <w:t>Revenue</w:t>
-      </w:r>
-    </w:p>
-    <w:p>
-      <w:pPr>
-        <w:numPr>
-          <w:ilvl w:val="0"/>
-          <w:numId w:val="4"/>
-        </w:numPr>
-        <w:spacing w:before="100" w:beforeAutospacing="1" w:after="100" w:afterAutospacing="1" w:line="240" w:lineRule="auto"/>
-        <w:rPr>
-          <w:rFonts w:ascii="Courier New" w:eastAsia="Times New Roman" w:hAnsi="Courier New" w:cs="Courier New"/>
-          <w:color w:val="000000" w:themeColor="text1"/>
-          <w:kern w:val="0"/>
-          <w:sz w:val="20"/>
-          <w:szCs w:val="20"/>
-          <w14:ligatures w14:val="none"/>
-        </w:rPr>
-      </w:pPr>
-      <w:r>
-        <w:rPr>
-          <w:rFonts w:ascii="Courier New" w:eastAsia="Times New Roman" w:hAnsi="Courier New" w:cs="Courier New"/>
-          <w:color w:val="000000" w:themeColor="text1"/>
-          <w:kern w:val="0"/>
-          <w:sz w:val="20"/>
-          <w:szCs w:val="20"/>
-          <w14:ligatures w14:val="none"/>
-        </w:rPr>
-        <w:t>Average revenue per order: </w:t>
-      </w:r>
-      <w:r>
-        <w:rPr>
-          <w:rFonts w:ascii="Courier New" w:eastAsia="Times New Roman" w:hAnsi="Courier New" w:cs="Courier New"/>
-          <w:b/>
-          <w:bCs/>
-          <w:color w:val="000000" w:themeColor="text1"/>
-          <w:kern w:val="0"/>
-          <w:sz w:val="20"/>
-          <w:szCs w:val="20"/>
-          <w14:ligatures w14:val="none"/>
-        </w:rPr>
-        <w:t>$3.25</w:t>
-      </w:r>
-    </w:p>
-    <w:p>
-      <w:pPr>
-        <w:pStyle w:val="Heading3"/>
-        <w:rPr>
-          <w:rFonts w:ascii="Courier New" w:eastAsia="Times New Roman" w:hAnsi="Courier New" w:cs="Courier New"/>
-        </w:rPr>
-      </w:pPr>
-      <w:r>
-        <w:rPr>
-          <w:rFonts w:ascii="Courier New" w:eastAsia="Times New Roman" w:hAnsi="Courier New" w:cs="Courier New"/>
-        </w:rPr>
-        <w:lastRenderedPageBreak/>
+          <w:rFonts w:ascii="Calibri" w:hAnsi="Calibri" w:cs="Calibri"/>
+        </w:rPr>
         <w:t>Recommendations</w:t>
       </w:r>
     </w:p>
     <w:p>
       <w:pPr>
-        <w:numPr>
-          <w:ilvl w:val="0"/>
-          <w:numId w:val="5"/>
-        </w:numPr>
-        <w:spacing w:before="100" w:beforeAutospacing="1" w:after="100" w:afterAutospacing="1" w:line="240" w:lineRule="auto"/>
-        <w:rPr>
-          <w:rFonts w:ascii="Courier New" w:eastAsia="Times New Roman" w:hAnsi="Courier New" w:cs="Courier New"/>
-          <w:color w:val="000000" w:themeColor="text1"/>
-          <w:kern w:val="0"/>
-          <w:sz w:val="20"/>
-          <w:szCs w:val="20"/>
-          <w14:ligatures w14:val="none"/>
+        <w:rPr>
+          <w:rFonts w:ascii="Calibri" w:hAnsi="Calibri" w:cs="Calibri"/>
         </w:rPr>
       </w:pPr>
       <w:r>
         <w:rPr>
-          <w:rFonts w:ascii="Courier New" w:eastAsia="Times New Roman" w:hAnsi="Courier New" w:cs="Courier New"/>
-          <w:b/>
-          <w:bCs/>
-          <w:color w:val="000000" w:themeColor="text1"/>
-          <w:kern w:val="0"/>
-          <w:sz w:val="20"/>
-          <w:szCs w:val="20"/>
-          <w14:ligatures w14:val="none"/>
-        </w:rPr>
-        <w:t>Improve Search</w:t>
-      </w:r>
-      <w:r>
-        <w:rPr>
-          <w:rFonts w:ascii="Courier New" w:eastAsia="Times New Roman" w:hAnsi="Courier New" w:cs="Courier New"/>
-          <w:color w:val="000000" w:themeColor="text1"/>
-          <w:kern w:val="0"/>
-          <w:sz w:val="20"/>
-          <w:szCs w:val="20"/>
-          <w14:ligatures w14:val="none"/>
-        </w:rPr>
-        <w:t>: Make it easy for users to filter by price and cuisine type.</w:t>
-      </w:r>
-    </w:p>
-    <w:p>
-      <w:pPr>
-        <w:numPr>
-          <w:ilvl w:val="0"/>
-          <w:numId w:val="5"/>
-        </w:numPr>
-        <w:spacing w:before="100" w:beforeAutospacing="1" w:after="100" w:afterAutospacing="1" w:line="240" w:lineRule="auto"/>
-        <w:rPr>
-          <w:rFonts w:ascii="Courier New" w:eastAsia="Times New Roman" w:hAnsi="Courier New" w:cs="Courier New"/>
-          <w:color w:val="000000" w:themeColor="text1"/>
-          <w:kern w:val="0"/>
-          <w:sz w:val="20"/>
-          <w:szCs w:val="20"/>
-          <w14:ligatures w14:val="none"/>
-        </w:rPr>
-      </w:pPr>
-      <w:r>
-        <w:rPr>
-          <w:rFonts w:ascii="Courier New" w:eastAsia="Times New Roman" w:hAnsi="Courier New" w:cs="Courier New"/>
-          <w:b/>
-          <w:bCs/>
-          <w:color w:val="000000" w:themeColor="text1"/>
-          <w:kern w:val="0"/>
-          <w:sz w:val="20"/>
-          <w:szCs w:val="20"/>
-          <w14:ligatures w14:val="none"/>
-        </w:rPr>
-        <w:t>Cuisine of the Week</w:t>
-      </w:r>
-      <w:r>
-        <w:rPr>
-          <w:rFonts w:ascii="Courier New" w:eastAsia="Times New Roman" w:hAnsi="Courier New" w:cs="Courier New"/>
-          <w:color w:val="000000" w:themeColor="text1"/>
-          <w:kern w:val="0"/>
-          <w:sz w:val="20"/>
-          <w:szCs w:val="20"/>
-          <w14:ligatures w14:val="none"/>
-        </w:rPr>
-        <w:t>: Feature top cuisines weekly with discounts to drive engagement.</w:t>
-      </w:r>
-    </w:p>
-    <w:p>
-      <w:pPr>
-        <w:numPr>
-          <w:ilvl w:val="0"/>
-          <w:numId w:val="5"/>
-        </w:numPr>
-        <w:spacing w:before="100" w:beforeAutospacing="1" w:after="100" w:afterAutospacing="1" w:line="240" w:lineRule="auto"/>
-        <w:rPr>
-          <w:rFonts w:ascii="Courier New" w:eastAsia="Times New Roman" w:hAnsi="Courier New" w:cs="Courier New"/>
-          <w:color w:val="000000" w:themeColor="text1"/>
-          <w:kern w:val="0"/>
-          <w:sz w:val="20"/>
-          <w:szCs w:val="20"/>
-          <w14:ligatures w14:val="none"/>
-        </w:rPr>
-      </w:pPr>
-      <w:r>
-        <w:rPr>
-          <w:rFonts w:ascii="Courier New" w:eastAsia="Times New Roman" w:hAnsi="Courier New" w:cs="Courier New"/>
-          <w:b/>
-          <w:bCs/>
-          <w:color w:val="000000" w:themeColor="text1"/>
-          <w:kern w:val="0"/>
-          <w:sz w:val="20"/>
-          <w:szCs w:val="20"/>
-          <w14:ligatures w14:val="none"/>
-        </w:rPr>
-        <w:t>Targeted Promotions</w:t>
-      </w:r>
-      <w:r>
-        <w:rPr>
-          <w:rFonts w:ascii="Courier New" w:eastAsia="Times New Roman" w:hAnsi="Courier New" w:cs="Courier New"/>
-          <w:color w:val="000000" w:themeColor="text1"/>
-          <w:kern w:val="0"/>
-          <w:sz w:val="20"/>
-          <w:szCs w:val="20"/>
-          <w14:ligatures w14:val="none"/>
-        </w:rPr>
-        <w:t>: Run special offers for highly rated restaurants like:</w:t>
-      </w:r>
-    </w:p>
-    <w:p>
-      <w:pPr>
-        <w:numPr>
-          <w:ilvl w:val="1"/>
-          <w:numId w:val="5"/>
-        </w:numPr>
-        <w:spacing w:before="100" w:beforeAutospacing="1" w:after="100" w:afterAutospacing="1" w:line="240" w:lineRule="auto"/>
-        <w:rPr>
-          <w:rFonts w:ascii="Courier New" w:eastAsia="Times New Roman" w:hAnsi="Courier New" w:cs="Courier New"/>
-          <w:color w:val="000000" w:themeColor="text1"/>
-          <w:kern w:val="0"/>
-          <w:sz w:val="20"/>
-          <w:szCs w:val="20"/>
-          <w14:ligatures w14:val="none"/>
-        </w:rPr>
-      </w:pPr>
-      <w:r>
-        <w:rPr>
-          <w:rFonts w:ascii="Courier New" w:eastAsia="Times New Roman" w:hAnsi="Courier New" w:cs="Courier New"/>
-          <w:color w:val="000000" w:themeColor="text1"/>
-          <w:kern w:val="0"/>
-          <w:sz w:val="20"/>
-          <w:szCs w:val="20"/>
-          <w14:ligatures w14:val="none"/>
-        </w:rPr>
-        <w:t>The Meatball Shop </w:t>
-      </w:r>
-      <w:r>
-        <w:rPr>
-          <w:rFonts w:ascii="Courier New" w:eastAsia="Times New Roman" w:hAnsi="Courier New" w:cs="Courier New"/>
-          <w:i/>
-          <w:iCs/>
-          <w:color w:val="000000" w:themeColor="text1"/>
-          <w:kern w:val="0"/>
-          <w:sz w:val="20"/>
-          <w:szCs w:val="20"/>
-          <w14:ligatures w14:val="none"/>
-        </w:rPr>
-        <w:t>(Italian)</w:t>
-      </w:r>
-    </w:p>
-    <w:p>
-      <w:pPr>
-        <w:numPr>
-          <w:ilvl w:val="1"/>
-          <w:numId w:val="5"/>
-        </w:numPr>
-        <w:spacing w:before="100" w:beforeAutospacing="1" w:after="100" w:afterAutospacing="1" w:line="240" w:lineRule="auto"/>
-        <w:rPr>
-          <w:rFonts w:ascii="Courier New" w:eastAsia="Times New Roman" w:hAnsi="Courier New" w:cs="Courier New"/>
-          <w:color w:val="000000" w:themeColor="text1"/>
-          <w:kern w:val="0"/>
-          <w:sz w:val="20"/>
-          <w:szCs w:val="20"/>
-          <w14:ligatures w14:val="none"/>
-        </w:rPr>
-      </w:pPr>
-      <w:r>
-        <w:rPr>
-          <w:rFonts w:ascii="Courier New" w:eastAsia="Times New Roman" w:hAnsi="Courier New" w:cs="Courier New"/>
-          <w:color w:val="000000" w:themeColor="text1"/>
-          <w:kern w:val="0"/>
-          <w:sz w:val="20"/>
-          <w:szCs w:val="20"/>
-          <w14:ligatures w14:val="none"/>
-        </w:rPr>
-        <w:t>Blue Ribbon Fried Chicken </w:t>
-      </w:r>
-      <w:r>
-        <w:rPr>
-          <w:rFonts w:ascii="Courier New" w:eastAsia="Times New Roman" w:hAnsi="Courier New" w:cs="Courier New"/>
-          <w:i/>
-          <w:iCs/>
-          <w:color w:val="000000" w:themeColor="text1"/>
-          <w:kern w:val="0"/>
-          <w:sz w:val="20"/>
-          <w:szCs w:val="20"/>
-          <w14:ligatures w14:val="none"/>
-        </w:rPr>
-        <w:t>(American)</w:t>
-      </w:r>
-    </w:p>
-    <w:p>
-      <w:pPr>
-        <w:numPr>
-          <w:ilvl w:val="1"/>
-          <w:numId w:val="5"/>
-        </w:numPr>
-        <w:spacing w:before="100" w:beforeAutospacing="1" w:after="100" w:afterAutospacing="1" w:line="240" w:lineRule="auto"/>
-        <w:rPr>
-          <w:rFonts w:ascii="Courier New" w:eastAsia="Times New Roman" w:hAnsi="Courier New" w:cs="Courier New"/>
-          <w:color w:val="000000" w:themeColor="text1"/>
-          <w:kern w:val="0"/>
-          <w:sz w:val="20"/>
-          <w:szCs w:val="20"/>
-          <w14:ligatures w14:val="none"/>
-        </w:rPr>
-      </w:pPr>
-      <w:proofErr w:type="spellStart"/>
-      <w:r>
-        <w:rPr>
-          <w:rFonts w:ascii="Courier New" w:eastAsia="Times New Roman" w:hAnsi="Courier New" w:cs="Courier New"/>
-          <w:color w:val="000000" w:themeColor="text1"/>
-          <w:kern w:val="0"/>
-          <w:sz w:val="20"/>
-          <w:szCs w:val="20"/>
-          <w14:ligatures w14:val="none"/>
-        </w:rPr>
-        <w:t>RedFarm</w:t>
-      </w:r>
-      <w:proofErr w:type="spellEnd"/>
-      <w:r>
-        <w:rPr>
-          <w:rFonts w:ascii="Courier New" w:eastAsia="Times New Roman" w:hAnsi="Courier New" w:cs="Courier New"/>
-          <w:color w:val="000000" w:themeColor="text1"/>
-          <w:kern w:val="0"/>
-          <w:sz w:val="20"/>
-          <w:szCs w:val="20"/>
-          <w14:ligatures w14:val="none"/>
-        </w:rPr>
-        <w:t xml:space="preserve"> Broadway </w:t>
-      </w:r>
-      <w:r>
-        <w:rPr>
-          <w:rFonts w:ascii="Courier New" w:eastAsia="Times New Roman" w:hAnsi="Courier New" w:cs="Courier New"/>
-          <w:i/>
-          <w:iCs/>
-          <w:color w:val="000000" w:themeColor="text1"/>
-          <w:kern w:val="0"/>
-          <w:sz w:val="20"/>
-          <w:szCs w:val="20"/>
-          <w14:ligatures w14:val="none"/>
-        </w:rPr>
-        <w:t>(Chinese)</w:t>
-      </w:r>
-    </w:p>
-    <w:p>
-      <w:pPr>
-        <w:numPr>
-          <w:ilvl w:val="1"/>
-          <w:numId w:val="5"/>
-        </w:numPr>
-        <w:spacing w:before="100" w:beforeAutospacing="1" w:after="100" w:afterAutospacing="1" w:line="240" w:lineRule="auto"/>
-        <w:rPr>
-          <w:rFonts w:ascii="Courier New" w:eastAsia="Times New Roman" w:hAnsi="Courier New" w:cs="Courier New"/>
-          <w:color w:val="000000" w:themeColor="text1"/>
-          <w:kern w:val="0"/>
-          <w:sz w:val="20"/>
-          <w:szCs w:val="20"/>
-          <w14:ligatures w14:val="none"/>
-        </w:rPr>
-      </w:pPr>
-      <w:r>
-        <w:rPr>
-          <w:rFonts w:ascii="Courier New" w:eastAsia="Times New Roman" w:hAnsi="Courier New" w:cs="Courier New"/>
-          <w:color w:val="000000" w:themeColor="text1"/>
-          <w:kern w:val="0"/>
-          <w:sz w:val="20"/>
-          <w:szCs w:val="20"/>
-          <w14:ligatures w14:val="none"/>
-        </w:rPr>
-        <w:t>Shake Shack </w:t>
-      </w:r>
-      <w:r>
-        <w:rPr>
-          <w:rFonts w:ascii="Courier New" w:eastAsia="Times New Roman" w:hAnsi="Courier New" w:cs="Courier New"/>
-          <w:i/>
-          <w:iCs/>
-          <w:color w:val="000000" w:themeColor="text1"/>
-          <w:kern w:val="0"/>
-          <w:sz w:val="20"/>
-          <w:szCs w:val="20"/>
-          <w14:ligatures w14:val="none"/>
-        </w:rPr>
-        <w:t>(American)</w:t>
-      </w:r>
-    </w:p>
-    <w:p>
-      <w:pPr>
-        <w:numPr>
-          <w:ilvl w:val="1"/>
-          <w:numId w:val="5"/>
-        </w:numPr>
-        <w:spacing w:before="100" w:beforeAutospacing="1" w:after="100" w:afterAutospacing="1" w:line="240" w:lineRule="auto"/>
-        <w:rPr>
-          <w:rFonts w:ascii="Courier New" w:eastAsia="Times New Roman" w:hAnsi="Courier New" w:cs="Courier New"/>
-          <w:color w:val="000000" w:themeColor="text1"/>
-          <w:kern w:val="0"/>
-          <w:sz w:val="20"/>
-          <w:szCs w:val="20"/>
-          <w14:ligatures w14:val="none"/>
-        </w:rPr>
-      </w:pPr>
-      <w:r>
-        <w:rPr>
-          <w:rFonts w:ascii="Courier New" w:eastAsia="Times New Roman" w:hAnsi="Courier New" w:cs="Courier New"/>
-          <w:color w:val="000000" w:themeColor="text1"/>
-          <w:kern w:val="0"/>
-          <w:sz w:val="20"/>
-          <w:szCs w:val="20"/>
-          <w14:ligatures w14:val="none"/>
-        </w:rPr>
-        <w:t>Blue Ribbon Sushi </w:t>
-      </w:r>
-      <w:r>
-        <w:rPr>
-          <w:rFonts w:ascii="Courier New" w:eastAsia="Times New Roman" w:hAnsi="Courier New" w:cs="Courier New"/>
-          <w:i/>
-          <w:iCs/>
-          <w:color w:val="000000" w:themeColor="text1"/>
-          <w:kern w:val="0"/>
-          <w:sz w:val="20"/>
-          <w:szCs w:val="20"/>
-          <w14:ligatures w14:val="none"/>
-        </w:rPr>
-        <w:t>(Japanese)</w:t>
-      </w:r>
-    </w:p>
-    <w:p>
-      <w:pPr>
-        <w:pStyle w:val="Heading3"/>
-        <w:rPr>
-          <w:rFonts w:ascii="Courier New" w:eastAsia="Times New Roman" w:hAnsi="Courier New" w:cs="Courier New"/>
-        </w:rPr>
-      </w:pPr>
-      <w:r>
-        <w:rPr>
-          <w:rFonts w:ascii="Apple Color Emoji" w:eastAsia="Times New Roman" w:hAnsi="Apple Color Emoji" w:cs="Apple Color Emoji"/>
-        </w:rPr>
-        <w:t>🏆</w:t>
-      </w:r>
-      <w:r>
-        <w:rPr>
-          <w:rFonts w:ascii="Courier New" w:eastAsia="Times New Roman" w:hAnsi="Courier New" w:cs="Courier New"/>
-        </w:rPr>
-        <w:t xml:space="preserve"> Top Restaurants</w:t>
-      </w:r>
-    </w:p>
-    <w:p>
-      <w:pPr>
-        <w:spacing w:before="240" w:after="240" w:line="240" w:lineRule="auto"/>
-        <w:outlineLvl w:val="3"/>
-        <w:rPr>
-          <w:rFonts w:ascii="Courier New" w:eastAsia="Times New Roman" w:hAnsi="Courier New" w:cs="Courier New"/>
-          <w:b/>
-          <w:bCs/>
-          <w:color w:val="000000" w:themeColor="text1"/>
-          <w:kern w:val="0"/>
-          <w:sz w:val="20"/>
-          <w:szCs w:val="20"/>
-          <w14:ligatures w14:val="none"/>
-        </w:rPr>
-      </w:pPr>
-      <w:r>
-        <w:rPr>
-          <w:rFonts w:ascii="Courier New" w:eastAsia="Times New Roman" w:hAnsi="Courier New" w:cs="Courier New"/>
-          <w:b/>
-          <w:bCs/>
-          <w:color w:val="000000" w:themeColor="text1"/>
-          <w:kern w:val="0"/>
-          <w:sz w:val="20"/>
-          <w:szCs w:val="20"/>
-          <w14:ligatures w14:val="none"/>
-        </w:rPr>
-        <w:t>Overall:</w:t>
-      </w:r>
-    </w:p>
-    <w:p>
-      <w:pPr>
-        <w:tabs>
-          <w:tab w:val="left" w:pos="916"/>
-          <w:tab w:val="left" w:pos="1832"/>
-          <w:tab w:val="left" w:pos="2748"/>
-          <w:tab w:val="left" w:pos="3664"/>
-          <w:tab w:val="left" w:pos="4580"/>
-          <w:tab w:val="left" w:pos="5496"/>
-          <w:tab w:val="left" w:pos="6412"/>
-          <w:tab w:val="left" w:pos="7328"/>
-          <w:tab w:val="left" w:pos="8244"/>
-          <w:tab w:val="left" w:pos="9160"/>
-          <w:tab w:val="left" w:pos="10076"/>
-          <w:tab w:val="left" w:pos="10992"/>
-          <w:tab w:val="left" w:pos="11908"/>
-          <w:tab w:val="left" w:pos="12824"/>
-          <w:tab w:val="left" w:pos="13740"/>
-          <w:tab w:val="left" w:pos="14656"/>
-        </w:tabs>
-        <w:spacing w:after="0" w:line="240" w:lineRule="auto"/>
-        <w:rPr>
-          <w:rFonts w:ascii="Courier New" w:eastAsia="Times New Roman" w:hAnsi="Courier New" w:cs="Courier New"/>
-          <w:color w:val="000000" w:themeColor="text1"/>
-          <w:kern w:val="0"/>
-          <w:sz w:val="20"/>
-          <w:szCs w:val="20"/>
-          <w14:ligatures w14:val="none"/>
-        </w:rPr>
-      </w:pPr>
-      <w:r>
-        <w:rPr>
-          <w:rFonts w:ascii="Courier New" w:eastAsia="Times New Roman" w:hAnsi="Courier New" w:cs="Courier New"/>
-          <w:color w:val="BCBEC4"/>
-          <w:kern w:val="0"/>
-          <w:sz w:val="20"/>
-          <w:szCs w:val="20"/>
-          <w14:ligatures w14:val="none"/>
-        </w:rPr>
-        <w:br/>
-      </w:r>
-      <w:r>
-        <w:rPr>
-          <w:rFonts w:ascii="Courier New" w:eastAsia="Times New Roman" w:hAnsi="Courier New" w:cs="Courier New"/>
-          <w:color w:val="000000" w:themeColor="text1"/>
-          <w:kern w:val="0"/>
-          <w:sz w:val="20"/>
-          <w:szCs w:val="20"/>
-          <w14:ligatures w14:val="none"/>
-        </w:rPr>
-        <w:t>| Restaurant                     | Cuisine   | Avg Rating |</w:t>
-      </w:r>
-      <w:r>
-        <w:rPr>
-          <w:rFonts w:ascii="Courier New" w:eastAsia="Times New Roman" w:hAnsi="Courier New" w:cs="Courier New"/>
-          <w:color w:val="000000" w:themeColor="text1"/>
-          <w:kern w:val="0"/>
-          <w:sz w:val="20"/>
-          <w:szCs w:val="20"/>
-          <w14:ligatures w14:val="none"/>
-        </w:rPr>
-        <w:br/>
-        <w:t>|--------------------------------|-----------|------------|</w:t>
-      </w:r>
-      <w:r>
-        <w:rPr>
-          <w:rFonts w:ascii="Courier New" w:eastAsia="Times New Roman" w:hAnsi="Courier New" w:cs="Courier New"/>
-          <w:color w:val="000000" w:themeColor="text1"/>
-          <w:kern w:val="0"/>
-          <w:sz w:val="20"/>
-          <w:szCs w:val="20"/>
-          <w14:ligatures w14:val="none"/>
-        </w:rPr>
-        <w:br/>
-        <w:t>| Sushi of Gari Tribeca          | Japanese  | 4.6        |</w:t>
-      </w:r>
-      <w:r>
-        <w:rPr>
-          <w:rFonts w:ascii="Courier New" w:eastAsia="Times New Roman" w:hAnsi="Courier New" w:cs="Courier New"/>
-          <w:color w:val="000000" w:themeColor="text1"/>
-          <w:kern w:val="0"/>
-          <w:sz w:val="20"/>
-          <w:szCs w:val="20"/>
-          <w14:ligatures w14:val="none"/>
-        </w:rPr>
-        <w:br/>
-        <w:t>| Blue Ribbon Sushi Bar &amp; Grill  | Japanese  | 4.6        |</w:t>
-      </w:r>
-      <w:r>
-        <w:rPr>
-          <w:rFonts w:ascii="Courier New" w:eastAsia="Times New Roman" w:hAnsi="Courier New" w:cs="Courier New"/>
-          <w:color w:val="000000" w:themeColor="text1"/>
-          <w:kern w:val="0"/>
-          <w:sz w:val="20"/>
-          <w:szCs w:val="20"/>
-          <w14:ligatures w14:val="none"/>
-        </w:rPr>
-        <w:br/>
-        <w:t>| Five Guys Burgers and Fries    | American  | 4.6        |</w:t>
-      </w:r>
-      <w:r>
-        <w:rPr>
-          <w:rFonts w:ascii="Courier New" w:eastAsia="Times New Roman" w:hAnsi="Courier New" w:cs="Courier New"/>
-          <w:color w:val="000000" w:themeColor="text1"/>
-          <w:kern w:val="0"/>
-          <w:sz w:val="20"/>
-          <w:szCs w:val="20"/>
-          <w14:ligatures w14:val="none"/>
-        </w:rPr>
-        <w:br/>
-        <w:t>| The Meatball Shop              | Italian   | 4.5        |</w:t>
-      </w:r>
-      <w:r>
-        <w:rPr>
-          <w:rFonts w:ascii="Courier New" w:eastAsia="Times New Roman" w:hAnsi="Courier New" w:cs="Courier New"/>
-          <w:color w:val="000000" w:themeColor="text1"/>
-          <w:kern w:val="0"/>
-          <w:sz w:val="20"/>
-          <w:szCs w:val="20"/>
-          <w14:ligatures w14:val="none"/>
-        </w:rPr>
-        <w:br/>
-        <w:t>| Han Dynasty                    | Chinese   | 4.4        |</w:t>
-      </w:r>
-    </w:p>
-    <w:p>
-      <w:pPr>
-        <w:spacing w:before="240" w:after="240" w:line="240" w:lineRule="auto"/>
-        <w:outlineLvl w:val="3"/>
-        <w:rPr>
-          <w:rFonts w:ascii="Courier New" w:eastAsia="Times New Roman" w:hAnsi="Courier New" w:cs="Courier New"/>
-          <w:b/>
-          <w:bCs/>
-          <w:color w:val="000000" w:themeColor="text1"/>
-          <w:kern w:val="0"/>
-          <w:sz w:val="20"/>
-          <w:szCs w:val="20"/>
-          <w14:ligatures w14:val="none"/>
-        </w:rPr>
-      </w:pPr>
-      <w:r>
-        <w:rPr>
-          <w:rFonts w:ascii="Courier New" w:eastAsia="Times New Roman" w:hAnsi="Courier New" w:cs="Courier New"/>
-          <w:b/>
-          <w:bCs/>
-          <w:color w:val="000000" w:themeColor="text1"/>
-          <w:kern w:val="0"/>
-          <w:sz w:val="20"/>
-          <w:szCs w:val="20"/>
-          <w14:ligatures w14:val="none"/>
-        </w:rPr>
-        <w:t>Top by Cuisine:</w:t>
-      </w:r>
-    </w:p>
-    <w:p>
-      <w:pPr>
-        <w:pStyle w:val="HTMLPreformatted"/>
-        <w:rPr>
-          <w:color w:val="000000" w:themeColor="text1"/>
-        </w:rPr>
-      </w:pPr>
-      <w:r>
-        <w:rPr>
-          <w:color w:val="000000" w:themeColor="text1"/>
-        </w:rPr>
-        <w:br/>
-        <w:t>| Cuisine         | Top Restaurant              | Avg Rating |</w:t>
-      </w:r>
-      <w:r>
-        <w:rPr>
-          <w:color w:val="000000" w:themeColor="text1"/>
-        </w:rPr>
-        <w:br/>
-        <w:t>|-----------------|-----------------------------|------------|</w:t>
-      </w:r>
-      <w:r>
-        <w:rPr>
-          <w:color w:val="000000" w:themeColor="text1"/>
-        </w:rPr>
-        <w:br/>
-        <w:t>| American        | Five Guys                   | 4.34       |</w:t>
-      </w:r>
-      <w:r>
-        <w:rPr>
-          <w:color w:val="000000" w:themeColor="text1"/>
-        </w:rPr>
-        <w:br/>
-        <w:t>| Chinese         | Han Dynasty                 | 4.28       |</w:t>
-      </w:r>
-      <w:r>
-        <w:rPr>
-          <w:color w:val="000000" w:themeColor="text1"/>
-        </w:rPr>
-        <w:br/>
-        <w:t>| Indian          | Tamarind TriBeCa            | 4.40       |</w:t>
-      </w:r>
-      <w:r>
-        <w:rPr>
-          <w:color w:val="000000" w:themeColor="text1"/>
-        </w:rPr>
-        <w:br/>
-        <w:t>| Italian         | The Meatball Shop           | 4.25       |</w:t>
-      </w:r>
-      <w:r>
-        <w:rPr>
-          <w:color w:val="000000" w:themeColor="text1"/>
-        </w:rPr>
-        <w:br/>
-        <w:t>| Japanese        | Sushi of Gari Tribeca       | 4.37       |</w:t>
-      </w:r>
-      <w:r>
-        <w:rPr>
-          <w:color w:val="000000" w:themeColor="text1"/>
-        </w:rPr>
-        <w:br/>
-        <w:t>| Mediterranean   | Jack's Wife Freda           | 4.32       |</w:t>
-      </w:r>
-      <w:r>
-        <w:rPr>
-          <w:color w:val="000000" w:themeColor="text1"/>
-        </w:rPr>
-        <w:br/>
-        <w:t>| Mexican         | Cafe Habana                 | 4.23       |</w:t>
-      </w:r>
-      <w:r>
-        <w:rPr>
-          <w:color w:val="000000" w:themeColor="text1"/>
-        </w:rPr>
-        <w:br/>
-        <w:t>| Middle Eastern  | Cafe Mogador                | 4.15       |</w:t>
-      </w:r>
-      <w:r>
-        <w:rPr>
-          <w:color w:val="000000" w:themeColor="text1"/>
-        </w:rPr>
-        <w:br/>
-        <w:t>| Southern        | Hill Country Fried Chicken  | 4.36       |</w:t>
-      </w:r>
-    </w:p>
-    <w:p>
-      <w:pPr>
-        <w:spacing w:before="240" w:after="240" w:line="240" w:lineRule="auto"/>
-        <w:outlineLvl w:val="3"/>
-        <w:rPr>
-          <w:rFonts w:ascii="Courier New" w:eastAsia="Times New Roman" w:hAnsi="Courier New" w:cs="Courier New"/>
-          <w:b/>
-          <w:bCs/>
-          <w:color w:val="000000" w:themeColor="text1"/>
-          <w:kern w:val="0"/>
-          <w:sz w:val="20"/>
-          <w:szCs w:val="20"/>
-          <w14:ligatures w14:val="none"/>
-        </w:rPr>
-      </w:pPr>
-      <w:r>
-        <w:rPr>
-          <w:rFonts w:ascii="Courier New" w:eastAsia="Times New Roman" w:hAnsi="Courier New" w:cs="Courier New"/>
-          <w:b/>
-          <w:bCs/>
-          <w:color w:val="000000" w:themeColor="text1"/>
-          <w:kern w:val="0"/>
-          <w:sz w:val="20"/>
-          <w:szCs w:val="20"/>
-          <w14:ligatures w14:val="none"/>
-        </w:rPr>
-        <w:t>Tools Used:</w:t>
-      </w:r>
-    </w:p>
-    <w:p>
-      <w:pPr>
-        <w:spacing w:before="240" w:after="240" w:line="240" w:lineRule="auto"/>
-        <w:outlineLvl w:val="3"/>
-        <w:rPr>
-          <w:rFonts w:ascii="Courier New" w:eastAsia="Times New Roman" w:hAnsi="Courier New" w:cs="Courier New"/>
-          <w:b/>
-          <w:bCs/>
-          <w:color w:val="000000" w:themeColor="text1"/>
-          <w:kern w:val="0"/>
-          <w:sz w:val="20"/>
-          <w:szCs w:val="20"/>
-          <w14:ligatures w14:val="none"/>
-        </w:rPr>
-      </w:pPr>
-      <w:r>
-        <w:rPr>
-          <w:rFonts w:ascii="Courier New" w:eastAsia="Times New Roman" w:hAnsi="Courier New" w:cs="Courier New"/>
-          <w:color w:val="000000" w:themeColor="text1"/>
-          <w:kern w:val="0"/>
-          <w:sz w:val="20"/>
-          <w:szCs w:val="20"/>
-          <w14:ligatures w14:val="none"/>
-        </w:rPr>
-        <w:t>- Python</w:t>
-      </w:r>
-      <w:r>
-        <w:rPr>
-          <w:rFonts w:ascii="Courier New" w:eastAsia="Times New Roman" w:hAnsi="Courier New" w:cs="Courier New"/>
-          <w:color w:val="000000" w:themeColor="text1"/>
-          <w:kern w:val="0"/>
-          <w:sz w:val="20"/>
-          <w:szCs w:val="20"/>
-          <w14:ligatures w14:val="none"/>
-        </w:rPr>
-        <w:br/>
-        <w:t>- Pandas, NumPy</w:t>
-      </w:r>
-      <w:r>
-        <w:rPr>
-          <w:rFonts w:ascii="Courier New" w:eastAsia="Times New Roman" w:hAnsi="Courier New" w:cs="Courier New"/>
-          <w:color w:val="000000" w:themeColor="text1"/>
-          <w:kern w:val="0"/>
-          <w:sz w:val="20"/>
-          <w:szCs w:val="20"/>
-          <w14:ligatures w14:val="none"/>
-        </w:rPr>
-        <w:br/>
-        <w:t>- Seaborn, Matplotlib</w:t>
-      </w:r>
-      <w:r>
-        <w:rPr>
-          <w:rFonts w:ascii="Courier New" w:eastAsia="Times New Roman" w:hAnsi="Courier New" w:cs="Courier New"/>
-          <w:color w:val="000000" w:themeColor="text1"/>
-          <w:kern w:val="0"/>
-          <w:sz w:val="20"/>
-          <w:szCs w:val="20"/>
-          <w14:ligatures w14:val="none"/>
-        </w:rPr>
-        <w:br/>
-        <w:t xml:space="preserve">- </w:t>
-      </w:r>
-      <w:proofErr w:type="spellStart"/>
-      <w:r>
-        <w:rPr>
-          <w:rFonts w:ascii="Courier New" w:eastAsia="Times New Roman" w:hAnsi="Courier New" w:cs="Courier New"/>
-          <w:color w:val="000000" w:themeColor="text1"/>
-          <w:kern w:val="0"/>
-          <w:sz w:val="20"/>
-          <w:szCs w:val="20"/>
-          <w14:ligatures w14:val="none"/>
-        </w:rPr>
-        <w:t>Jupyter</w:t>
-      </w:r>
-      <w:proofErr w:type="spellEnd"/>
-      <w:r>
-        <w:rPr>
-          <w:rFonts w:ascii="Courier New" w:eastAsia="Times New Roman" w:hAnsi="Courier New" w:cs="Courier New"/>
-          <w:color w:val="000000" w:themeColor="text1"/>
-          <w:kern w:val="0"/>
-          <w:sz w:val="20"/>
-          <w:szCs w:val="20"/>
-          <w14:ligatures w14:val="none"/>
-        </w:rPr>
-        <w:t xml:space="preserve"> Notebook</w:t>
-      </w:r>
-      <w:r>
-        <w:rPr>
-          <w:rFonts w:ascii="Courier New" w:eastAsia="Times New Roman" w:hAnsi="Courier New" w:cs="Courier New"/>
-          <w:color w:val="000000" w:themeColor="text1"/>
-          <w:kern w:val="0"/>
-          <w:sz w:val="20"/>
-          <w:szCs w:val="20"/>
-          <w14:ligatures w14:val="none"/>
-        </w:rPr>
-        <w:br/>
-      </w:r>
-      <w:r>
-        <w:rPr>
-          <w:rFonts w:ascii="Courier New" w:eastAsia="Times New Roman" w:hAnsi="Courier New" w:cs="Courier New"/>
-          <w:b/>
-          <w:bCs/>
-          <w:color w:val="000000" w:themeColor="text1"/>
-          <w:kern w:val="0"/>
-          <w:sz w:val="20"/>
-          <w:szCs w:val="20"/>
-          <w14:ligatures w14:val="none"/>
-        </w:rPr>
-        <w:br/>
-      </w:r>
-      <w:r>
-        <w:rPr>
-          <w:rFonts w:ascii="Courier New" w:eastAsia="Times New Roman" w:hAnsi="Courier New" w:cs="Courier New"/>
-          <w:b/>
-          <w:bCs/>
-          <w:color w:val="000000" w:themeColor="text1"/>
-          <w:kern w:val="0"/>
-          <w:sz w:val="20"/>
-          <w:szCs w:val="20"/>
-          <w14:ligatures w14:val="none"/>
-        </w:rPr>
-        <w:t>Project</w:t>
-      </w:r>
-      <w:r>
-        <w:rPr>
-          <w:rFonts w:ascii="Courier New" w:eastAsia="Times New Roman" w:hAnsi="Courier New" w:cs="Courier New"/>
-          <w:b/>
-          <w:bCs/>
-          <w:color w:val="000000" w:themeColor="text1"/>
-          <w:kern w:val="0"/>
-          <w:sz w:val="20"/>
-          <w:szCs w:val="20"/>
-          <w14:ligatures w14:val="none"/>
-        </w:rPr>
-        <w:t>:</w:t>
-      </w:r>
-    </w:p>
-    <w:p>
-      <w:pPr>
-        <w:spacing w:after="0" w:line="240" w:lineRule="auto"/>
-        <w:outlineLvl w:val="3"/>
-        <w:rPr>
-          <w:rFonts w:ascii="Courier New" w:eastAsia="Times New Roman" w:hAnsi="Courier New" w:cs="Courier New"/>
-          <w:color w:val="000000" w:themeColor="text1"/>
-          <w:kern w:val="0"/>
-          <w:sz w:val="20"/>
-          <w:szCs w:val="20"/>
-          <w14:ligatures w14:val="none"/>
-        </w:rPr>
-      </w:pPr>
-      <w:r>
-        <w:rPr>
-          <w:rFonts w:ascii="Courier New" w:eastAsia="Times New Roman" w:hAnsi="Courier New" w:cs="Courier New"/>
-          <w:color w:val="000000" w:themeColor="text1"/>
-          <w:kern w:val="0"/>
-          <w:sz w:val="20"/>
-          <w:szCs w:val="20"/>
-          <w14:ligatures w14:val="none"/>
-        </w:rPr>
-        <w:t>- Class: UT ML/AI Certificate</w:t>
-      </w:r>
-    </w:p>
-    <w:p>
-      <w:pPr>
-        <w:spacing w:after="0" w:line="240" w:lineRule="auto"/>
-        <w:outlineLvl w:val="3"/>
-        <w:rPr>
-          <w:rFonts w:ascii="Courier New" w:eastAsia="Times New Roman" w:hAnsi="Courier New" w:cs="Courier New"/>
-          <w:color w:val="000000" w:themeColor="text1"/>
-          <w:kern w:val="0"/>
-          <w:sz w:val="20"/>
-          <w:szCs w:val="20"/>
-          <w14:ligatures w14:val="none"/>
-        </w:rPr>
-      </w:pPr>
-      <w:r>
-        <w:rPr>
-          <w:rFonts w:ascii="Courier New" w:eastAsia="Times New Roman" w:hAnsi="Courier New" w:cs="Courier New"/>
-          <w:color w:val="000000" w:themeColor="text1"/>
-          <w:kern w:val="0"/>
-          <w:sz w:val="20"/>
-          <w:szCs w:val="20"/>
-          <w14:ligatures w14:val="none"/>
-        </w:rPr>
-        <w:t>- Name: Daniel Levenstein</w:t>
-      </w:r>
-    </w:p>
-    <w:p>
-      <w:pPr>
-        <w:spacing w:after="0" w:line="240" w:lineRule="auto"/>
-        <w:outlineLvl w:val="3"/>
-        <w:rPr>
-          <w:rFonts w:ascii="Courier New" w:eastAsia="Times New Roman" w:hAnsi="Courier New" w:cs="Courier New"/>
-          <w:color w:val="000000" w:themeColor="text1"/>
-          <w:kern w:val="0"/>
-          <w:sz w:val="20"/>
-          <w:szCs w:val="20"/>
-          <w14:ligatures w14:val="none"/>
-        </w:rPr>
-      </w:pPr>
-      <w:r>
-        <w:rPr>
-          <w:rFonts w:ascii="Courier New" w:eastAsia="Times New Roman" w:hAnsi="Courier New" w:cs="Courier New"/>
-          <w:color w:val="000000" w:themeColor="text1"/>
-          <w:kern w:val="0"/>
-          <w:sz w:val="20"/>
-          <w:szCs w:val="20"/>
-          <w14:ligatures w14:val="none"/>
-        </w:rPr>
-        <w:t>- Submission Date: 8/2/2025</w:t>
+          <w:rFonts w:ascii="Calibri" w:hAnsi="Calibri" w:cs="Calibri"/>
+        </w:rPr>
+        <w:t xml:space="preserve">Create a discount for customers who make more than 5 orders on the app. </w:t>
       </w:r>
     </w:p>
     <w:sectPr>
@@ -1836,6 +603,118 @@
     </w:lvl>
   </w:abstractNum>
   <w:abstractNum w:abstractNumId="2" w15:restartNumberingAfterBreak="0">
+    <w:nsid w:val="206F74D1"/>
+    <w:multiLevelType w:val="hybridMultilevel"/>
+    <w:tmpl w:val="541C2908"/>
+    <w:lvl w:ilvl="0" w:tplc="4F34E538">
+      <w:numFmt w:val="bullet"/>
+      <w:lvlText w:val="-"/>
+      <w:lvlJc w:val="left"/>
+      <w:pPr>
+        <w:ind w:left="720" w:hanging="360"/>
+      </w:pPr>
+      <w:rPr>
+        <w:rFonts w:ascii="Aptos" w:eastAsiaTheme="minorHAnsi" w:hAnsi="Aptos" w:cstheme="minorBidi" w:hint="default"/>
+      </w:rPr>
+    </w:lvl>
+    <w:lvl w:ilvl="1" w:tplc="04090003" w:tentative="1">
+      <w:start w:val="1"/>
+      <w:numFmt w:val="bullet"/>
+      <w:lvlText w:val="o"/>
+      <w:lvlJc w:val="left"/>
+      <w:pPr>
+        <w:ind w:left="1440" w:hanging="360"/>
+      </w:pPr>
+      <w:rPr>
+        <w:rFonts w:ascii="Courier New" w:hAnsi="Courier New" w:cs="Courier New" w:hint="default"/>
+      </w:rPr>
+    </w:lvl>
+    <w:lvl w:ilvl="2" w:tplc="04090005" w:tentative="1">
+      <w:start w:val="1"/>
+      <w:numFmt w:val="bullet"/>
+      <w:lvlText w:val=""/>
+      <w:lvlJc w:val="left"/>
+      <w:pPr>
+        <w:ind w:left="2160" w:hanging="360"/>
+      </w:pPr>
+      <w:rPr>
+        <w:rFonts w:ascii="Wingdings" w:hAnsi="Wingdings" w:hint="default"/>
+      </w:rPr>
+    </w:lvl>
+    <w:lvl w:ilvl="3" w:tplc="04090001" w:tentative="1">
+      <w:start w:val="1"/>
+      <w:numFmt w:val="bullet"/>
+      <w:lvlText w:val=""/>
+      <w:lvlJc w:val="left"/>
+      <w:pPr>
+        <w:ind w:left="2880" w:hanging="360"/>
+      </w:pPr>
+      <w:rPr>
+        <w:rFonts w:ascii="Symbol" w:hAnsi="Symbol" w:hint="default"/>
+      </w:rPr>
+    </w:lvl>
+    <w:lvl w:ilvl="4" w:tplc="04090003" w:tentative="1">
+      <w:start w:val="1"/>
+      <w:numFmt w:val="bullet"/>
+      <w:lvlText w:val="o"/>
+      <w:lvlJc w:val="left"/>
+      <w:pPr>
+        <w:ind w:left="3600" w:hanging="360"/>
+      </w:pPr>
+      <w:rPr>
+        <w:rFonts w:ascii="Courier New" w:hAnsi="Courier New" w:cs="Courier New" w:hint="default"/>
+      </w:rPr>
+    </w:lvl>
+    <w:lvl w:ilvl="5" w:tplc="04090005" w:tentative="1">
+      <w:start w:val="1"/>
+      <w:numFmt w:val="bullet"/>
+      <w:lvlText w:val=""/>
+      <w:lvlJc w:val="left"/>
+      <w:pPr>
+        <w:ind w:left="4320" w:hanging="360"/>
+      </w:pPr>
+      <w:rPr>
+        <w:rFonts w:ascii="Wingdings" w:hAnsi="Wingdings" w:hint="default"/>
+      </w:rPr>
+    </w:lvl>
+    <w:lvl w:ilvl="6" w:tplc="04090001" w:tentative="1">
+      <w:start w:val="1"/>
+      <w:numFmt w:val="bullet"/>
+      <w:lvlText w:val=""/>
+      <w:lvlJc w:val="left"/>
+      <w:pPr>
+        <w:ind w:left="5040" w:hanging="360"/>
+      </w:pPr>
+      <w:rPr>
+        <w:rFonts w:ascii="Symbol" w:hAnsi="Symbol" w:hint="default"/>
+      </w:rPr>
+    </w:lvl>
+    <w:lvl w:ilvl="7" w:tplc="04090003" w:tentative="1">
+      <w:start w:val="1"/>
+      <w:numFmt w:val="bullet"/>
+      <w:lvlText w:val="o"/>
+      <w:lvlJc w:val="left"/>
+      <w:pPr>
+        <w:ind w:left="5760" w:hanging="360"/>
+      </w:pPr>
+      <w:rPr>
+        <w:rFonts w:ascii="Courier New" w:hAnsi="Courier New" w:cs="Courier New" w:hint="default"/>
+      </w:rPr>
+    </w:lvl>
+    <w:lvl w:ilvl="8" w:tplc="04090005" w:tentative="1">
+      <w:start w:val="1"/>
+      <w:numFmt w:val="bullet"/>
+      <w:lvlText w:val=""/>
+      <w:lvlJc w:val="left"/>
+      <w:pPr>
+        <w:ind w:left="6480" w:hanging="360"/>
+      </w:pPr>
+      <w:rPr>
+        <w:rFonts w:ascii="Wingdings" w:hAnsi="Wingdings" w:hint="default"/>
+      </w:rPr>
+    </w:lvl>
+  </w:abstractNum>
+  <w:abstractNum w:abstractNumId="3" w15:restartNumberingAfterBreak="0">
     <w:nsid w:val="246320C9"/>
     <w:multiLevelType w:val="multilevel"/>
     <w:tmpl w:val="FA1475BE"/>
@@ -1948,7 +827,119 @@
       </w:pPr>
     </w:lvl>
   </w:abstractNum>
-  <w:abstractNum w:abstractNumId="3" w15:restartNumberingAfterBreak="0">
+  <w:abstractNum w:abstractNumId="4" w15:restartNumberingAfterBreak="0">
+    <w:nsid w:val="2A88589B"/>
+    <w:multiLevelType w:val="hybridMultilevel"/>
+    <w:tmpl w:val="7D9401BC"/>
+    <w:lvl w:ilvl="0" w:tplc="613A67E6">
+      <w:numFmt w:val="bullet"/>
+      <w:lvlText w:val="-"/>
+      <w:lvlJc w:val="left"/>
+      <w:pPr>
+        <w:ind w:left="720" w:hanging="360"/>
+      </w:pPr>
+      <w:rPr>
+        <w:rFonts w:ascii="Aptos" w:eastAsiaTheme="minorHAnsi" w:hAnsi="Aptos" w:cstheme="minorBidi" w:hint="default"/>
+      </w:rPr>
+    </w:lvl>
+    <w:lvl w:ilvl="1" w:tplc="04090003" w:tentative="1">
+      <w:start w:val="1"/>
+      <w:numFmt w:val="bullet"/>
+      <w:lvlText w:val="o"/>
+      <w:lvlJc w:val="left"/>
+      <w:pPr>
+        <w:ind w:left="1440" w:hanging="360"/>
+      </w:pPr>
+      <w:rPr>
+        <w:rFonts w:ascii="Courier New" w:hAnsi="Courier New" w:cs="Courier New" w:hint="default"/>
+      </w:rPr>
+    </w:lvl>
+    <w:lvl w:ilvl="2" w:tplc="04090005" w:tentative="1">
+      <w:start w:val="1"/>
+      <w:numFmt w:val="bullet"/>
+      <w:lvlText w:val=""/>
+      <w:lvlJc w:val="left"/>
+      <w:pPr>
+        <w:ind w:left="2160" w:hanging="360"/>
+      </w:pPr>
+      <w:rPr>
+        <w:rFonts w:ascii="Wingdings" w:hAnsi="Wingdings" w:hint="default"/>
+      </w:rPr>
+    </w:lvl>
+    <w:lvl w:ilvl="3" w:tplc="04090001" w:tentative="1">
+      <w:start w:val="1"/>
+      <w:numFmt w:val="bullet"/>
+      <w:lvlText w:val=""/>
+      <w:lvlJc w:val="left"/>
+      <w:pPr>
+        <w:ind w:left="2880" w:hanging="360"/>
+      </w:pPr>
+      <w:rPr>
+        <w:rFonts w:ascii="Symbol" w:hAnsi="Symbol" w:hint="default"/>
+      </w:rPr>
+    </w:lvl>
+    <w:lvl w:ilvl="4" w:tplc="04090003" w:tentative="1">
+      <w:start w:val="1"/>
+      <w:numFmt w:val="bullet"/>
+      <w:lvlText w:val="o"/>
+      <w:lvlJc w:val="left"/>
+      <w:pPr>
+        <w:ind w:left="3600" w:hanging="360"/>
+      </w:pPr>
+      <w:rPr>
+        <w:rFonts w:ascii="Courier New" w:hAnsi="Courier New" w:cs="Courier New" w:hint="default"/>
+      </w:rPr>
+    </w:lvl>
+    <w:lvl w:ilvl="5" w:tplc="04090005" w:tentative="1">
+      <w:start w:val="1"/>
+      <w:numFmt w:val="bullet"/>
+      <w:lvlText w:val=""/>
+      <w:lvlJc w:val="left"/>
+      <w:pPr>
+        <w:ind w:left="4320" w:hanging="360"/>
+      </w:pPr>
+      <w:rPr>
+        <w:rFonts w:ascii="Wingdings" w:hAnsi="Wingdings" w:hint="default"/>
+      </w:rPr>
+    </w:lvl>
+    <w:lvl w:ilvl="6" w:tplc="04090001" w:tentative="1">
+      <w:start w:val="1"/>
+      <w:numFmt w:val="bullet"/>
+      <w:lvlText w:val=""/>
+      <w:lvlJc w:val="left"/>
+      <w:pPr>
+        <w:ind w:left="5040" w:hanging="360"/>
+      </w:pPr>
+      <w:rPr>
+        <w:rFonts w:ascii="Symbol" w:hAnsi="Symbol" w:hint="default"/>
+      </w:rPr>
+    </w:lvl>
+    <w:lvl w:ilvl="7" w:tplc="04090003" w:tentative="1">
+      <w:start w:val="1"/>
+      <w:numFmt w:val="bullet"/>
+      <w:lvlText w:val="o"/>
+      <w:lvlJc w:val="left"/>
+      <w:pPr>
+        <w:ind w:left="5760" w:hanging="360"/>
+      </w:pPr>
+      <w:rPr>
+        <w:rFonts w:ascii="Courier New" w:hAnsi="Courier New" w:cs="Courier New" w:hint="default"/>
+      </w:rPr>
+    </w:lvl>
+    <w:lvl w:ilvl="8" w:tplc="04090005" w:tentative="1">
+      <w:start w:val="1"/>
+      <w:numFmt w:val="bullet"/>
+      <w:lvlText w:val=""/>
+      <w:lvlJc w:val="left"/>
+      <w:pPr>
+        <w:ind w:left="6480" w:hanging="360"/>
+      </w:pPr>
+      <w:rPr>
+        <w:rFonts w:ascii="Wingdings" w:hAnsi="Wingdings" w:hint="default"/>
+      </w:rPr>
+    </w:lvl>
+  </w:abstractNum>
+  <w:abstractNum w:abstractNumId="5" w15:restartNumberingAfterBreak="0">
     <w:nsid w:val="2C4A5FE7"/>
     <w:multiLevelType w:val="multilevel"/>
     <w:tmpl w:val="C8029E3E"/>
@@ -2097,7 +1088,7 @@
       </w:rPr>
     </w:lvl>
   </w:abstractNum>
-  <w:abstractNum w:abstractNumId="4" w15:restartNumberingAfterBreak="0">
+  <w:abstractNum w:abstractNumId="6" w15:restartNumberingAfterBreak="0">
     <w:nsid w:val="3CF77F97"/>
     <w:multiLevelType w:val="multilevel"/>
     <w:tmpl w:val="13A271C6"/>
@@ -2246,7 +1237,7 @@
       </w:rPr>
     </w:lvl>
   </w:abstractNum>
-  <w:abstractNum w:abstractNumId="5" w15:restartNumberingAfterBreak="0">
+  <w:abstractNum w:abstractNumId="7" w15:restartNumberingAfterBreak="0">
     <w:nsid w:val="512B1827"/>
     <w:multiLevelType w:val="multilevel"/>
     <w:tmpl w:val="7FB0FBA8"/>
@@ -2395,7 +1386,7 @@
       </w:rPr>
     </w:lvl>
   </w:abstractNum>
-  <w:abstractNum w:abstractNumId="6" w15:restartNumberingAfterBreak="0">
+  <w:abstractNum w:abstractNumId="8" w15:restartNumberingAfterBreak="0">
     <w:nsid w:val="6E021EB9"/>
     <w:multiLevelType w:val="multilevel"/>
     <w:tmpl w:val="89540472"/>
@@ -2544,14 +1535,127 @@
       </w:rPr>
     </w:lvl>
   </w:abstractNum>
+  <w:abstractNum w:abstractNumId="9" w15:restartNumberingAfterBreak="0">
+    <w:nsid w:val="7F5524F0"/>
+    <w:multiLevelType w:val="hybridMultilevel"/>
+    <w:tmpl w:val="6B68DFB0"/>
+    <w:lvl w:ilvl="0" w:tplc="04090001">
+      <w:start w:val="1"/>
+      <w:numFmt w:val="bullet"/>
+      <w:lvlText w:val=""/>
+      <w:lvlJc w:val="left"/>
+      <w:pPr>
+        <w:ind w:left="720" w:hanging="360"/>
+      </w:pPr>
+      <w:rPr>
+        <w:rFonts w:ascii="Symbol" w:hAnsi="Symbol" w:hint="default"/>
+      </w:rPr>
+    </w:lvl>
+    <w:lvl w:ilvl="1" w:tplc="04090003" w:tentative="1">
+      <w:start w:val="1"/>
+      <w:numFmt w:val="bullet"/>
+      <w:lvlText w:val="o"/>
+      <w:lvlJc w:val="left"/>
+      <w:pPr>
+        <w:ind w:left="1440" w:hanging="360"/>
+      </w:pPr>
+      <w:rPr>
+        <w:rFonts w:ascii="Courier New" w:hAnsi="Courier New" w:cs="Courier New" w:hint="default"/>
+      </w:rPr>
+    </w:lvl>
+    <w:lvl w:ilvl="2" w:tplc="04090005" w:tentative="1">
+      <w:start w:val="1"/>
+      <w:numFmt w:val="bullet"/>
+      <w:lvlText w:val=""/>
+      <w:lvlJc w:val="left"/>
+      <w:pPr>
+        <w:ind w:left="2160" w:hanging="360"/>
+      </w:pPr>
+      <w:rPr>
+        <w:rFonts w:ascii="Wingdings" w:hAnsi="Wingdings" w:hint="default"/>
+      </w:rPr>
+    </w:lvl>
+    <w:lvl w:ilvl="3" w:tplc="04090001" w:tentative="1">
+      <w:start w:val="1"/>
+      <w:numFmt w:val="bullet"/>
+      <w:lvlText w:val=""/>
+      <w:lvlJc w:val="left"/>
+      <w:pPr>
+        <w:ind w:left="2880" w:hanging="360"/>
+      </w:pPr>
+      <w:rPr>
+        <w:rFonts w:ascii="Symbol" w:hAnsi="Symbol" w:hint="default"/>
+      </w:rPr>
+    </w:lvl>
+    <w:lvl w:ilvl="4" w:tplc="04090003" w:tentative="1">
+      <w:start w:val="1"/>
+      <w:numFmt w:val="bullet"/>
+      <w:lvlText w:val="o"/>
+      <w:lvlJc w:val="left"/>
+      <w:pPr>
+        <w:ind w:left="3600" w:hanging="360"/>
+      </w:pPr>
+      <w:rPr>
+        <w:rFonts w:ascii="Courier New" w:hAnsi="Courier New" w:cs="Courier New" w:hint="default"/>
+      </w:rPr>
+    </w:lvl>
+    <w:lvl w:ilvl="5" w:tplc="04090005" w:tentative="1">
+      <w:start w:val="1"/>
+      <w:numFmt w:val="bullet"/>
+      <w:lvlText w:val=""/>
+      <w:lvlJc w:val="left"/>
+      <w:pPr>
+        <w:ind w:left="4320" w:hanging="360"/>
+      </w:pPr>
+      <w:rPr>
+        <w:rFonts w:ascii="Wingdings" w:hAnsi="Wingdings" w:hint="default"/>
+      </w:rPr>
+    </w:lvl>
+    <w:lvl w:ilvl="6" w:tplc="04090001" w:tentative="1">
+      <w:start w:val="1"/>
+      <w:numFmt w:val="bullet"/>
+      <w:lvlText w:val=""/>
+      <w:lvlJc w:val="left"/>
+      <w:pPr>
+        <w:ind w:left="5040" w:hanging="360"/>
+      </w:pPr>
+      <w:rPr>
+        <w:rFonts w:ascii="Symbol" w:hAnsi="Symbol" w:hint="default"/>
+      </w:rPr>
+    </w:lvl>
+    <w:lvl w:ilvl="7" w:tplc="04090003" w:tentative="1">
+      <w:start w:val="1"/>
+      <w:numFmt w:val="bullet"/>
+      <w:lvlText w:val="o"/>
+      <w:lvlJc w:val="left"/>
+      <w:pPr>
+        <w:ind w:left="5760" w:hanging="360"/>
+      </w:pPr>
+      <w:rPr>
+        <w:rFonts w:ascii="Courier New" w:hAnsi="Courier New" w:cs="Courier New" w:hint="default"/>
+      </w:rPr>
+    </w:lvl>
+    <w:lvl w:ilvl="8" w:tplc="04090005" w:tentative="1">
+      <w:start w:val="1"/>
+      <w:numFmt w:val="bullet"/>
+      <w:lvlText w:val=""/>
+      <w:lvlJc w:val="left"/>
+      <w:pPr>
+        <w:ind w:left="6480" w:hanging="360"/>
+      </w:pPr>
+      <w:rPr>
+        <w:rFonts w:ascii="Wingdings" w:hAnsi="Wingdings" w:hint="default"/>
+      </w:rPr>
+    </w:lvl>
+  </w:abstractNum>
   <w:num w:numId="1" w16cid:durableId="1939479761">
+    <w:abstractNumId w:val="7"/>
+  </w:num>
+  <w:num w:numId="2" w16cid:durableId="456727948">
     <w:abstractNumId w:val="5"/>
   </w:num>
-  <w:num w:numId="2" w16cid:durableId="456727948">
-    <w:abstractNumId w:val="3"/>
-  </w:num>
   <w:num w:numId="3" w16cid:durableId="657998979">
-    <w:abstractNumId w:val="4"/>
+    <w:abstractNumId w:val="6"/>
   </w:num>
   <w:num w:numId="4" w16cid:durableId="1303997023">
     <w:abstractNumId w:val="0"/>
@@ -2560,9 +1664,18 @@
     <w:abstractNumId w:val="1"/>
   </w:num>
   <w:num w:numId="6" w16cid:durableId="1753355405">
-    <w:abstractNumId w:val="6"/>
+    <w:abstractNumId w:val="8"/>
   </w:num>
   <w:num w:numId="7" w16cid:durableId="1140419033">
+    <w:abstractNumId w:val="3"/>
+  </w:num>
+  <w:num w:numId="8" w16cid:durableId="1878155063">
+    <w:abstractNumId w:val="9"/>
+  </w:num>
+  <w:num w:numId="9" w16cid:durableId="1459255224">
+    <w:abstractNumId w:val="4"/>
+  </w:num>
+  <w:num w:numId="10" w16cid:durableId="1551267204">
     <w:abstractNumId w:val="2"/>
   </w:num>
 </w:numbering>

</xml_diff>

<commit_message>
Updated chart used for Discount Cost vs. Total Reach section.
</commit_message>
<xml_diff>
--- a/FoodHub_Data_Analysis_Summary.docx
+++ b/FoodHub_Data_Analysis_Summary.docx
@@ -142,10 +142,10 @@
           <w:noProof/>
         </w:rPr>
         <w:drawing>
-          <wp:inline distT="0" distB="0" distL="0" distR="0" wp14:anchorId="1B7CD188" wp14:editId="5135DCDD">
+          <wp:inline distT="0" distB="0" distL="0" distR="0" wp14:anchorId="5B67453B" wp14:editId="06CE6B2D">
             <wp:extent cx="5943600" cy="1981200"/>
             <wp:effectExtent l="0" t="0" r="0" b="0"/>
-            <wp:docPr id="1651983829" name="Picture 1" descr="A screenshot of a graph&#10;&#10;AI-generated content may be incorrect."/>
+            <wp:docPr id="973127315" name="Picture 1" descr="A comparison of a graph&#10;&#10;AI-generated content may be incorrect."/>
             <wp:cNvGraphicFramePr>
               <a:graphicFrameLocks xmlns:a="http://schemas.openxmlformats.org/drawingml/2006/main" noChangeAspect="1"/>
             </wp:cNvGraphicFramePr>
@@ -153,7 +153,7 @@
               <a:graphicData uri="http://schemas.openxmlformats.org/drawingml/2006/picture">
                 <pic:pic xmlns:pic="http://schemas.openxmlformats.org/drawingml/2006/picture">
                   <pic:nvPicPr>
-                    <pic:cNvPr id="1651983829" name="Picture 1" descr="A screenshot of a graph&#10;&#10;AI-generated content may be incorrect."/>
+                    <pic:cNvPr id="973127315" name="Picture 1" descr="A comparison of a graph&#10;&#10;AI-generated content may be incorrect."/>
                     <pic:cNvPicPr/>
                   </pic:nvPicPr>
                   <pic:blipFill>

</xml_diff>

<commit_message>
Updated chart used for the Discount Cost vs. Total Reach section along with README.md and summary doc.
</commit_message>
<xml_diff>
--- a/FoodHub_Data_Analysis_Summary.docx
+++ b/FoodHub_Data_Analysis_Summary.docx
@@ -44,6 +44,59 @@
     </w:p>
     <w:p>
       <w:pPr>
+        <w:pStyle w:val="Heading3"/>
+        <w:rPr>
+          <w:rFonts w:ascii="Calibri" w:hAnsi="Calibri" w:cs="Calibri"/>
+        </w:rPr>
+      </w:pPr>
+      <w:r>
+        <w:rPr>
+          <w:rFonts w:ascii="Calibri" w:hAnsi="Calibri" w:cs="Calibri"/>
+        </w:rPr>
+        <w:t>Methodology</w:t>
+      </w:r>
+    </w:p>
+    <w:p>
+      <w:pPr>
+        <w:rPr>
+          <w:rFonts w:ascii="Calibri" w:hAnsi="Calibri" w:cs="Calibri"/>
+        </w:rPr>
+      </w:pPr>
+      <w:r>
+        <w:rPr>
+          <w:rFonts w:ascii="Calibri" w:hAnsi="Calibri" w:cs="Calibri"/>
+        </w:rPr>
+        <w:t xml:space="preserve">In this project I analyzed the delivery data from a fake food delivery app called </w:t>
+      </w:r>
+      <w:proofErr w:type="spellStart"/>
+      <w:r>
+        <w:rPr>
+          <w:rFonts w:ascii="Calibri" w:hAnsi="Calibri" w:cs="Calibri"/>
+        </w:rPr>
+        <w:t>FoodHub</w:t>
+      </w:r>
+      <w:proofErr w:type="spellEnd"/>
+      <w:r>
+        <w:rPr>
+          <w:rFonts w:ascii="Calibri" w:hAnsi="Calibri" w:cs="Calibri"/>
+        </w:rPr>
+        <w:t xml:space="preserve"> and calculated cuisine performance by a restaurant type and rating.</w:t>
+      </w:r>
+      <w:r>
+        <w:rPr>
+          <w:rFonts w:ascii="Calibri" w:hAnsi="Calibri" w:cs="Calibri"/>
+        </w:rPr>
+        <w:t xml:space="preserve"> </w:t>
+      </w:r>
+      <w:r>
+        <w:rPr>
+          <w:rFonts w:ascii="Calibri" w:hAnsi="Calibri" w:cs="Calibri"/>
+        </w:rPr>
+        <w:t>The input data for this project had over 700 entries without ratings. For this dataset I have populated those table rows with the mean rating for the whole dataset, which is 4.</w:t>
+      </w:r>
+    </w:p>
+    <w:p>
+      <w:pPr>
         <w:pStyle w:val="Heading2"/>
         <w:rPr>
           <w:rFonts w:ascii="Calibri" w:hAnsi="Calibri" w:cs="Calibri"/>
@@ -142,10 +195,10 @@
           <w:noProof/>
         </w:rPr>
         <w:drawing>
-          <wp:inline distT="0" distB="0" distL="0" distR="0" wp14:anchorId="5B67453B" wp14:editId="06CE6B2D">
-            <wp:extent cx="5943600" cy="1981200"/>
+          <wp:inline distT="0" distB="0" distL="0" distR="0" wp14:anchorId="3808F3EA" wp14:editId="167C137A">
+            <wp:extent cx="5644282" cy="1881427"/>
             <wp:effectExtent l="0" t="0" r="0" b="0"/>
-            <wp:docPr id="973127315" name="Picture 1" descr="A comparison of a graph&#10;&#10;AI-generated content may be incorrect."/>
+            <wp:docPr id="1445340133" name="Picture 2" descr="Figure shows discount cost vs total reach along with discount value per customer."/>
             <wp:cNvGraphicFramePr>
               <a:graphicFrameLocks xmlns:a="http://schemas.openxmlformats.org/drawingml/2006/main" noChangeAspect="1"/>
             </wp:cNvGraphicFramePr>
@@ -153,7 +206,7 @@
               <a:graphicData uri="http://schemas.openxmlformats.org/drawingml/2006/picture">
                 <pic:pic xmlns:pic="http://schemas.openxmlformats.org/drawingml/2006/picture">
                   <pic:nvPicPr>
-                    <pic:cNvPr id="973127315" name="Picture 1" descr="A comparison of a graph&#10;&#10;AI-generated content may be incorrect."/>
+                    <pic:cNvPr id="1445340133" name="Picture 2" descr="Figure shows discount cost vs total reach along with discount value per customer."/>
                     <pic:cNvPicPr/>
                   </pic:nvPicPr>
                   <pic:blipFill>
@@ -171,7 +224,7 @@
                   <pic:spPr>
                     <a:xfrm>
                       <a:off x="0" y="0"/>
-                      <a:ext cx="5943600" cy="1981200"/>
+                      <a:ext cx="5795818" cy="1931939"/>
                     </a:xfrm>
                     <a:prstGeom prst="rect">
                       <a:avLst/>
@@ -194,12 +247,65 @@
         <w:rPr>
           <w:rFonts w:ascii="Calibri" w:hAnsi="Calibri" w:cs="Calibri"/>
         </w:rPr>
-        <w:t>Figure shows discount cost vs total reach along with discount value per customer</w:t>
+        <w:t>Figure shows discount cost vs total reach along with discount value per customer.</w:t>
+      </w:r>
+    </w:p>
+    <w:p>
+      <w:pPr>
+        <w:pStyle w:val="Heading3"/>
+        <w:rPr>
+          <w:rFonts w:ascii="Calibri" w:hAnsi="Calibri" w:cs="Calibri"/>
+        </w:rPr>
+      </w:pPr>
+      <w:r>
+        <w:rPr>
+          <w:rFonts w:ascii="Calibri" w:hAnsi="Calibri" w:cs="Calibri"/>
+        </w:rPr>
+        <w:t>Observations</w:t>
+      </w:r>
+    </w:p>
+    <w:p>
+      <w:pPr>
+        <w:pStyle w:val="ListParagraph"/>
+        <w:numPr>
+          <w:ilvl w:val="0"/>
+          <w:numId w:val="12"/>
+        </w:numPr>
+      </w:pPr>
+      <w:r>
+        <w:t xml:space="preserve">Returning customers spend more per order on the app than less frequent users. </w:t>
+      </w:r>
+    </w:p>
+    <w:p>
+      <w:pPr>
+        <w:pStyle w:val="ListParagraph"/>
+        <w:numPr>
+          <w:ilvl w:val="0"/>
+          <w:numId w:val="12"/>
+        </w:numPr>
+      </w:pPr>
+      <w:r>
+        <w:t>Giving all returning users a discount will reach 12% of the total userbase.</w:t>
+      </w:r>
+    </w:p>
+    <w:p>
+      <w:pPr>
+        <w:pStyle w:val="ListParagraph"/>
+        <w:numPr>
+          <w:ilvl w:val="0"/>
+          <w:numId w:val="12"/>
+        </w:numPr>
+      </w:pPr>
+      <w:r>
+        <w:t xml:space="preserve">Giving discounts to user who make 5 more or purchases would cost the company </w:t>
       </w:r>
       <w:r>
-        <w:rPr>
-          <w:rFonts w:ascii="Calibri" w:hAnsi="Calibri" w:cs="Calibri"/>
-        </w:rPr>
+        <w:t>about $</w:t>
+      </w:r>
+      <w:r>
+        <w:t>250 total</w:t>
+      </w:r>
+      <w:r>
         <w:t>.</w:t>
       </w:r>
     </w:p>
@@ -214,100 +320,6 @@
         <w:rPr>
           <w:rFonts w:ascii="Calibri" w:hAnsi="Calibri" w:cs="Calibri"/>
         </w:rPr>
-        <w:t>Methodology</w:t>
-      </w:r>
-    </w:p>
-    <w:p>
-      <w:pPr>
-        <w:rPr>
-          <w:rFonts w:ascii="Calibri" w:hAnsi="Calibri" w:cs="Calibri"/>
-        </w:rPr>
-      </w:pPr>
-      <w:r>
-        <w:rPr>
-          <w:rFonts w:ascii="Calibri" w:hAnsi="Calibri" w:cs="Calibri"/>
-        </w:rPr>
-        <w:t xml:space="preserve">In this project I analyzed the delivery data from a fake food delivery app called </w:t>
-      </w:r>
-      <w:proofErr w:type="spellStart"/>
-      <w:r>
-        <w:rPr>
-          <w:rFonts w:ascii="Calibri" w:hAnsi="Calibri" w:cs="Calibri"/>
-        </w:rPr>
-        <w:t>FoodHub</w:t>
-      </w:r>
-      <w:proofErr w:type="spellEnd"/>
-      <w:r>
-        <w:rPr>
-          <w:rFonts w:ascii="Calibri" w:hAnsi="Calibri" w:cs="Calibri"/>
-        </w:rPr>
-        <w:t xml:space="preserve"> and calculated cuisine performance by a restaurant type and rating.</w:t>
-      </w:r>
-    </w:p>
-    <w:p>
-      <w:pPr>
-        <w:rPr>
-          <w:rFonts w:ascii="Calibri" w:hAnsi="Calibri" w:cs="Calibri"/>
-        </w:rPr>
-      </w:pPr>
-      <w:r>
-        <w:rPr>
-          <w:rFonts w:ascii="Calibri" w:hAnsi="Calibri" w:cs="Calibri"/>
-        </w:rPr>
-        <w:t>This project was originally part of a UT school project, but the Discount Coast vs. Total Reach section was added more recently.</w:t>
-      </w:r>
-    </w:p>
-    <w:p>
-      <w:pPr>
-        <w:pStyle w:val="Heading3"/>
-        <w:rPr>
-          <w:rFonts w:ascii="Calibri" w:hAnsi="Calibri" w:cs="Calibri"/>
-        </w:rPr>
-      </w:pPr>
-      <w:r>
-        <w:rPr>
-          <w:rFonts w:ascii="Calibri" w:hAnsi="Calibri" w:cs="Calibri"/>
-        </w:rPr>
-        <w:t>Data Cleaning</w:t>
-      </w:r>
-    </w:p>
-    <w:p>
-      <w:pPr>
-        <w:rPr>
-          <w:rFonts w:ascii="Calibri" w:hAnsi="Calibri" w:cs="Calibri"/>
-        </w:rPr>
-      </w:pPr>
-      <w:r>
-        <w:rPr>
-          <w:rFonts w:ascii="Calibri" w:hAnsi="Calibri" w:cs="Calibri"/>
-        </w:rPr>
-        <w:t>The input data for this project had over 700 entries without ratings. For this dataset I have populated those table rows with the mean rating for the whole dataset, which is 4.</w:t>
-      </w:r>
-    </w:p>
-    <w:p>
-      <w:pPr>
-        <w:rPr>
-          <w:rFonts w:ascii="Calibri" w:hAnsi="Calibri" w:cs="Calibri"/>
-        </w:rPr>
-      </w:pPr>
-      <w:r>
-        <w:rPr>
-          <w:rFonts w:ascii="Calibri" w:hAnsi="Calibri" w:cs="Calibri"/>
-        </w:rPr>
-        <w:t>I also maintained a separate data set with only the entries in the original dataset with rating so that I can check my findings with that dataset if needed.</w:t>
-      </w:r>
-    </w:p>
-    <w:p>
-      <w:pPr>
-        <w:pStyle w:val="Heading3"/>
-        <w:rPr>
-          <w:rFonts w:ascii="Calibri" w:hAnsi="Calibri" w:cs="Calibri"/>
-        </w:rPr>
-      </w:pPr>
-      <w:r>
-        <w:rPr>
-          <w:rFonts w:ascii="Calibri" w:hAnsi="Calibri" w:cs="Calibri"/>
-        </w:rPr>
         <w:t>Recommendations</w:t>
       </w:r>
     </w:p>
@@ -321,7 +333,7 @@
         <w:rPr>
           <w:rFonts w:ascii="Calibri" w:hAnsi="Calibri" w:cs="Calibri"/>
         </w:rPr>
-        <w:t xml:space="preserve">Create a discount for customers who make more than 5 orders on the app. </w:t>
+        <w:t xml:space="preserve">Offer a discount to all user making 5 or more orders, use the marketing of the discount to incentivize loyalty among users. </w:t>
       </w:r>
     </w:p>
     <w:sectPr>
@@ -1387,6 +1399,184 @@
     </w:lvl>
   </w:abstractNum>
   <w:abstractNum w:abstractNumId="8" w15:restartNumberingAfterBreak="0">
+    <w:nsid w:val="60973941"/>
+    <w:multiLevelType w:val="hybridMultilevel"/>
+    <w:tmpl w:val="E0DA9F66"/>
+    <w:lvl w:ilvl="0" w:tplc="04090011">
+      <w:start w:val="1"/>
+      <w:numFmt w:val="decimal"/>
+      <w:lvlText w:val="%1)"/>
+      <w:lvlJc w:val="left"/>
+      <w:pPr>
+        <w:ind w:left="720" w:hanging="360"/>
+      </w:pPr>
+      <w:rPr>
+        <w:rFonts w:hint="default"/>
+      </w:rPr>
+    </w:lvl>
+    <w:lvl w:ilvl="1" w:tplc="04090019" w:tentative="1">
+      <w:start w:val="1"/>
+      <w:numFmt w:val="lowerLetter"/>
+      <w:lvlText w:val="%2."/>
+      <w:lvlJc w:val="left"/>
+      <w:pPr>
+        <w:ind w:left="1440" w:hanging="360"/>
+      </w:pPr>
+    </w:lvl>
+    <w:lvl w:ilvl="2" w:tplc="0409001B" w:tentative="1">
+      <w:start w:val="1"/>
+      <w:numFmt w:val="lowerRoman"/>
+      <w:lvlText w:val="%3."/>
+      <w:lvlJc w:val="right"/>
+      <w:pPr>
+        <w:ind w:left="2160" w:hanging="180"/>
+      </w:pPr>
+    </w:lvl>
+    <w:lvl w:ilvl="3" w:tplc="0409000F" w:tentative="1">
+      <w:start w:val="1"/>
+      <w:numFmt w:val="decimal"/>
+      <w:lvlText w:val="%4."/>
+      <w:lvlJc w:val="left"/>
+      <w:pPr>
+        <w:ind w:left="2880" w:hanging="360"/>
+      </w:pPr>
+    </w:lvl>
+    <w:lvl w:ilvl="4" w:tplc="04090019" w:tentative="1">
+      <w:start w:val="1"/>
+      <w:numFmt w:val="lowerLetter"/>
+      <w:lvlText w:val="%5."/>
+      <w:lvlJc w:val="left"/>
+      <w:pPr>
+        <w:ind w:left="3600" w:hanging="360"/>
+      </w:pPr>
+    </w:lvl>
+    <w:lvl w:ilvl="5" w:tplc="0409001B" w:tentative="1">
+      <w:start w:val="1"/>
+      <w:numFmt w:val="lowerRoman"/>
+      <w:lvlText w:val="%6."/>
+      <w:lvlJc w:val="right"/>
+      <w:pPr>
+        <w:ind w:left="4320" w:hanging="180"/>
+      </w:pPr>
+    </w:lvl>
+    <w:lvl w:ilvl="6" w:tplc="0409000F" w:tentative="1">
+      <w:start w:val="1"/>
+      <w:numFmt w:val="decimal"/>
+      <w:lvlText w:val="%7."/>
+      <w:lvlJc w:val="left"/>
+      <w:pPr>
+        <w:ind w:left="5040" w:hanging="360"/>
+      </w:pPr>
+    </w:lvl>
+    <w:lvl w:ilvl="7" w:tplc="04090019" w:tentative="1">
+      <w:start w:val="1"/>
+      <w:numFmt w:val="lowerLetter"/>
+      <w:lvlText w:val="%8."/>
+      <w:lvlJc w:val="left"/>
+      <w:pPr>
+        <w:ind w:left="5760" w:hanging="360"/>
+      </w:pPr>
+    </w:lvl>
+    <w:lvl w:ilvl="8" w:tplc="0409001B" w:tentative="1">
+      <w:start w:val="1"/>
+      <w:numFmt w:val="lowerRoman"/>
+      <w:lvlText w:val="%9."/>
+      <w:lvlJc w:val="right"/>
+      <w:pPr>
+        <w:ind w:left="6480" w:hanging="180"/>
+      </w:pPr>
+    </w:lvl>
+  </w:abstractNum>
+  <w:abstractNum w:abstractNumId="9" w15:restartNumberingAfterBreak="0">
+    <w:nsid w:val="6A3540C7"/>
+    <w:multiLevelType w:val="hybridMultilevel"/>
+    <w:tmpl w:val="D7F0CA0A"/>
+    <w:lvl w:ilvl="0" w:tplc="04090011">
+      <w:start w:val="1"/>
+      <w:numFmt w:val="decimal"/>
+      <w:lvlText w:val="%1)"/>
+      <w:lvlJc w:val="left"/>
+      <w:pPr>
+        <w:ind w:left="720" w:hanging="360"/>
+      </w:pPr>
+      <w:rPr>
+        <w:rFonts w:hint="default"/>
+      </w:rPr>
+    </w:lvl>
+    <w:lvl w:ilvl="1" w:tplc="04090019" w:tentative="1">
+      <w:start w:val="1"/>
+      <w:numFmt w:val="lowerLetter"/>
+      <w:lvlText w:val="%2."/>
+      <w:lvlJc w:val="left"/>
+      <w:pPr>
+        <w:ind w:left="1440" w:hanging="360"/>
+      </w:pPr>
+    </w:lvl>
+    <w:lvl w:ilvl="2" w:tplc="0409001B" w:tentative="1">
+      <w:start w:val="1"/>
+      <w:numFmt w:val="lowerRoman"/>
+      <w:lvlText w:val="%3."/>
+      <w:lvlJc w:val="right"/>
+      <w:pPr>
+        <w:ind w:left="2160" w:hanging="180"/>
+      </w:pPr>
+    </w:lvl>
+    <w:lvl w:ilvl="3" w:tplc="0409000F" w:tentative="1">
+      <w:start w:val="1"/>
+      <w:numFmt w:val="decimal"/>
+      <w:lvlText w:val="%4."/>
+      <w:lvlJc w:val="left"/>
+      <w:pPr>
+        <w:ind w:left="2880" w:hanging="360"/>
+      </w:pPr>
+    </w:lvl>
+    <w:lvl w:ilvl="4" w:tplc="04090019" w:tentative="1">
+      <w:start w:val="1"/>
+      <w:numFmt w:val="lowerLetter"/>
+      <w:lvlText w:val="%5."/>
+      <w:lvlJc w:val="left"/>
+      <w:pPr>
+        <w:ind w:left="3600" w:hanging="360"/>
+      </w:pPr>
+    </w:lvl>
+    <w:lvl w:ilvl="5" w:tplc="0409001B" w:tentative="1">
+      <w:start w:val="1"/>
+      <w:numFmt w:val="lowerRoman"/>
+      <w:lvlText w:val="%6."/>
+      <w:lvlJc w:val="right"/>
+      <w:pPr>
+        <w:ind w:left="4320" w:hanging="180"/>
+      </w:pPr>
+    </w:lvl>
+    <w:lvl w:ilvl="6" w:tplc="0409000F" w:tentative="1">
+      <w:start w:val="1"/>
+      <w:numFmt w:val="decimal"/>
+      <w:lvlText w:val="%7."/>
+      <w:lvlJc w:val="left"/>
+      <w:pPr>
+        <w:ind w:left="5040" w:hanging="360"/>
+      </w:pPr>
+    </w:lvl>
+    <w:lvl w:ilvl="7" w:tplc="04090019" w:tentative="1">
+      <w:start w:val="1"/>
+      <w:numFmt w:val="lowerLetter"/>
+      <w:lvlText w:val="%8."/>
+      <w:lvlJc w:val="left"/>
+      <w:pPr>
+        <w:ind w:left="5760" w:hanging="360"/>
+      </w:pPr>
+    </w:lvl>
+    <w:lvl w:ilvl="8" w:tplc="0409001B" w:tentative="1">
+      <w:start w:val="1"/>
+      <w:numFmt w:val="lowerRoman"/>
+      <w:lvlText w:val="%9."/>
+      <w:lvlJc w:val="right"/>
+      <w:pPr>
+        <w:ind w:left="6480" w:hanging="180"/>
+      </w:pPr>
+    </w:lvl>
+  </w:abstractNum>
+  <w:abstractNum w:abstractNumId="10" w15:restartNumberingAfterBreak="0">
     <w:nsid w:val="6E021EB9"/>
     <w:multiLevelType w:val="multilevel"/>
     <w:tmpl w:val="89540472"/>
@@ -1535,7 +1725,7 @@
       </w:rPr>
     </w:lvl>
   </w:abstractNum>
-  <w:abstractNum w:abstractNumId="9" w15:restartNumberingAfterBreak="0">
+  <w:abstractNum w:abstractNumId="11" w15:restartNumberingAfterBreak="0">
     <w:nsid w:val="7F5524F0"/>
     <w:multiLevelType w:val="hybridMultilevel"/>
     <w:tmpl w:val="6B68DFB0"/>
@@ -1664,19 +1854,25 @@
     <w:abstractNumId w:val="1"/>
   </w:num>
   <w:num w:numId="6" w16cid:durableId="1753355405">
-    <w:abstractNumId w:val="8"/>
+    <w:abstractNumId w:val="10"/>
   </w:num>
   <w:num w:numId="7" w16cid:durableId="1140419033">
     <w:abstractNumId w:val="3"/>
   </w:num>
   <w:num w:numId="8" w16cid:durableId="1878155063">
-    <w:abstractNumId w:val="9"/>
+    <w:abstractNumId w:val="11"/>
   </w:num>
   <w:num w:numId="9" w16cid:durableId="1459255224">
     <w:abstractNumId w:val="4"/>
   </w:num>
   <w:num w:numId="10" w16cid:durableId="1551267204">
     <w:abstractNumId w:val="2"/>
+  </w:num>
+  <w:num w:numId="11" w16cid:durableId="2059545094">
+    <w:abstractNumId w:val="8"/>
+  </w:num>
+  <w:num w:numId="12" w16cid:durableId="348917910">
+    <w:abstractNumId w:val="9"/>
   </w:num>
 </w:numbering>
 </file>

</xml_diff>

<commit_message>
Updated variable name on the population_reached, chart to make output cleaner.
</commit_message>
<xml_diff>
--- a/FoodHub_Data_Analysis_Summary.docx
+++ b/FoodHub_Data_Analysis_Summary.docx
@@ -195,10 +195,10 @@
           <w:noProof/>
         </w:rPr>
         <w:drawing>
-          <wp:inline distT="0" distB="0" distL="0" distR="0" wp14:anchorId="3808F3EA" wp14:editId="167C137A">
-            <wp:extent cx="5644282" cy="1881427"/>
+          <wp:inline distT="0" distB="0" distL="0" distR="0" wp14:anchorId="51AD1C23" wp14:editId="194A05EA">
+            <wp:extent cx="5943600" cy="1981200"/>
             <wp:effectExtent l="0" t="0" r="0" b="0"/>
-            <wp:docPr id="1445340133" name="Picture 2" descr="Figure shows discount cost vs total reach along with discount value per customer."/>
+            <wp:docPr id="1004956447" name="Picture 1" descr="A graph of different colored bars&#10;&#10;AI-generated content may be incorrect."/>
             <wp:cNvGraphicFramePr>
               <a:graphicFrameLocks xmlns:a="http://schemas.openxmlformats.org/drawingml/2006/main" noChangeAspect="1"/>
             </wp:cNvGraphicFramePr>
@@ -206,7 +206,7 @@
               <a:graphicData uri="http://schemas.openxmlformats.org/drawingml/2006/picture">
                 <pic:pic xmlns:pic="http://schemas.openxmlformats.org/drawingml/2006/picture">
                   <pic:nvPicPr>
-                    <pic:cNvPr id="1445340133" name="Picture 2" descr="Figure shows discount cost vs total reach along with discount value per customer."/>
+                    <pic:cNvPr id="1004956447" name="Picture 1" descr="A graph of different colored bars&#10;&#10;AI-generated content may be incorrect."/>
                     <pic:cNvPicPr/>
                   </pic:nvPicPr>
                   <pic:blipFill>
@@ -224,7 +224,7 @@
                   <pic:spPr>
                     <a:xfrm>
                       <a:off x="0" y="0"/>
-                      <a:ext cx="5795818" cy="1931939"/>
+                      <a:ext cx="5943600" cy="1981200"/>
                     </a:xfrm>
                     <a:prstGeom prst="rect">
                       <a:avLst/>

</xml_diff>